<commit_message>
Pagina Documentazione: Registro (solo Admin) e Manuale Utente in Word/PDF
Registro sviluppo e deploy impaginato come il manuale (copertina,
revisioni, sommario); generatore unico strumenti/genera_documenti.cjs con
revisioni in strumenti/revisioni_documenti.json; voce di menu
Documentazione (Admin) e Manuale (Operatore, Cliente); Manuale Utente
Rev. 1.1; registro aggiornato (backlog riscritto, punto 28 riservatezza).

Co-Authored-By: Claude Opus 5.5 <noreply@anthropic.com>
Claude-Session: https://claude.ai/code/session_01E8XCbEeVHWVP3hntUZ6kZ1
</commit_message>
<xml_diff>
--- a/public/manuali/Manuale_Utente_Portale_CWP.docx
+++ b/public/manuali/Manuale_Utente_Portale_CWP.docx
@@ -170,6 +170,8 @@
             <w:r>
               <w:rPr>
                 <w:rFonts w:ascii="Arial" w:cs="Arial" w:eastAsia="Arial" w:hAnsi="Arial"/>
+                <w:b w:val="false"/>
+                <w:bCs w:val="false"/>
                 <w:color w:val="1B2118"/>
                 <w:sz w:val="20"/>
                 <w:szCs w:val="20"/>
@@ -231,6 +233,8 @@
             <w:r>
               <w:rPr>
                 <w:rFonts w:ascii="Arial" w:cs="Arial" w:eastAsia="Arial" w:hAnsi="Arial"/>
+                <w:b w:val="false"/>
+                <w:bCs w:val="false"/>
                 <w:color w:val="1B2118"/>
                 <w:sz w:val="20"/>
                 <w:szCs w:val="20"/>
@@ -292,11 +296,13 @@
             <w:r>
               <w:rPr>
                 <w:rFonts w:ascii="Arial" w:cs="Arial" w:eastAsia="Arial" w:hAnsi="Arial"/>
+                <w:b w:val="false"/>
+                <w:bCs w:val="false"/>
                 <w:color w:val="1B2118"/>
                 <w:sz w:val="20"/>
                 <w:szCs w:val="20"/>
               </w:rPr>
-              <w:t xml:space="preserve">Rev. 1.0</w:t>
+              <w:t xml:space="preserve">Rev. 1.1</w:t>
             </w:r>
           </w:p>
         </w:tc>
@@ -353,6 +359,8 @@
             <w:r>
               <w:rPr>
                 <w:rFonts w:ascii="Arial" w:cs="Arial" w:eastAsia="Arial" w:hAnsi="Arial"/>
+                <w:b w:val="false"/>
+                <w:bCs w:val="false"/>
                 <w:color w:val="1B2118"/>
                 <w:sz w:val="20"/>
                 <w:szCs w:val="20"/>
@@ -414,6 +422,8 @@
             <w:r>
               <w:rPr>
                 <w:rFonts w:ascii="Arial" w:cs="Arial" w:eastAsia="Arial" w:hAnsi="Arial"/>
+                <w:b w:val="false"/>
+                <w:bCs w:val="false"/>
                 <w:color w:val="1B2118"/>
                 <w:sz w:val="20"/>
                 <w:szCs w:val="20"/>
@@ -490,7 +500,6 @@
           <w:pgSz w:w="11906" w:h="16838" w:orient="portrait"/>
           <w:pgMar w:top="1134" w:right="1134" w:bottom="1134" w:left="1134" w:header="567" w:footer="567" w:gutter="0"/>
           <w:pgNumType/>
-          <w:titlePg w:val="false"/>
           <w:docGrid w:linePitch="360"/>
         </w:sectPr>
       </w:pPr>
@@ -565,8 +574,8 @@
                 <w:b/>
                 <w:bCs/>
                 <w:color w:val="FFFFFF"/>
-                <w:sz w:val="19"/>
-                <w:szCs w:val="19"/>
+                <w:sz w:val="18"/>
+                <w:szCs w:val="18"/>
               </w:rPr>
               <w:t xml:space="preserve">Rev.</w:t>
             </w:r>
@@ -600,8 +609,8 @@
                 <w:b/>
                 <w:bCs/>
                 <w:color w:val="FFFFFF"/>
-                <w:sz w:val="19"/>
-                <w:szCs w:val="19"/>
+                <w:sz w:val="18"/>
+                <w:szCs w:val="18"/>
               </w:rPr>
               <w:t xml:space="preserve">Data</w:t>
             </w:r>
@@ -635,8 +644,8 @@
                 <w:b/>
                 <w:bCs/>
                 <w:color w:val="FFFFFF"/>
-                <w:sz w:val="19"/>
-                <w:szCs w:val="19"/>
+                <w:sz w:val="18"/>
+                <w:szCs w:val="18"/>
               </w:rPr>
               <w:t xml:space="preserve">Descrizione</w:t>
             </w:r>
@@ -670,8 +679,8 @@
                 <w:b/>
                 <w:bCs/>
                 <w:color w:val="FFFFFF"/>
-                <w:sz w:val="19"/>
-                <w:szCs w:val="19"/>
+                <w:sz w:val="18"/>
+                <w:szCs w:val="18"/>
               </w:rPr>
               <w:t xml:space="preserve">Autore</w:t>
             </w:r>
@@ -707,8 +716,142 @@
               <w:rPr>
                 <w:rFonts w:ascii="Arial" w:cs="Arial" w:eastAsia="Arial" w:hAnsi="Arial"/>
                 <w:color w:val="1B2118"/>
-                <w:sz w:val="19"/>
-                <w:szCs w:val="19"/>
+                <w:sz w:val="18"/>
+                <w:szCs w:val="18"/>
+              </w:rPr>
+              <w:t xml:space="preserve">1.1</w:t>
+            </w:r>
+          </w:p>
+        </w:tc>
+        <w:tc>
+          <w:tcPr>
+            <w:tcW w:type="dxa" w:w="1300"/>
+            <w:tcBorders>
+              <w:top w:val="single" w:color="D9D4C5" w:sz="4"/>
+              <w:left w:val="single" w:color="D9D4C5" w:sz="4"/>
+              <w:bottom w:val="single" w:color="D9D4C5" w:sz="4"/>
+              <w:right w:val="single" w:color="D9D4C5" w:sz="4"/>
+            </w:tcBorders>
+            <w:tcMar>
+              <w:top w:type="dxa" w:w="70"/>
+              <w:left w:type="dxa" w:w="110"/>
+              <w:bottom w:type="dxa" w:w="70"/>
+              <w:right w:type="dxa" w:w="110"/>
+            </w:tcMar>
+            <w:vAlign w:val="center"/>
+          </w:tcPr>
+          <w:p>
+            <w:pPr>
+              <w:spacing w:after="0" w:before="0"/>
+            </w:pPr>
+            <w:r>
+              <w:rPr>
+                <w:rFonts w:ascii="Arial" w:cs="Arial" w:eastAsia="Arial" w:hAnsi="Arial"/>
+                <w:color w:val="1B2118"/>
+                <w:sz w:val="18"/>
+                <w:szCs w:val="18"/>
+              </w:rPr>
+              <w:t xml:space="preserve">18/10/2026</w:t>
+            </w:r>
+          </w:p>
+        </w:tc>
+        <w:tc>
+          <w:tcPr>
+            <w:tcW w:type="dxa" w:w="5538"/>
+            <w:tcBorders>
+              <w:top w:val="single" w:color="D9D4C5" w:sz="4"/>
+              <w:left w:val="single" w:color="D9D4C5" w:sz="4"/>
+              <w:bottom w:val="single" w:color="D9D4C5" w:sz="4"/>
+              <w:right w:val="single" w:color="D9D4C5" w:sz="4"/>
+            </w:tcBorders>
+            <w:tcMar>
+              <w:top w:type="dxa" w:w="70"/>
+              <w:left w:type="dxa" w:w="110"/>
+              <w:bottom w:type="dxa" w:w="70"/>
+              <w:right w:type="dxa" w:w="110"/>
+            </w:tcMar>
+            <w:vAlign w:val="center"/>
+          </w:tcPr>
+          <w:p>
+            <w:pPr>
+              <w:spacing w:after="0" w:before="0"/>
+            </w:pPr>
+            <w:r>
+              <w:rPr>
+                <w:rFonts w:ascii="Arial" w:cs="Arial" w:eastAsia="Arial" w:hAnsi="Arial"/>
+                <w:color w:val="1B2118"/>
+                <w:sz w:val="18"/>
+                <w:szCs w:val="18"/>
+              </w:rPr>
+              <w:t xml:space="preserve">Voce di menu «Manuale» e pagina di download del manuale (capitolo 2).</w:t>
+            </w:r>
+          </w:p>
+        </w:tc>
+        <w:tc>
+          <w:tcPr>
+            <w:tcW w:type="dxa" w:w="2000"/>
+            <w:tcBorders>
+              <w:top w:val="single" w:color="D9D4C5" w:sz="4"/>
+              <w:left w:val="single" w:color="D9D4C5" w:sz="4"/>
+              <w:bottom w:val="single" w:color="D9D4C5" w:sz="4"/>
+              <w:right w:val="single" w:color="D9D4C5" w:sz="4"/>
+            </w:tcBorders>
+            <w:tcMar>
+              <w:top w:type="dxa" w:w="70"/>
+              <w:left w:type="dxa" w:w="110"/>
+              <w:bottom w:type="dxa" w:w="70"/>
+              <w:right w:type="dxa" w:w="110"/>
+            </w:tcMar>
+            <w:vAlign w:val="center"/>
+          </w:tcPr>
+          <w:p>
+            <w:pPr>
+              <w:spacing w:after="0" w:before="0"/>
+            </w:pPr>
+            <w:r>
+              <w:rPr>
+                <w:rFonts w:ascii="Arial" w:cs="Arial" w:eastAsia="Arial" w:hAnsi="Arial"/>
+                <w:color w:val="1B2118"/>
+                <w:sz w:val="18"/>
+                <w:szCs w:val="18"/>
+              </w:rPr>
+              <w:t xml:space="preserve">Fondazione Operate</w:t>
+            </w:r>
+          </w:p>
+        </w:tc>
+      </w:tr>
+      <w:tr>
+        <w:trPr>
+          <w:cantSplit/>
+        </w:trPr>
+        <w:tc>
+          <w:tcPr>
+            <w:tcW w:type="dxa" w:w="800"/>
+            <w:tcBorders>
+              <w:top w:val="single" w:color="D9D4C5" w:sz="4"/>
+              <w:left w:val="single" w:color="D9D4C5" w:sz="4"/>
+              <w:bottom w:val="single" w:color="D9D4C5" w:sz="4"/>
+              <w:right w:val="single" w:color="D9D4C5" w:sz="4"/>
+            </w:tcBorders>
+            <w:shd w:fill="F6F4EE" w:color="auto" w:val="clear"/>
+            <w:tcMar>
+              <w:top w:type="dxa" w:w="70"/>
+              <w:left w:type="dxa" w:w="110"/>
+              <w:bottom w:type="dxa" w:w="70"/>
+              <w:right w:type="dxa" w:w="110"/>
+            </w:tcMar>
+            <w:vAlign w:val="center"/>
+          </w:tcPr>
+          <w:p>
+            <w:pPr>
+              <w:spacing w:after="0" w:before="0"/>
+            </w:pPr>
+            <w:r>
+              <w:rPr>
+                <w:rFonts w:ascii="Arial" w:cs="Arial" w:eastAsia="Arial" w:hAnsi="Arial"/>
+                <w:color w:val="1B2118"/>
+                <w:sz w:val="18"/>
+                <w:szCs w:val="18"/>
               </w:rPr>
               <w:t xml:space="preserve">1.0</w:t>
             </w:r>
@@ -723,6 +866,7 @@
               <w:bottom w:val="single" w:color="D9D4C5" w:sz="4"/>
               <w:right w:val="single" w:color="D9D4C5" w:sz="4"/>
             </w:tcBorders>
+            <w:shd w:fill="F6F4EE" w:color="auto" w:val="clear"/>
             <w:tcMar>
               <w:top w:type="dxa" w:w="70"/>
               <w:left w:type="dxa" w:w="110"/>
@@ -739,8 +883,8 @@
               <w:rPr>
                 <w:rFonts w:ascii="Arial" w:cs="Arial" w:eastAsia="Arial" w:hAnsi="Arial"/>
                 <w:color w:val="1B2118"/>
-                <w:sz w:val="19"/>
-                <w:szCs w:val="19"/>
+                <w:sz w:val="18"/>
+                <w:szCs w:val="18"/>
               </w:rPr>
               <w:t xml:space="preserve">18/10/2026</w:t>
             </w:r>
@@ -755,6 +899,7 @@
               <w:bottom w:val="single" w:color="D9D4C5" w:sz="4"/>
               <w:right w:val="single" w:color="D9D4C5" w:sz="4"/>
             </w:tcBorders>
+            <w:shd w:fill="F6F4EE" w:color="auto" w:val="clear"/>
             <w:tcMar>
               <w:top w:type="dxa" w:w="70"/>
               <w:left w:type="dxa" w:w="110"/>
@@ -771,8 +916,8 @@
               <w:rPr>
                 <w:rFonts w:ascii="Arial" w:cs="Arial" w:eastAsia="Arial" w:hAnsi="Arial"/>
                 <w:color w:val="1B2118"/>
-                <w:sz w:val="19"/>
-                <w:szCs w:val="19"/>
+                <w:sz w:val="18"/>
+                <w:szCs w:val="18"/>
               </w:rPr>
               <w:t xml:space="preserve">Prima emissione: accesso, pratiche e fasi, documenti, integrazioni, consultazione pubblica, rapporti di monitoraggio, notifiche, tracciato dati per il calcolo dei crediti.</w:t>
             </w:r>
@@ -787,6 +932,7 @@
               <w:bottom w:val="single" w:color="D9D4C5" w:sz="4"/>
               <w:right w:val="single" w:color="D9D4C5" w:sz="4"/>
             </w:tcBorders>
+            <w:shd w:fill="F6F4EE" w:color="auto" w:val="clear"/>
             <w:tcMar>
               <w:top w:type="dxa" w:w="70"/>
               <w:left w:type="dxa" w:w="110"/>
@@ -803,8 +949,8 @@
               <w:rPr>
                 <w:rFonts w:ascii="Arial" w:cs="Arial" w:eastAsia="Arial" w:hAnsi="Arial"/>
                 <w:color w:val="1B2118"/>
-                <w:sz w:val="19"/>
-                <w:szCs w:val="19"/>
+                <w:sz w:val="18"/>
+                <w:szCs w:val="18"/>
               </w:rPr>
               <w:t xml:space="preserve">Fondazione Operate</w:t>
             </w:r>
@@ -814,12 +960,12 @@
     </w:tbl>
     <w:p>
       <w:pPr>
-        <w:spacing w:after="240"/>
-      </w:pPr>
-    </w:p>
-    <w:p>
-      <w:pPr>
-        <w:spacing w:after="100"/>
+        <w:spacing w:after="200"/>
+      </w:pPr>
+    </w:p>
+    <w:p>
+      <w:pPr>
+        <w:spacing w:after="160"/>
       </w:pPr>
       <w:r>
         <w:rPr>
@@ -828,7 +974,7 @@
           <w:sz w:val="20"/>
           <w:szCs w:val="20"/>
         </w:rPr>
-        <w:t xml:space="preserve">Questo documento descrive il portale alla revisione 1.0 del 18/10/2026. La versione sempre aggiornata del manuale è disponibile online; a ogni modifica del portale il manuale viene aggiornato e la revisione incrementata.</w:t>
+        <w:t xml:space="preserve">Questo documento descrive il portale alla revisione 1.1 del 18/10/2026. A ogni modifica del portale il manuale viene aggiornato e la revisione incrementata; la versione corrente si scarica dal portale.</w:t>
       </w:r>
     </w:p>
     <w:p>
@@ -1404,7 +1550,7 @@
         </w:rPr>
         <w:t xml:space="preserve"> un computer o tablet con un browser aggiornato (Chrome, Edge, Firefox, Safari) e le credenziali fornite dalla Fondazione. Indirizzo del portale: </w:t>
       </w:r>
-      <w:hyperlink w:history="1" r:id="rIda5g5lnnfcpx5gzkvlrr4b">
+      <w:hyperlink w:history="1" r:id="rIdczh6in1he1xfupovzdulo">
         <w:r>
           <w:rPr>
             <w:rFonts w:ascii="Arial" w:cs="Arial" w:eastAsia="Arial" w:hAnsi="Arial"/>
@@ -1526,7 +1672,7 @@
         </w:rPr>
         <w:t xml:space="preserve">Aprite </w:t>
       </w:r>
-      <w:hyperlink w:history="1" r:id="rIdeef8djb0i5qq1l4x2eylx">
+      <w:hyperlink w:history="1" r:id="rId9d2ha2myebmcdtk7m2thb">
         <w:r>
           <w:rPr>
             <w:rFonts w:ascii="Arial" w:cs="Arial" w:eastAsia="Arial" w:hAnsi="Arial"/>
@@ -1753,6 +1899,26 @@
           <w:szCs w:val="21"/>
         </w:rPr>
         <w:t xml:space="preserve">Formato dati</w:t>
+      </w:r>
+      <w:r>
+        <w:rPr>
+          <w:rFonts w:ascii="Arial" w:cs="Arial" w:eastAsia="Arial" w:hAnsi="Arial"/>
+          <w:color w:val="1B2118"/>
+          <w:sz w:val="21"/>
+          <w:szCs w:val="21"/>
+        </w:rPr>
+        <w:t xml:space="preserve">, </w:t>
+      </w:r>
+      <w:r>
+        <w:rPr>
+          <w:rFonts w:ascii="Arial" w:cs="Arial" w:eastAsia="Arial" w:hAnsi="Arial"/>
+          <w:b/>
+          <w:bCs/>
+          <w:color w:val="1B2118"/>
+          <w:sz w:val="21"/>
+          <w:szCs w:val="21"/>
+        </w:rPr>
+        <w:t xml:space="preserve">Manuale</w:t>
       </w:r>
       <w:r>
         <w:rPr>
@@ -1818,9 +1984,9 @@
         <w:tblLayout w:type="fixed"/>
       </w:tblPr>
       <w:tblGrid>
-        <w:gridCol w:w="2981"/>
-        <w:gridCol w:w="2087"/>
-        <w:gridCol w:w="4570"/>
+        <w:gridCol w:w="3134"/>
+        <w:gridCol w:w="2142"/>
+        <w:gridCol w:w="4362"/>
       </w:tblGrid>
       <w:tr>
         <w:trPr>
@@ -1828,7 +1994,7 @@
         </w:trPr>
         <w:tc>
           <w:tcPr>
-            <w:tcW w:type="dxa" w:w="2981"/>
+            <w:tcW w:type="dxa" w:w="3134"/>
             <w:tcBorders>
               <w:top w:val="single" w:color="D9D4C5" w:sz="4"/>
               <w:left w:val="single" w:color="D9D4C5" w:sz="4"/>
@@ -1854,8 +2020,8 @@
                 <w:b/>
                 <w:bCs/>
                 <w:color w:val="FFFFFF"/>
-                <w:sz w:val="19"/>
-                <w:szCs w:val="19"/>
+                <w:sz w:val="18"/>
+                <w:szCs w:val="18"/>
               </w:rPr>
               <w:t xml:space="preserve">Messaggio</w:t>
             </w:r>
@@ -1863,7 +2029,7 @@
         </w:tc>
         <w:tc>
           <w:tcPr>
-            <w:tcW w:type="dxa" w:w="2087"/>
+            <w:tcW w:type="dxa" w:w="2142"/>
             <w:tcBorders>
               <w:top w:val="single" w:color="D9D4C5" w:sz="4"/>
               <w:left w:val="single" w:color="D9D4C5" w:sz="4"/>
@@ -1889,8 +2055,8 @@
                 <w:b/>
                 <w:bCs/>
                 <w:color w:val="FFFFFF"/>
-                <w:sz w:val="19"/>
-                <w:szCs w:val="19"/>
+                <w:sz w:val="18"/>
+                <w:szCs w:val="18"/>
               </w:rPr>
               <w:t xml:space="preserve">Cosa significa</w:t>
             </w:r>
@@ -1898,7 +2064,7 @@
         </w:tc>
         <w:tc>
           <w:tcPr>
-            <w:tcW w:type="dxa" w:w="4570"/>
+            <w:tcW w:type="dxa" w:w="4362"/>
             <w:tcBorders>
               <w:top w:val="single" w:color="D9D4C5" w:sz="4"/>
               <w:left w:val="single" w:color="D9D4C5" w:sz="4"/>
@@ -1924,8 +2090,8 @@
                 <w:b/>
                 <w:bCs/>
                 <w:color w:val="FFFFFF"/>
-                <w:sz w:val="19"/>
-                <w:szCs w:val="19"/>
+                <w:sz w:val="18"/>
+                <w:szCs w:val="18"/>
               </w:rPr>
               <w:t xml:space="preserve">Cosa fare</w:t>
             </w:r>
@@ -1938,7 +2104,7 @@
         </w:trPr>
         <w:tc>
           <w:tcPr>
-            <w:tcW w:type="dxa" w:w="2981"/>
+            <w:tcW w:type="dxa" w:w="3134"/>
             <w:tcBorders>
               <w:top w:val="single" w:color="D9D4C5" w:sz="4"/>
               <w:left w:val="single" w:color="D9D4C5" w:sz="4"/>
@@ -1961,8 +2127,8 @@
               <w:rPr>
                 <w:rFonts w:ascii="Arial" w:cs="Arial" w:eastAsia="Arial" w:hAnsi="Arial"/>
                 <w:color w:val="1B2118"/>
-                <w:sz w:val="19"/>
-                <w:szCs w:val="19"/>
+                <w:sz w:val="18"/>
+                <w:szCs w:val="18"/>
               </w:rPr>
               <w:t xml:space="preserve">Email o password non corretti.</w:t>
             </w:r>
@@ -1970,7 +2136,7 @@
         </w:tc>
         <w:tc>
           <w:tcPr>
-            <w:tcW w:type="dxa" w:w="2087"/>
+            <w:tcW w:type="dxa" w:w="2142"/>
             <w:tcBorders>
               <w:top w:val="single" w:color="D9D4C5" w:sz="4"/>
               <w:left w:val="single" w:color="D9D4C5" w:sz="4"/>
@@ -1993,8 +2159,8 @@
               <w:rPr>
                 <w:rFonts w:ascii="Arial" w:cs="Arial" w:eastAsia="Arial" w:hAnsi="Arial"/>
                 <w:color w:val="1B2118"/>
-                <w:sz w:val="19"/>
-                <w:szCs w:val="19"/>
+                <w:sz w:val="18"/>
+                <w:szCs w:val="18"/>
               </w:rPr>
               <w:t xml:space="preserve">Credenziali sbagliate</w:t>
             </w:r>
@@ -2002,7 +2168,7 @@
         </w:tc>
         <w:tc>
           <w:tcPr>
-            <w:tcW w:type="dxa" w:w="4570"/>
+            <w:tcW w:type="dxa" w:w="4362"/>
             <w:tcBorders>
               <w:top w:val="single" w:color="D9D4C5" w:sz="4"/>
               <w:left w:val="single" w:color="D9D4C5" w:sz="4"/>
@@ -2025,8 +2191,8 @@
               <w:rPr>
                 <w:rFonts w:ascii="Arial" w:cs="Arial" w:eastAsia="Arial" w:hAnsi="Arial"/>
                 <w:color w:val="1B2118"/>
-                <w:sz w:val="19"/>
-                <w:szCs w:val="19"/>
+                <w:sz w:val="18"/>
+                <w:szCs w:val="18"/>
               </w:rPr>
               <w:t xml:space="preserve">Ricontrollate maiuscole e spazi, poi riprovate</w:t>
             </w:r>
@@ -2039,7 +2205,7 @@
         </w:trPr>
         <w:tc>
           <w:tcPr>
-            <w:tcW w:type="dxa" w:w="2981"/>
+            <w:tcW w:type="dxa" w:w="3134"/>
             <w:tcBorders>
               <w:top w:val="single" w:color="D9D4C5" w:sz="4"/>
               <w:left w:val="single" w:color="D9D4C5" w:sz="4"/>
@@ -2063,8 +2229,8 @@
               <w:rPr>
                 <w:rFonts w:ascii="Arial" w:cs="Arial" w:eastAsia="Arial" w:hAnsi="Arial"/>
                 <w:color w:val="1B2118"/>
-                <w:sz w:val="19"/>
-                <w:szCs w:val="19"/>
+                <w:sz w:val="18"/>
+                <w:szCs w:val="18"/>
               </w:rPr>
               <w:t xml:space="preserve">Accesso non riuscito. Riprova.</w:t>
             </w:r>
@@ -2072,7 +2238,7 @@
         </w:tc>
         <w:tc>
           <w:tcPr>
-            <w:tcW w:type="dxa" w:w="2087"/>
+            <w:tcW w:type="dxa" w:w="2142"/>
             <w:tcBorders>
               <w:top w:val="single" w:color="D9D4C5" w:sz="4"/>
               <w:left w:val="single" w:color="D9D4C5" w:sz="4"/>
@@ -2096,8 +2262,8 @@
               <w:rPr>
                 <w:rFonts w:ascii="Arial" w:cs="Arial" w:eastAsia="Arial" w:hAnsi="Arial"/>
                 <w:color w:val="1B2118"/>
-                <w:sz w:val="19"/>
-                <w:szCs w:val="19"/>
+                <w:sz w:val="18"/>
+                <w:szCs w:val="18"/>
               </w:rPr>
               <w:t xml:space="preserve">Problema temporaneo</w:t>
             </w:r>
@@ -2105,7 +2271,7 @@
         </w:tc>
         <w:tc>
           <w:tcPr>
-            <w:tcW w:type="dxa" w:w="4570"/>
+            <w:tcW w:type="dxa" w:w="4362"/>
             <w:tcBorders>
               <w:top w:val="single" w:color="D9D4C5" w:sz="4"/>
               <w:left w:val="single" w:color="D9D4C5" w:sz="4"/>
@@ -2129,8 +2295,8 @@
               <w:rPr>
                 <w:rFonts w:ascii="Arial" w:cs="Arial" w:eastAsia="Arial" w:hAnsi="Arial"/>
                 <w:color w:val="1B2118"/>
-                <w:sz w:val="19"/>
-                <w:szCs w:val="19"/>
+                <w:sz w:val="18"/>
+                <w:szCs w:val="18"/>
               </w:rPr>
               <w:t xml:space="preserve">Riprovate dopo qualche minuto</w:t>
             </w:r>
@@ -2142,6 +2308,51 @@
       <w:pPr>
         <w:spacing w:after="160"/>
       </w:pPr>
+    </w:p>
+    <w:p>
+      <w:pPr>
+        <w:spacing w:after="140" w:line="300"/>
+      </w:pPr>
+      <w:r>
+        <w:rPr>
+          <w:rFonts w:ascii="Arial" w:cs="Arial" w:eastAsia="Arial" w:hAnsi="Arial"/>
+          <w:b/>
+          <w:bCs/>
+          <w:color w:val="1B2118"/>
+          <w:sz w:val="21"/>
+          <w:szCs w:val="21"/>
+        </w:rPr>
+        <w:t xml:space="preserve">Il manuale.</w:t>
+      </w:r>
+      <w:r>
+        <w:rPr>
+          <w:rFonts w:ascii="Arial" w:cs="Arial" w:eastAsia="Arial" w:hAnsi="Arial"/>
+          <w:color w:val="1B2118"/>
+          <w:sz w:val="21"/>
+          <w:szCs w:val="21"/>
+        </w:rPr>
+        <w:t xml:space="preserve"> La voce </w:t>
+      </w:r>
+      <w:r>
+        <w:rPr>
+          <w:rFonts w:ascii="Arial" w:cs="Arial" w:eastAsia="Arial" w:hAnsi="Arial"/>
+          <w:b/>
+          <w:bCs/>
+          <w:color w:val="1B2118"/>
+          <w:sz w:val="21"/>
+          <w:szCs w:val="21"/>
+        </w:rPr>
+        <w:t xml:space="preserve">Manuale</w:t>
+      </w:r>
+      <w:r>
+        <w:rPr>
+          <w:rFonts w:ascii="Arial" w:cs="Arial" w:eastAsia="Arial" w:hAnsi="Arial"/>
+          <w:color w:val="1B2118"/>
+          <w:sz w:val="21"/>
+          <w:szCs w:val="21"/>
+        </w:rPr>
+        <w:t xml:space="preserve"> del menu apre la pagina da cui scaricare questo manuale in PDF o in Word, sempre nella revisione più recente.</w:t>
+      </w:r>
     </w:p>
     <w:p>
       <w:pPr>
@@ -2233,8 +2444,8 @@
         <w:tblLayout w:type="fixed"/>
       </w:tblPr>
       <w:tblGrid>
-        <w:gridCol w:w="1334"/>
-        <w:gridCol w:w="8304"/>
+        <w:gridCol w:w="1936"/>
+        <w:gridCol w:w="7702"/>
       </w:tblGrid>
       <w:tr>
         <w:trPr>
@@ -2242,7 +2453,7 @@
         </w:trPr>
         <w:tc>
           <w:tcPr>
-            <w:tcW w:type="dxa" w:w="1334"/>
+            <w:tcW w:type="dxa" w:w="1936"/>
             <w:tcBorders>
               <w:top w:val="single" w:color="D9D4C5" w:sz="4"/>
               <w:left w:val="single" w:color="D9D4C5" w:sz="4"/>
@@ -2268,8 +2479,8 @@
                 <w:b/>
                 <w:bCs/>
                 <w:color w:val="FFFFFF"/>
-                <w:sz w:val="19"/>
-                <w:szCs w:val="19"/>
+                <w:sz w:val="18"/>
+                <w:szCs w:val="18"/>
               </w:rPr>
               <w:t xml:space="preserve">Stato</w:t>
             </w:r>
@@ -2277,7 +2488,7 @@
         </w:tc>
         <w:tc>
           <w:tcPr>
-            <w:tcW w:type="dxa" w:w="8304"/>
+            <w:tcW w:type="dxa" w:w="7702"/>
             <w:tcBorders>
               <w:top w:val="single" w:color="D9D4C5" w:sz="4"/>
               <w:left w:val="single" w:color="D9D4C5" w:sz="4"/>
@@ -2303,8 +2514,8 @@
                 <w:b/>
                 <w:bCs/>
                 <w:color w:val="FFFFFF"/>
-                <w:sz w:val="19"/>
-                <w:szCs w:val="19"/>
+                <w:sz w:val="18"/>
+                <w:szCs w:val="18"/>
               </w:rPr>
               <w:t xml:space="preserve">Significato</w:t>
             </w:r>
@@ -2317,7 +2528,7 @@
         </w:trPr>
         <w:tc>
           <w:tcPr>
-            <w:tcW w:type="dxa" w:w="1334"/>
+            <w:tcW w:type="dxa" w:w="1936"/>
             <w:tcBorders>
               <w:top w:val="single" w:color="D9D4C5" w:sz="4"/>
               <w:left w:val="single" w:color="D9D4C5" w:sz="4"/>
@@ -2340,8 +2551,8 @@
               <w:rPr>
                 <w:rFonts w:ascii="Arial" w:cs="Arial" w:eastAsia="Arial" w:hAnsi="Arial"/>
                 <w:color w:val="1B2118"/>
-                <w:sz w:val="19"/>
-                <w:szCs w:val="19"/>
+                <w:sz w:val="18"/>
+                <w:szCs w:val="18"/>
               </w:rPr>
               <w:t xml:space="preserve">Attiva</w:t>
             </w:r>
@@ -2349,7 +2560,7 @@
         </w:tc>
         <w:tc>
           <w:tcPr>
-            <w:tcW w:type="dxa" w:w="8304"/>
+            <w:tcW w:type="dxa" w:w="7702"/>
             <w:tcBorders>
               <w:top w:val="single" w:color="D9D4C5" w:sz="4"/>
               <w:left w:val="single" w:color="D9D4C5" w:sz="4"/>
@@ -2372,8 +2583,8 @@
               <w:rPr>
                 <w:rFonts w:ascii="Arial" w:cs="Arial" w:eastAsia="Arial" w:hAnsi="Arial"/>
                 <w:color w:val="1B2118"/>
-                <w:sz w:val="19"/>
-                <w:szCs w:val="19"/>
+                <w:sz w:val="18"/>
+                <w:szCs w:val="18"/>
               </w:rPr>
               <w:t xml:space="preserve">La pratica procede normalmente</w:t>
             </w:r>
@@ -2386,7 +2597,7 @@
         </w:trPr>
         <w:tc>
           <w:tcPr>
-            <w:tcW w:type="dxa" w:w="1334"/>
+            <w:tcW w:type="dxa" w:w="1936"/>
             <w:tcBorders>
               <w:top w:val="single" w:color="D9D4C5" w:sz="4"/>
               <w:left w:val="single" w:color="D9D4C5" w:sz="4"/>
@@ -2410,8 +2621,8 @@
               <w:rPr>
                 <w:rFonts w:ascii="Arial" w:cs="Arial" w:eastAsia="Arial" w:hAnsi="Arial"/>
                 <w:color w:val="1B2118"/>
-                <w:sz w:val="19"/>
-                <w:szCs w:val="19"/>
+                <w:sz w:val="18"/>
+                <w:szCs w:val="18"/>
               </w:rPr>
               <w:t xml:space="preserve">Sospesa</w:t>
             </w:r>
@@ -2419,7 +2630,7 @@
         </w:tc>
         <w:tc>
           <w:tcPr>
-            <w:tcW w:type="dxa" w:w="8304"/>
+            <w:tcW w:type="dxa" w:w="7702"/>
             <w:tcBorders>
               <w:top w:val="single" w:color="D9D4C5" w:sz="4"/>
               <w:left w:val="single" w:color="D9D4C5" w:sz="4"/>
@@ -2443,8 +2654,8 @@
               <w:rPr>
                 <w:rFonts w:ascii="Arial" w:cs="Arial" w:eastAsia="Arial" w:hAnsi="Arial"/>
                 <w:color w:val="1B2118"/>
-                <w:sz w:val="19"/>
-                <w:szCs w:val="19"/>
+                <w:sz w:val="18"/>
+                <w:szCs w:val="18"/>
               </w:rPr>
               <w:t xml:space="preserve">Temporaneamente ferma: non si possono caricare documenti</w:t>
             </w:r>
@@ -2457,7 +2668,7 @@
         </w:trPr>
         <w:tc>
           <w:tcPr>
-            <w:tcW w:type="dxa" w:w="1334"/>
+            <w:tcW w:type="dxa" w:w="1936"/>
             <w:tcBorders>
               <w:top w:val="single" w:color="D9D4C5" w:sz="4"/>
               <w:left w:val="single" w:color="D9D4C5" w:sz="4"/>
@@ -2480,8 +2691,8 @@
               <w:rPr>
                 <w:rFonts w:ascii="Arial" w:cs="Arial" w:eastAsia="Arial" w:hAnsi="Arial"/>
                 <w:color w:val="1B2118"/>
-                <w:sz w:val="19"/>
-                <w:szCs w:val="19"/>
+                <w:sz w:val="18"/>
+                <w:szCs w:val="18"/>
               </w:rPr>
               <w:t xml:space="preserve">Annullata</w:t>
             </w:r>
@@ -2489,7 +2700,7 @@
         </w:tc>
         <w:tc>
           <w:tcPr>
-            <w:tcW w:type="dxa" w:w="8304"/>
+            <w:tcW w:type="dxa" w:w="7702"/>
             <w:tcBorders>
               <w:top w:val="single" w:color="D9D4C5" w:sz="4"/>
               <w:left w:val="single" w:color="D9D4C5" w:sz="4"/>
@@ -2512,8 +2723,8 @@
               <w:rPr>
                 <w:rFonts w:ascii="Arial" w:cs="Arial" w:eastAsia="Arial" w:hAnsi="Arial"/>
                 <w:color w:val="1B2118"/>
-                <w:sz w:val="19"/>
-                <w:szCs w:val="19"/>
+                <w:sz w:val="18"/>
+                <w:szCs w:val="18"/>
               </w:rPr>
               <w:t xml:space="preserve">La pratica non prosegue</w:t>
             </w:r>
@@ -2526,7 +2737,7 @@
         </w:trPr>
         <w:tc>
           <w:tcPr>
-            <w:tcW w:type="dxa" w:w="1334"/>
+            <w:tcW w:type="dxa" w:w="1936"/>
             <w:tcBorders>
               <w:top w:val="single" w:color="D9D4C5" w:sz="4"/>
               <w:left w:val="single" w:color="D9D4C5" w:sz="4"/>
@@ -2550,8 +2761,8 @@
               <w:rPr>
                 <w:rFonts w:ascii="Arial" w:cs="Arial" w:eastAsia="Arial" w:hAnsi="Arial"/>
                 <w:color w:val="1B2118"/>
-                <w:sz w:val="19"/>
-                <w:szCs w:val="19"/>
+                <w:sz w:val="18"/>
+                <w:szCs w:val="18"/>
               </w:rPr>
               <w:t xml:space="preserve">Chiusa</w:t>
             </w:r>
@@ -2559,7 +2770,7 @@
         </w:tc>
         <w:tc>
           <w:tcPr>
-            <w:tcW w:type="dxa" w:w="8304"/>
+            <w:tcW w:type="dxa" w:w="7702"/>
             <w:tcBorders>
               <w:top w:val="single" w:color="D9D4C5" w:sz="4"/>
               <w:left w:val="single" w:color="D9D4C5" w:sz="4"/>
@@ -2583,8 +2794,8 @@
               <w:rPr>
                 <w:rFonts w:ascii="Arial" w:cs="Arial" w:eastAsia="Arial" w:hAnsi="Arial"/>
                 <w:color w:val="1B2118"/>
-                <w:sz w:val="19"/>
-                <w:szCs w:val="19"/>
+                <w:sz w:val="18"/>
+                <w:szCs w:val="18"/>
               </w:rPr>
               <w:t xml:space="preserve">Percorso concluso</w:t>
             </w:r>
@@ -2896,8 +3107,8 @@
         <w:tblLayout w:type="fixed"/>
       </w:tblPr>
       <w:tblGrid>
-        <w:gridCol w:w="2835"/>
-        <w:gridCol w:w="6803"/>
+        <w:gridCol w:w="2541"/>
+        <w:gridCol w:w="7097"/>
       </w:tblGrid>
       <w:tr>
         <w:trPr>
@@ -2905,7 +3116,7 @@
         </w:trPr>
         <w:tc>
           <w:tcPr>
-            <w:tcW w:type="dxa" w:w="2835"/>
+            <w:tcW w:type="dxa" w:w="2541"/>
             <w:tcBorders>
               <w:top w:val="single" w:color="D9D4C5" w:sz="4"/>
               <w:left w:val="single" w:color="D9D4C5" w:sz="4"/>
@@ -2931,8 +3142,8 @@
                 <w:b/>
                 <w:bCs/>
                 <w:color w:val="FFFFFF"/>
-                <w:sz w:val="19"/>
-                <w:szCs w:val="19"/>
+                <w:sz w:val="18"/>
+                <w:szCs w:val="18"/>
               </w:rPr>
               <w:t xml:space="preserve">Stato</w:t>
             </w:r>
@@ -2940,7 +3151,7 @@
         </w:tc>
         <w:tc>
           <w:tcPr>
-            <w:tcW w:type="dxa" w:w="6803"/>
+            <w:tcW w:type="dxa" w:w="7097"/>
             <w:tcBorders>
               <w:top w:val="single" w:color="D9D4C5" w:sz="4"/>
               <w:left w:val="single" w:color="D9D4C5" w:sz="4"/>
@@ -2966,8 +3177,8 @@
                 <w:b/>
                 <w:bCs/>
                 <w:color w:val="FFFFFF"/>
-                <w:sz w:val="19"/>
-                <w:szCs w:val="19"/>
+                <w:sz w:val="18"/>
+                <w:szCs w:val="18"/>
               </w:rPr>
               <w:t xml:space="preserve">Significato</w:t>
             </w:r>
@@ -2980,7 +3191,7 @@
         </w:trPr>
         <w:tc>
           <w:tcPr>
-            <w:tcW w:type="dxa" w:w="2835"/>
+            <w:tcW w:type="dxa" w:w="2541"/>
             <w:tcBorders>
               <w:top w:val="single" w:color="D9D4C5" w:sz="4"/>
               <w:left w:val="single" w:color="D9D4C5" w:sz="4"/>
@@ -3003,8 +3214,8 @@
               <w:rPr>
                 <w:rFonts w:ascii="Arial" w:cs="Arial" w:eastAsia="Arial" w:hAnsi="Arial"/>
                 <w:color w:val="1B2118"/>
-                <w:sz w:val="19"/>
-                <w:szCs w:val="19"/>
+                <w:sz w:val="18"/>
+                <w:szCs w:val="18"/>
               </w:rPr>
               <w:t xml:space="preserve">Non iniziata</w:t>
             </w:r>
@@ -3012,7 +3223,7 @@
         </w:tc>
         <w:tc>
           <w:tcPr>
-            <w:tcW w:type="dxa" w:w="6803"/>
+            <w:tcW w:type="dxa" w:w="7097"/>
             <w:tcBorders>
               <w:top w:val="single" w:color="D9D4C5" w:sz="4"/>
               <w:left w:val="single" w:color="D9D4C5" w:sz="4"/>
@@ -3035,8 +3246,8 @@
               <w:rPr>
                 <w:rFonts w:ascii="Arial" w:cs="Arial" w:eastAsia="Arial" w:hAnsi="Arial"/>
                 <w:color w:val="1B2118"/>
-                <w:sz w:val="19"/>
-                <w:szCs w:val="19"/>
+                <w:sz w:val="18"/>
+                <w:szCs w:val="18"/>
               </w:rPr>
               <w:t xml:space="preserve">La fase non è ancora stata aperta</w:t>
             </w:r>
@@ -3049,7 +3260,7 @@
         </w:trPr>
         <w:tc>
           <w:tcPr>
-            <w:tcW w:type="dxa" w:w="2835"/>
+            <w:tcW w:type="dxa" w:w="2541"/>
             <w:tcBorders>
               <w:top w:val="single" w:color="D9D4C5" w:sz="4"/>
               <w:left w:val="single" w:color="D9D4C5" w:sz="4"/>
@@ -3073,8 +3284,8 @@
               <w:rPr>
                 <w:rFonts w:ascii="Arial" w:cs="Arial" w:eastAsia="Arial" w:hAnsi="Arial"/>
                 <w:color w:val="1B2118"/>
-                <w:sz w:val="19"/>
-                <w:szCs w:val="19"/>
+                <w:sz w:val="18"/>
+                <w:szCs w:val="18"/>
               </w:rPr>
               <w:t xml:space="preserve">In corso</w:t>
             </w:r>
@@ -3082,7 +3293,7 @@
         </w:tc>
         <w:tc>
           <w:tcPr>
-            <w:tcW w:type="dxa" w:w="6803"/>
+            <w:tcW w:type="dxa" w:w="7097"/>
             <w:tcBorders>
               <w:top w:val="single" w:color="D9D4C5" w:sz="4"/>
               <w:left w:val="single" w:color="D9D4C5" w:sz="4"/>
@@ -3106,8 +3317,8 @@
               <w:rPr>
                 <w:rFonts w:ascii="Arial" w:cs="Arial" w:eastAsia="Arial" w:hAnsi="Arial"/>
                 <w:color w:val="1B2118"/>
-                <w:sz w:val="19"/>
-                <w:szCs w:val="19"/>
+                <w:sz w:val="18"/>
+                <w:szCs w:val="18"/>
               </w:rPr>
               <w:t xml:space="preserve">La fase è aperta e ha una scadenza</w:t>
             </w:r>
@@ -3120,7 +3331,7 @@
         </w:trPr>
         <w:tc>
           <w:tcPr>
-            <w:tcW w:type="dxa" w:w="2835"/>
+            <w:tcW w:type="dxa" w:w="2541"/>
             <w:tcBorders>
               <w:top w:val="single" w:color="D9D4C5" w:sz="4"/>
               <w:left w:val="single" w:color="D9D4C5" w:sz="4"/>
@@ -3143,8 +3354,8 @@
               <w:rPr>
                 <w:rFonts w:ascii="Arial" w:cs="Arial" w:eastAsia="Arial" w:hAnsi="Arial"/>
                 <w:color w:val="1B2118"/>
-                <w:sz w:val="19"/>
-                <w:szCs w:val="19"/>
+                <w:sz w:val="18"/>
+                <w:szCs w:val="18"/>
               </w:rPr>
               <w:t xml:space="preserve">In attesa di integrazione</w:t>
             </w:r>
@@ -3152,7 +3363,7 @@
         </w:tc>
         <w:tc>
           <w:tcPr>
-            <w:tcW w:type="dxa" w:w="6803"/>
+            <w:tcW w:type="dxa" w:w="7097"/>
             <w:tcBorders>
               <w:top w:val="single" w:color="D9D4C5" w:sz="4"/>
               <w:left w:val="single" w:color="D9D4C5" w:sz="4"/>
@@ -3175,8 +3386,8 @@
               <w:rPr>
                 <w:rFonts w:ascii="Arial" w:cs="Arial" w:eastAsia="Arial" w:hAnsi="Arial"/>
                 <w:color w:val="1B2118"/>
-                <w:sz w:val="19"/>
-                <w:szCs w:val="19"/>
+                <w:sz w:val="18"/>
+                <w:szCs w:val="18"/>
               </w:rPr>
               <w:t xml:space="preserve">La Fondazione vi ha chiesto un documento o un chiarimento (capitolo 6)</w:t>
             </w:r>
@@ -3189,7 +3400,7 @@
         </w:trPr>
         <w:tc>
           <w:tcPr>
-            <w:tcW w:type="dxa" w:w="2835"/>
+            <w:tcW w:type="dxa" w:w="2541"/>
             <w:tcBorders>
               <w:top w:val="single" w:color="D9D4C5" w:sz="4"/>
               <w:left w:val="single" w:color="D9D4C5" w:sz="4"/>
@@ -3213,8 +3424,8 @@
               <w:rPr>
                 <w:rFonts w:ascii="Arial" w:cs="Arial" w:eastAsia="Arial" w:hAnsi="Arial"/>
                 <w:color w:val="1B2118"/>
-                <w:sz w:val="19"/>
-                <w:szCs w:val="19"/>
+                <w:sz w:val="18"/>
+                <w:szCs w:val="18"/>
               </w:rPr>
               <w:t xml:space="preserve">Completata</w:t>
             </w:r>
@@ -3222,7 +3433,7 @@
         </w:tc>
         <w:tc>
           <w:tcPr>
-            <w:tcW w:type="dxa" w:w="6803"/>
+            <w:tcW w:type="dxa" w:w="7097"/>
             <w:tcBorders>
               <w:top w:val="single" w:color="D9D4C5" w:sz="4"/>
               <w:left w:val="single" w:color="D9D4C5" w:sz="4"/>
@@ -3246,8 +3457,8 @@
               <w:rPr>
                 <w:rFonts w:ascii="Arial" w:cs="Arial" w:eastAsia="Arial" w:hAnsi="Arial"/>
                 <w:color w:val="1B2118"/>
-                <w:sz w:val="19"/>
-                <w:szCs w:val="19"/>
+                <w:sz w:val="18"/>
+                <w:szCs w:val="18"/>
               </w:rPr>
               <w:t xml:space="preserve">La fase è chiusa</w:t>
             </w:r>
@@ -3736,8 +3947,8 @@
                 <w:b/>
                 <w:bCs/>
                 <w:color w:val="FFFFFF"/>
-                <w:sz w:val="19"/>
-                <w:szCs w:val="19"/>
+                <w:sz w:val="18"/>
+                <w:szCs w:val="18"/>
               </w:rPr>
               <w:t xml:space="preserve">Messaggio</w:t>
             </w:r>
@@ -3771,8 +3982,8 @@
                 <w:b/>
                 <w:bCs/>
                 <w:color w:val="FFFFFF"/>
-                <w:sz w:val="19"/>
-                <w:szCs w:val="19"/>
+                <w:sz w:val="18"/>
+                <w:szCs w:val="18"/>
               </w:rPr>
               <w:t xml:space="preserve">Cosa fare</w:t>
             </w:r>
@@ -3808,8 +4019,8 @@
               <w:rPr>
                 <w:rFonts w:ascii="Arial" w:cs="Arial" w:eastAsia="Arial" w:hAnsi="Arial"/>
                 <w:color w:val="1B2118"/>
-                <w:sz w:val="19"/>
-                <w:szCs w:val="19"/>
+                <w:sz w:val="18"/>
+                <w:szCs w:val="18"/>
               </w:rPr>
               <w:t xml:space="preserve">Formato non ammesso (.xxx)</w:t>
             </w:r>
@@ -3840,8 +4051,8 @@
               <w:rPr>
                 <w:rFonts w:ascii="Arial" w:cs="Arial" w:eastAsia="Arial" w:hAnsi="Arial"/>
                 <w:color w:val="1B2118"/>
-                <w:sz w:val="19"/>
-                <w:szCs w:val="19"/>
+                <w:sz w:val="18"/>
+                <w:szCs w:val="18"/>
               </w:rPr>
               <w:t xml:space="preserve">Salvate il file in uno dei formati accettati, ad esempio PDF</w:t>
             </w:r>
@@ -3878,8 +4089,8 @@
               <w:rPr>
                 <w:rFonts w:ascii="Arial" w:cs="Arial" w:eastAsia="Arial" w:hAnsi="Arial"/>
                 <w:color w:val="1B2118"/>
-                <w:sz w:val="19"/>
-                <w:szCs w:val="19"/>
+                <w:sz w:val="18"/>
+                <w:szCs w:val="18"/>
               </w:rPr>
               <w:t xml:space="preserve">File troppo grande (… MB): il limite è 50 MB</w:t>
             </w:r>
@@ -3911,8 +4122,8 @@
               <w:rPr>
                 <w:rFonts w:ascii="Arial" w:cs="Arial" w:eastAsia="Arial" w:hAnsi="Arial"/>
                 <w:color w:val="1B2118"/>
-                <w:sz w:val="19"/>
-                <w:szCs w:val="19"/>
+                <w:sz w:val="18"/>
+                <w:szCs w:val="18"/>
               </w:rPr>
               <w:t xml:space="preserve">Comprimete il file in ZIP o dividetelo in più parti</w:t>
             </w:r>
@@ -3948,8 +4159,8 @@
               <w:rPr>
                 <w:rFonts w:ascii="Arial" w:cs="Arial" w:eastAsia="Arial" w:hAnsi="Arial"/>
                 <w:color w:val="1B2118"/>
-                <w:sz w:val="19"/>
-                <w:szCs w:val="19"/>
+                <w:sz w:val="18"/>
+                <w:szCs w:val="18"/>
               </w:rPr>
               <w:t xml:space="preserve">Il file è vuoto</w:t>
             </w:r>
@@ -3980,8 +4191,8 @@
               <w:rPr>
                 <w:rFonts w:ascii="Arial" w:cs="Arial" w:eastAsia="Arial" w:hAnsi="Arial"/>
                 <w:color w:val="1B2118"/>
-                <w:sz w:val="19"/>
-                <w:szCs w:val="19"/>
+                <w:sz w:val="18"/>
+                <w:szCs w:val="18"/>
               </w:rPr>
               <w:t xml:space="preserve">Controllate di aver scelto il file giusto</w:t>
             </w:r>
@@ -4018,8 +4229,8 @@
               <w:rPr>
                 <w:rFonts w:ascii="Arial" w:cs="Arial" w:eastAsia="Arial" w:hAnsi="Arial"/>
                 <w:color w:val="1B2118"/>
-                <w:sz w:val="19"/>
-                <w:szCs w:val="19"/>
+                <w:sz w:val="18"/>
+                <w:szCs w:val="18"/>
               </w:rPr>
               <w:t xml:space="preserve">Il contenuto del file non corrisponde a un file .xxx</w:t>
             </w:r>
@@ -4051,8 +4262,8 @@
               <w:rPr>
                 <w:rFonts w:ascii="Arial" w:cs="Arial" w:eastAsia="Arial" w:hAnsi="Arial"/>
                 <w:color w:val="1B2118"/>
-                <w:sz w:val="19"/>
-                <w:szCs w:val="19"/>
+                <w:sz w:val="18"/>
+                <w:szCs w:val="18"/>
               </w:rPr>
               <w:t xml:space="preserve">Il file non è del tipo indicato dal nome: riapritelo e salvatelo di nuovo nel formato corretto</w:t>
             </w:r>
@@ -4088,8 +4299,8 @@
               <w:rPr>
                 <w:rFonts w:ascii="Arial" w:cs="Arial" w:eastAsia="Arial" w:hAnsi="Arial"/>
                 <w:color w:val="1B2118"/>
-                <w:sz w:val="19"/>
-                <w:szCs w:val="19"/>
+                <w:sz w:val="18"/>
+                <w:szCs w:val="18"/>
               </w:rPr>
               <w:t xml:space="preserve">Operazione non consentita (la pratica potrebbe essere sospesa, annullata o chiusa)</w:t>
             </w:r>
@@ -4120,8 +4331,8 @@
               <w:rPr>
                 <w:rFonts w:ascii="Arial" w:cs="Arial" w:eastAsia="Arial" w:hAnsi="Arial"/>
                 <w:color w:val="1B2118"/>
-                <w:sz w:val="19"/>
-                <w:szCs w:val="19"/>
+                <w:sz w:val="18"/>
+                <w:szCs w:val="18"/>
               </w:rPr>
               <w:t xml:space="preserve">Con la pratica non attiva non si caricano documenti: contattate la Fondazione</w:t>
             </w:r>
@@ -5448,8 +5659,8 @@
         <w:tblLayout w:type="fixed"/>
       </w:tblPr>
       <w:tblGrid>
-        <w:gridCol w:w="4719"/>
-        <w:gridCol w:w="4919"/>
+        <w:gridCol w:w="4544"/>
+        <w:gridCol w:w="5094"/>
       </w:tblGrid>
       <w:tr>
         <w:trPr>
@@ -5457,7 +5668,7 @@
         </w:trPr>
         <w:tc>
           <w:tcPr>
-            <w:tcW w:type="dxa" w:w="4719"/>
+            <w:tcW w:type="dxa" w:w="4544"/>
             <w:tcBorders>
               <w:top w:val="single" w:color="D9D4C5" w:sz="4"/>
               <w:left w:val="single" w:color="D9D4C5" w:sz="4"/>
@@ -5483,8 +5694,8 @@
                 <w:b/>
                 <w:bCs/>
                 <w:color w:val="FFFFFF"/>
-                <w:sz w:val="19"/>
-                <w:szCs w:val="19"/>
+                <w:sz w:val="18"/>
+                <w:szCs w:val="18"/>
               </w:rPr>
               <w:t xml:space="preserve">Notifica</w:t>
             </w:r>
@@ -5492,7 +5703,7 @@
         </w:tc>
         <w:tc>
           <w:tcPr>
-            <w:tcW w:type="dxa" w:w="4919"/>
+            <w:tcW w:type="dxa" w:w="5094"/>
             <w:tcBorders>
               <w:top w:val="single" w:color="D9D4C5" w:sz="4"/>
               <w:left w:val="single" w:color="D9D4C5" w:sz="4"/>
@@ -5518,8 +5729,8 @@
                 <w:b/>
                 <w:bCs/>
                 <w:color w:val="FFFFFF"/>
-                <w:sz w:val="19"/>
-                <w:szCs w:val="19"/>
+                <w:sz w:val="18"/>
+                <w:szCs w:val="18"/>
               </w:rPr>
               <w:t xml:space="preserve">Quando arriva</w:t>
             </w:r>
@@ -5532,7 +5743,7 @@
         </w:trPr>
         <w:tc>
           <w:tcPr>
-            <w:tcW w:type="dxa" w:w="4719"/>
+            <w:tcW w:type="dxa" w:w="4544"/>
             <w:tcBorders>
               <w:top w:val="single" w:color="D9D4C5" w:sz="4"/>
               <w:left w:val="single" w:color="D9D4C5" w:sz="4"/>
@@ -5555,8 +5766,8 @@
               <w:rPr>
                 <w:rFonts w:ascii="Arial" w:cs="Arial" w:eastAsia="Arial" w:hAnsi="Arial"/>
                 <w:color w:val="1B2118"/>
-                <w:sz w:val="19"/>
-                <w:szCs w:val="19"/>
+                <w:sz w:val="18"/>
+                <w:szCs w:val="18"/>
               </w:rPr>
               <w:t xml:space="preserve">Aperta la fase «…» — scadenza …</w:t>
             </w:r>
@@ -5564,7 +5775,7 @@
         </w:tc>
         <w:tc>
           <w:tcPr>
-            <w:tcW w:type="dxa" w:w="4919"/>
+            <w:tcW w:type="dxa" w:w="5094"/>
             <w:tcBorders>
               <w:top w:val="single" w:color="D9D4C5" w:sz="4"/>
               <w:left w:val="single" w:color="D9D4C5" w:sz="4"/>
@@ -5587,8 +5798,8 @@
               <w:rPr>
                 <w:rFonts w:ascii="Arial" w:cs="Arial" w:eastAsia="Arial" w:hAnsi="Arial"/>
                 <w:color w:val="1B2118"/>
-                <w:sz w:val="19"/>
-                <w:szCs w:val="19"/>
+                <w:sz w:val="18"/>
+                <w:szCs w:val="18"/>
               </w:rPr>
               <w:t xml:space="preserve">La Fondazione apre una fase</w:t>
             </w:r>
@@ -5601,7 +5812,7 @@
         </w:trPr>
         <w:tc>
           <w:tcPr>
-            <w:tcW w:type="dxa" w:w="4719"/>
+            <w:tcW w:type="dxa" w:w="4544"/>
             <w:tcBorders>
               <w:top w:val="single" w:color="D9D4C5" w:sz="4"/>
               <w:left w:val="single" w:color="D9D4C5" w:sz="4"/>
@@ -5625,8 +5836,8 @@
               <w:rPr>
                 <w:rFonts w:ascii="Arial" w:cs="Arial" w:eastAsia="Arial" w:hAnsi="Arial"/>
                 <w:color w:val="1B2118"/>
-                <w:sz w:val="19"/>
-                <w:szCs w:val="19"/>
+                <w:sz w:val="18"/>
+                <w:szCs w:val="18"/>
               </w:rPr>
               <w:t xml:space="preserve">Completata la fase «…»</w:t>
             </w:r>
@@ -5634,7 +5845,7 @@
         </w:tc>
         <w:tc>
           <w:tcPr>
-            <w:tcW w:type="dxa" w:w="4919"/>
+            <w:tcW w:type="dxa" w:w="5094"/>
             <w:tcBorders>
               <w:top w:val="single" w:color="D9D4C5" w:sz="4"/>
               <w:left w:val="single" w:color="D9D4C5" w:sz="4"/>
@@ -5658,8 +5869,8 @@
               <w:rPr>
                 <w:rFonts w:ascii="Arial" w:cs="Arial" w:eastAsia="Arial" w:hAnsi="Arial"/>
                 <w:color w:val="1B2118"/>
-                <w:sz w:val="19"/>
-                <w:szCs w:val="19"/>
+                <w:sz w:val="18"/>
+                <w:szCs w:val="18"/>
               </w:rPr>
               <w:t xml:space="preserve">La Fondazione chiude una fase</w:t>
             </w:r>
@@ -5672,7 +5883,7 @@
         </w:trPr>
         <w:tc>
           <w:tcPr>
-            <w:tcW w:type="dxa" w:w="4719"/>
+            <w:tcW w:type="dxa" w:w="4544"/>
             <w:tcBorders>
               <w:top w:val="single" w:color="D9D4C5" w:sz="4"/>
               <w:left w:val="single" w:color="D9D4C5" w:sz="4"/>
@@ -5695,8 +5906,8 @@
               <w:rPr>
                 <w:rFonts w:ascii="Arial" w:cs="Arial" w:eastAsia="Arial" w:hAnsi="Arial"/>
                 <w:color w:val="1B2118"/>
-                <w:sz w:val="19"/>
-                <w:szCs w:val="19"/>
+                <w:sz w:val="18"/>
+                <w:szCs w:val="18"/>
               </w:rPr>
               <w:t xml:space="preserve">Nuova richiesta di integrazione</w:t>
             </w:r>
@@ -5704,7 +5915,7 @@
         </w:tc>
         <w:tc>
           <w:tcPr>
-            <w:tcW w:type="dxa" w:w="4919"/>
+            <w:tcW w:type="dxa" w:w="5094"/>
             <w:tcBorders>
               <w:top w:val="single" w:color="D9D4C5" w:sz="4"/>
               <w:left w:val="single" w:color="D9D4C5" w:sz="4"/>
@@ -5727,8 +5938,8 @@
               <w:rPr>
                 <w:rFonts w:ascii="Arial" w:cs="Arial" w:eastAsia="Arial" w:hAnsi="Arial"/>
                 <w:color w:val="1B2118"/>
-                <w:sz w:val="19"/>
-                <w:szCs w:val="19"/>
+                <w:sz w:val="18"/>
+                <w:szCs w:val="18"/>
               </w:rPr>
               <w:t xml:space="preserve">Vi viene chiesto un documento o un chiarimento</w:t>
             </w:r>
@@ -5741,7 +5952,7 @@
         </w:trPr>
         <w:tc>
           <w:tcPr>
-            <w:tcW w:type="dxa" w:w="4719"/>
+            <w:tcW w:type="dxa" w:w="4544"/>
             <w:tcBorders>
               <w:top w:val="single" w:color="D9D4C5" w:sz="4"/>
               <w:left w:val="single" w:color="D9D4C5" w:sz="4"/>
@@ -5765,8 +5976,8 @@
               <w:rPr>
                 <w:rFonts w:ascii="Arial" w:cs="Arial" w:eastAsia="Arial" w:hAnsi="Arial"/>
                 <w:color w:val="1B2118"/>
-                <w:sz w:val="19"/>
-                <w:szCs w:val="19"/>
+                <w:sz w:val="18"/>
+                <w:szCs w:val="18"/>
               </w:rPr>
               <w:t xml:space="preserve">Nuovo documento disponibile</w:t>
             </w:r>
@@ -5774,7 +5985,7 @@
         </w:tc>
         <w:tc>
           <w:tcPr>
-            <w:tcW w:type="dxa" w:w="4919"/>
+            <w:tcW w:type="dxa" w:w="5094"/>
             <w:tcBorders>
               <w:top w:val="single" w:color="D9D4C5" w:sz="4"/>
               <w:left w:val="single" w:color="D9D4C5" w:sz="4"/>
@@ -5798,8 +6009,8 @@
               <w:rPr>
                 <w:rFonts w:ascii="Arial" w:cs="Arial" w:eastAsia="Arial" w:hAnsi="Arial"/>
                 <w:color w:val="1B2118"/>
-                <w:sz w:val="19"/>
-                <w:szCs w:val="19"/>
+                <w:sz w:val="18"/>
+                <w:szCs w:val="18"/>
               </w:rPr>
               <w:t xml:space="preserve">La Fondazione carica un documento visibile a voi</w:t>
             </w:r>
@@ -5812,7 +6023,7 @@
         </w:trPr>
         <w:tc>
           <w:tcPr>
-            <w:tcW w:type="dxa" w:w="4719"/>
+            <w:tcW w:type="dxa" w:w="4544"/>
             <w:tcBorders>
               <w:top w:val="single" w:color="D9D4C5" w:sz="4"/>
               <w:left w:val="single" w:color="D9D4C5" w:sz="4"/>
@@ -5835,8 +6046,8 @@
               <w:rPr>
                 <w:rFonts w:ascii="Arial" w:cs="Arial" w:eastAsia="Arial" w:hAnsi="Arial"/>
                 <w:color w:val="1B2118"/>
-                <w:sz w:val="19"/>
-                <w:szCs w:val="19"/>
+                <w:sz w:val="18"/>
+                <w:szCs w:val="18"/>
               </w:rPr>
               <w:t xml:space="preserve">Aperta la consultazione pubblica — fino al …</w:t>
             </w:r>
@@ -5844,7 +6055,7 @@
         </w:tc>
         <w:tc>
           <w:tcPr>
-            <w:tcW w:type="dxa" w:w="4919"/>
+            <w:tcW w:type="dxa" w:w="5094"/>
             <w:tcBorders>
               <w:top w:val="single" w:color="D9D4C5" w:sz="4"/>
               <w:left w:val="single" w:color="D9D4C5" w:sz="4"/>
@@ -5867,8 +6078,8 @@
               <w:rPr>
                 <w:rFonts w:ascii="Arial" w:cs="Arial" w:eastAsia="Arial" w:hAnsi="Arial"/>
                 <w:color w:val="1B2118"/>
-                <w:sz w:val="19"/>
-                <w:szCs w:val="19"/>
+                <w:sz w:val="18"/>
+                <w:szCs w:val="18"/>
               </w:rPr>
               <w:t xml:space="preserve">Inizia la consultazione sul vostro Progetto</w:t>
             </w:r>
@@ -5881,7 +6092,7 @@
         </w:trPr>
         <w:tc>
           <w:tcPr>
-            <w:tcW w:type="dxa" w:w="4719"/>
+            <w:tcW w:type="dxa" w:w="4544"/>
             <w:tcBorders>
               <w:top w:val="single" w:color="D9D4C5" w:sz="4"/>
               <w:left w:val="single" w:color="D9D4C5" w:sz="4"/>
@@ -5905,8 +6116,8 @@
               <w:rPr>
                 <w:rFonts w:ascii="Arial" w:cs="Arial" w:eastAsia="Arial" w:hAnsi="Arial"/>
                 <w:color w:val="1B2118"/>
-                <w:sz w:val="19"/>
-                <w:szCs w:val="19"/>
+                <w:sz w:val="18"/>
+                <w:szCs w:val="18"/>
               </w:rPr>
               <w:t xml:space="preserve">Scadenza vicina: «fase» (data)</w:t>
             </w:r>
@@ -5914,7 +6125,7 @@
         </w:tc>
         <w:tc>
           <w:tcPr>
-            <w:tcW w:type="dxa" w:w="4919"/>
+            <w:tcW w:type="dxa" w:w="5094"/>
             <w:tcBorders>
               <w:top w:val="single" w:color="D9D4C5" w:sz="4"/>
               <w:left w:val="single" w:color="D9D4C5" w:sz="4"/>
@@ -5938,8 +6149,8 @@
               <w:rPr>
                 <w:rFonts w:ascii="Arial" w:cs="Arial" w:eastAsia="Arial" w:hAnsi="Arial"/>
                 <w:color w:val="1B2118"/>
-                <w:sz w:val="19"/>
-                <w:szCs w:val="19"/>
+                <w:sz w:val="18"/>
+                <w:szCs w:val="18"/>
               </w:rPr>
               <w:t xml:space="preserve">Mancano 3 giorni o meno alla scadenza di una fase</w:t>
             </w:r>
@@ -5952,7 +6163,7 @@
         </w:trPr>
         <w:tc>
           <w:tcPr>
-            <w:tcW w:type="dxa" w:w="4719"/>
+            <w:tcW w:type="dxa" w:w="4544"/>
             <w:tcBorders>
               <w:top w:val="single" w:color="D9D4C5" w:sz="4"/>
               <w:left w:val="single" w:color="D9D4C5" w:sz="4"/>
@@ -5975,8 +6186,8 @@
               <w:rPr>
                 <w:rFonts w:ascii="Arial" w:cs="Arial" w:eastAsia="Arial" w:hAnsi="Arial"/>
                 <w:color w:val="1B2118"/>
-                <w:sz w:val="19"/>
-                <w:szCs w:val="19"/>
+                <w:sz w:val="18"/>
+                <w:szCs w:val="18"/>
               </w:rPr>
               <w:t xml:space="preserve">Fase scaduta: «fase»</w:t>
             </w:r>
@@ -5984,7 +6195,7 @@
         </w:tc>
         <w:tc>
           <w:tcPr>
-            <w:tcW w:type="dxa" w:w="4919"/>
+            <w:tcW w:type="dxa" w:w="5094"/>
             <w:tcBorders>
               <w:top w:val="single" w:color="D9D4C5" w:sz="4"/>
               <w:left w:val="single" w:color="D9D4C5" w:sz="4"/>
@@ -6007,8 +6218,8 @@
               <w:rPr>
                 <w:rFonts w:ascii="Arial" w:cs="Arial" w:eastAsia="Arial" w:hAnsi="Arial"/>
                 <w:color w:val="1B2118"/>
-                <w:sz w:val="19"/>
-                <w:szCs w:val="19"/>
+                <w:sz w:val="18"/>
+                <w:szCs w:val="18"/>
               </w:rPr>
               <w:t xml:space="preserve">La scadenza è passata</w:t>
             </w:r>
@@ -6021,7 +6232,7 @@
         </w:trPr>
         <w:tc>
           <w:tcPr>
-            <w:tcW w:type="dxa" w:w="4719"/>
+            <w:tcW w:type="dxa" w:w="4544"/>
             <w:tcBorders>
               <w:top w:val="single" w:color="D9D4C5" w:sz="4"/>
               <w:left w:val="single" w:color="D9D4C5" w:sz="4"/>
@@ -6045,8 +6256,8 @@
               <w:rPr>
                 <w:rFonts w:ascii="Arial" w:cs="Arial" w:eastAsia="Arial" w:hAnsi="Arial"/>
                 <w:color w:val="1B2118"/>
-                <w:sz w:val="19"/>
-                <w:szCs w:val="19"/>
+                <w:sz w:val="18"/>
+                <w:szCs w:val="18"/>
               </w:rPr>
               <w:t xml:space="preserve">Pratica sospesa, riattivata, annullata o chiusa</w:t>
             </w:r>
@@ -6054,7 +6265,7 @@
         </w:tc>
         <w:tc>
           <w:tcPr>
-            <w:tcW w:type="dxa" w:w="4919"/>
+            <w:tcW w:type="dxa" w:w="5094"/>
             <w:tcBorders>
               <w:top w:val="single" w:color="D9D4C5" w:sz="4"/>
               <w:left w:val="single" w:color="D9D4C5" w:sz="4"/>
@@ -6078,8 +6289,8 @@
               <w:rPr>
                 <w:rFonts w:ascii="Arial" w:cs="Arial" w:eastAsia="Arial" w:hAnsi="Arial"/>
                 <w:color w:val="1B2118"/>
-                <w:sz w:val="19"/>
-                <w:szCs w:val="19"/>
+                <w:sz w:val="18"/>
+                <w:szCs w:val="18"/>
               </w:rPr>
               <w:t xml:space="preserve">Cambia lo stato della pratica, con la motivazione</w:t>
             </w:r>
@@ -6162,7 +6373,7 @@
         </w:rPr>
         <w:t xml:space="preserve">, uguale per tutti gli enti. Il modello si scarica dalla pagina pubblica </w:t>
       </w:r>
-      <w:hyperlink w:history="1" r:id="rIdgnura6da6wmlmfqnrgwdj">
+      <w:hyperlink w:history="1" r:id="rIdjmglvrp1zwgirrxqbyvjy">
         <w:r>
           <w:rPr>
             <w:rFonts w:ascii="Arial" w:cs="Arial" w:eastAsia="Arial" w:hAnsi="Arial"/>
@@ -6477,9 +6688,9 @@
         <w:tblLayout w:type="fixed"/>
       </w:tblPr>
       <w:tblGrid>
-        <w:gridCol w:w="2131"/>
-        <w:gridCol w:w="5097"/>
-        <w:gridCol w:w="2410"/>
+        <w:gridCol w:w="3135"/>
+        <w:gridCol w:w="4294"/>
+        <w:gridCol w:w="2209"/>
       </w:tblGrid>
       <w:tr>
         <w:trPr>
@@ -6487,7 +6698,7 @@
         </w:trPr>
         <w:tc>
           <w:tcPr>
-            <w:tcW w:type="dxa" w:w="2131"/>
+            <w:tcW w:type="dxa" w:w="3135"/>
             <w:tcBorders>
               <w:top w:val="single" w:color="D9D4C5" w:sz="4"/>
               <w:left w:val="single" w:color="D9D4C5" w:sz="4"/>
@@ -6513,8 +6724,8 @@
                 <w:b/>
                 <w:bCs/>
                 <w:color w:val="FFFFFF"/>
-                <w:sz w:val="19"/>
-                <w:szCs w:val="19"/>
+                <w:sz w:val="18"/>
+                <w:szCs w:val="18"/>
               </w:rPr>
               <w:t xml:space="preserve">Foglio</w:t>
             </w:r>
@@ -6522,7 +6733,7 @@
         </w:tc>
         <w:tc>
           <w:tcPr>
-            <w:tcW w:type="dxa" w:w="5097"/>
+            <w:tcW w:type="dxa" w:w="4294"/>
             <w:tcBorders>
               <w:top w:val="single" w:color="D9D4C5" w:sz="4"/>
               <w:left w:val="single" w:color="D9D4C5" w:sz="4"/>
@@ -6548,8 +6759,8 @@
                 <w:b/>
                 <w:bCs/>
                 <w:color w:val="FFFFFF"/>
-                <w:sz w:val="19"/>
-                <w:szCs w:val="19"/>
+                <w:sz w:val="18"/>
+                <w:szCs w:val="18"/>
               </w:rPr>
               <w:t xml:space="preserve">Dati</w:t>
             </w:r>
@@ -6557,7 +6768,7 @@
         </w:tc>
         <w:tc>
           <w:tcPr>
-            <w:tcW w:type="dxa" w:w="2410"/>
+            <w:tcW w:type="dxa" w:w="2209"/>
             <w:tcBorders>
               <w:top w:val="single" w:color="D9D4C5" w:sz="4"/>
               <w:left w:val="single" w:color="D9D4C5" w:sz="4"/>
@@ -6583,8 +6794,8 @@
                 <w:b/>
                 <w:bCs/>
                 <w:color w:val="FFFFFF"/>
-                <w:sz w:val="19"/>
-                <w:szCs w:val="19"/>
+                <w:sz w:val="18"/>
+                <w:szCs w:val="18"/>
               </w:rPr>
               <w:t xml:space="preserve">Chi li fornisce di solito</w:t>
             </w:r>
@@ -6597,7 +6808,7 @@
         </w:trPr>
         <w:tc>
           <w:tcPr>
-            <w:tcW w:type="dxa" w:w="2131"/>
+            <w:tcW w:type="dxa" w:w="3135"/>
             <w:tcBorders>
               <w:top w:val="single" w:color="D9D4C5" w:sz="4"/>
               <w:left w:val="single" w:color="D9D4C5" w:sz="4"/>
@@ -6620,8 +6831,8 @@
               <w:rPr>
                 <w:rFonts w:ascii="Arial" w:cs="Arial" w:eastAsia="Arial" w:hAnsi="Arial"/>
                 <w:color w:val="1B2118"/>
-                <w:sz w:val="19"/>
-                <w:szCs w:val="19"/>
+                <w:sz w:val="18"/>
+                <w:szCs w:val="18"/>
               </w:rPr>
               <w:t xml:space="preserve">1_Anagrafica</w:t>
             </w:r>
@@ -6629,7 +6840,7 @@
         </w:tc>
         <w:tc>
           <w:tcPr>
-            <w:tcW w:type="dxa" w:w="5097"/>
+            <w:tcW w:type="dxa" w:w="4294"/>
             <w:tcBorders>
               <w:top w:val="single" w:color="D9D4C5" w:sz="4"/>
               <w:left w:val="single" w:color="D9D4C5" w:sz="4"/>
@@ -6652,8 +6863,8 @@
               <w:rPr>
                 <w:rFonts w:ascii="Arial" w:cs="Arial" w:eastAsia="Arial" w:hAnsi="Arial"/>
                 <w:color w:val="1B2118"/>
-                <w:sz w:val="19"/>
-                <w:szCs w:val="19"/>
+                <w:sz w:val="18"/>
+                <w:szCs w:val="18"/>
               </w:rPr>
               <w:t xml:space="preserve">Ente, anno, gestore, tariffa puntuale, ripartizione PEF</w:t>
             </w:r>
@@ -6661,7 +6872,7 @@
         </w:tc>
         <w:tc>
           <w:tcPr>
-            <w:tcW w:type="dxa" w:w="2410"/>
+            <w:tcW w:type="dxa" w:w="2209"/>
             <w:tcBorders>
               <w:top w:val="single" w:color="D9D4C5" w:sz="4"/>
               <w:left w:val="single" w:color="D9D4C5" w:sz="4"/>
@@ -6684,8 +6895,8 @@
               <w:rPr>
                 <w:rFonts w:ascii="Arial" w:cs="Arial" w:eastAsia="Arial" w:hAnsi="Arial"/>
                 <w:color w:val="1B2118"/>
-                <w:sz w:val="19"/>
-                <w:szCs w:val="19"/>
+                <w:sz w:val="18"/>
+                <w:szCs w:val="18"/>
               </w:rPr>
               <w:t xml:space="preserve">Comune</w:t>
             </w:r>
@@ -6698,7 +6909,7 @@
         </w:trPr>
         <w:tc>
           <w:tcPr>
-            <w:tcW w:type="dxa" w:w="2131"/>
+            <w:tcW w:type="dxa" w:w="3135"/>
             <w:tcBorders>
               <w:top w:val="single" w:color="D9D4C5" w:sz="4"/>
               <w:left w:val="single" w:color="D9D4C5" w:sz="4"/>
@@ -6722,8 +6933,8 @@
               <w:rPr>
                 <w:rFonts w:ascii="Arial" w:cs="Arial" w:eastAsia="Arial" w:hAnsi="Arial"/>
                 <w:color w:val="1B2118"/>
-                <w:sz w:val="19"/>
-                <w:szCs w:val="19"/>
+                <w:sz w:val="18"/>
+                <w:szCs w:val="18"/>
               </w:rPr>
               <w:t xml:space="preserve">2_Rifiuti</w:t>
             </w:r>
@@ -6731,7 +6942,7 @@
         </w:tc>
         <w:tc>
           <w:tcPr>
-            <w:tcW w:type="dxa" w:w="5097"/>
+            <w:tcW w:type="dxa" w:w="4294"/>
             <w:tcBorders>
               <w:top w:val="single" w:color="D9D4C5" w:sz="4"/>
               <w:left w:val="single" w:color="D9D4C5" w:sz="4"/>
@@ -6755,8 +6966,8 @@
               <w:rPr>
                 <w:rFonts w:ascii="Arial" w:cs="Arial" w:eastAsia="Arial" w:hAnsi="Arial"/>
                 <w:color w:val="1B2118"/>
-                <w:sz w:val="19"/>
-                <w:szCs w:val="19"/>
+                <w:sz w:val="18"/>
+                <w:szCs w:val="18"/>
               </w:rPr>
               <w:t xml:space="preserve">Tonnellate per codice EER (Catasto ISPRA, MUD, O.R.So.)</w:t>
             </w:r>
@@ -6764,7 +6975,7 @@
         </w:tc>
         <w:tc>
           <w:tcPr>
-            <w:tcW w:type="dxa" w:w="2410"/>
+            <w:tcW w:type="dxa" w:w="2209"/>
             <w:tcBorders>
               <w:top w:val="single" w:color="D9D4C5" w:sz="4"/>
               <w:left w:val="single" w:color="D9D4C5" w:sz="4"/>
@@ -6788,8 +6999,8 @@
               <w:rPr>
                 <w:rFonts w:ascii="Arial" w:cs="Arial" w:eastAsia="Arial" w:hAnsi="Arial"/>
                 <w:color w:val="1B2118"/>
-                <w:sz w:val="19"/>
-                <w:szCs w:val="19"/>
+                <w:sz w:val="18"/>
+                <w:szCs w:val="18"/>
               </w:rPr>
               <w:t xml:space="preserve">Comune o gestore</w:t>
             </w:r>
@@ -6802,7 +7013,7 @@
         </w:trPr>
         <w:tc>
           <w:tcPr>
-            <w:tcW w:type="dxa" w:w="2131"/>
+            <w:tcW w:type="dxa" w:w="3135"/>
             <w:tcBorders>
               <w:top w:val="single" w:color="D9D4C5" w:sz="4"/>
               <w:left w:val="single" w:color="D9D4C5" w:sz="4"/>
@@ -6825,8 +7036,8 @@
               <w:rPr>
                 <w:rFonts w:ascii="Arial" w:cs="Arial" w:eastAsia="Arial" w:hAnsi="Arial"/>
                 <w:color w:val="1B2118"/>
-                <w:sz w:val="19"/>
-                <w:szCs w:val="19"/>
+                <w:sz w:val="18"/>
+                <w:szCs w:val="18"/>
               </w:rPr>
               <w:t xml:space="preserve">3_Classi_domestiche</w:t>
             </w:r>
@@ -6834,7 +7045,7 @@
         </w:tc>
         <w:tc>
           <w:tcPr>
-            <w:tcW w:type="dxa" w:w="5097"/>
+            <w:tcW w:type="dxa" w:w="4294"/>
             <w:tcBorders>
               <w:top w:val="single" w:color="D9D4C5" w:sz="4"/>
               <w:left w:val="single" w:color="D9D4C5" w:sz="4"/>
@@ -6857,8 +7068,8 @@
               <w:rPr>
                 <w:rFonts w:ascii="Arial" w:cs="Arial" w:eastAsia="Arial" w:hAnsi="Arial"/>
                 <w:color w:val="1B2118"/>
-                <w:sz w:val="19"/>
-                <w:szCs w:val="19"/>
+                <w:sz w:val="18"/>
+                <w:szCs w:val="18"/>
               </w:rPr>
               <w:t xml:space="preserve">Classi, numero di utenze, coefficiente Kb</w:t>
             </w:r>
@@ -6866,7 +7077,7 @@
         </w:tc>
         <w:tc>
           <w:tcPr>
-            <w:tcW w:type="dxa" w:w="2410"/>
+            <w:tcW w:type="dxa" w:w="2209"/>
             <w:tcBorders>
               <w:top w:val="single" w:color="D9D4C5" w:sz="4"/>
               <w:left w:val="single" w:color="D9D4C5" w:sz="4"/>
@@ -6889,8 +7100,8 @@
               <w:rPr>
                 <w:rFonts w:ascii="Arial" w:cs="Arial" w:eastAsia="Arial" w:hAnsi="Arial"/>
                 <w:color w:val="1B2118"/>
-                <w:sz w:val="19"/>
-                <w:szCs w:val="19"/>
+                <w:sz w:val="18"/>
+                <w:szCs w:val="18"/>
               </w:rPr>
               <w:t xml:space="preserve">Comune (delibera TARI)</w:t>
             </w:r>
@@ -6903,7 +7114,7 @@
         </w:trPr>
         <w:tc>
           <w:tcPr>
-            <w:tcW w:type="dxa" w:w="2131"/>
+            <w:tcW w:type="dxa" w:w="3135"/>
             <w:tcBorders>
               <w:top w:val="single" w:color="D9D4C5" w:sz="4"/>
               <w:left w:val="single" w:color="D9D4C5" w:sz="4"/>
@@ -6927,8 +7138,8 @@
               <w:rPr>
                 <w:rFonts w:ascii="Arial" w:cs="Arial" w:eastAsia="Arial" w:hAnsi="Arial"/>
                 <w:color w:val="1B2118"/>
-                <w:sz w:val="19"/>
-                <w:szCs w:val="19"/>
+                <w:sz w:val="18"/>
+                <w:szCs w:val="18"/>
               </w:rPr>
               <w:t xml:space="preserve">4_Classi_non_domestiche</w:t>
             </w:r>
@@ -6936,7 +7147,7 @@
         </w:tc>
         <w:tc>
           <w:tcPr>
-            <w:tcW w:type="dxa" w:w="5097"/>
+            <w:tcW w:type="dxa" w:w="4294"/>
             <w:tcBorders>
               <w:top w:val="single" w:color="D9D4C5" w:sz="4"/>
               <w:left w:val="single" w:color="D9D4C5" w:sz="4"/>
@@ -6960,8 +7171,8 @@
               <w:rPr>
                 <w:rFonts w:ascii="Arial" w:cs="Arial" w:eastAsia="Arial" w:hAnsi="Arial"/>
                 <w:color w:val="1B2118"/>
-                <w:sz w:val="19"/>
-                <w:szCs w:val="19"/>
+                <w:sz w:val="18"/>
+                <w:szCs w:val="18"/>
               </w:rPr>
               <w:t xml:space="preserve">Categorie, numero, superficie, coefficiente Kd</w:t>
             </w:r>
@@ -6969,7 +7180,7 @@
         </w:tc>
         <w:tc>
           <w:tcPr>
-            <w:tcW w:type="dxa" w:w="2410"/>
+            <w:tcW w:type="dxa" w:w="2209"/>
             <w:tcBorders>
               <w:top w:val="single" w:color="D9D4C5" w:sz="4"/>
               <w:left w:val="single" w:color="D9D4C5" w:sz="4"/>
@@ -6993,8 +7204,8 @@
               <w:rPr>
                 <w:rFonts w:ascii="Arial" w:cs="Arial" w:eastAsia="Arial" w:hAnsi="Arial"/>
                 <w:color w:val="1B2118"/>
-                <w:sz w:val="19"/>
-                <w:szCs w:val="19"/>
+                <w:sz w:val="18"/>
+                <w:szCs w:val="18"/>
               </w:rPr>
               <w:t xml:space="preserve">Comune (delibera TARI)</w:t>
             </w:r>
@@ -7007,7 +7218,7 @@
         </w:trPr>
         <w:tc>
           <w:tcPr>
-            <w:tcW w:type="dxa" w:w="2131"/>
+            <w:tcW w:type="dxa" w:w="3135"/>
             <w:tcBorders>
               <w:top w:val="single" w:color="D9D4C5" w:sz="4"/>
               <w:left w:val="single" w:color="D9D4C5" w:sz="4"/>
@@ -7030,8 +7241,8 @@
               <w:rPr>
                 <w:rFonts w:ascii="Arial" w:cs="Arial" w:eastAsia="Arial" w:hAnsi="Arial"/>
                 <w:color w:val="1B2118"/>
-                <w:sz w:val="19"/>
-                <w:szCs w:val="19"/>
+                <w:sz w:val="18"/>
+                <w:szCs w:val="18"/>
               </w:rPr>
               <w:t xml:space="preserve">5_Conferimenti</w:t>
             </w:r>
@@ -7039,7 +7250,7 @@
         </w:tc>
         <w:tc>
           <w:tcPr>
-            <w:tcW w:type="dxa" w:w="5097"/>
+            <w:tcW w:type="dxa" w:w="4294"/>
             <w:tcBorders>
               <w:top w:val="single" w:color="D9D4C5" w:sz="4"/>
               <w:left w:val="single" w:color="D9D4C5" w:sz="4"/>
@@ -7062,8 +7273,8 @@
               <w:rPr>
                 <w:rFonts w:ascii="Arial" w:cs="Arial" w:eastAsia="Arial" w:hAnsi="Arial"/>
                 <w:color w:val="1B2118"/>
-                <w:sz w:val="19"/>
-                <w:szCs w:val="19"/>
+                <w:sz w:val="18"/>
+                <w:szCs w:val="18"/>
               </w:rPr>
               <w:t xml:space="preserve">Totali annui per utenza e tipo di rifiuto</w:t>
             </w:r>
@@ -7071,7 +7282,7 @@
         </w:tc>
         <w:tc>
           <w:tcPr>
-            <w:tcW w:type="dxa" w:w="2410"/>
+            <w:tcW w:type="dxa" w:w="2209"/>
             <w:tcBorders>
               <w:top w:val="single" w:color="D9D4C5" w:sz="4"/>
               <w:left w:val="single" w:color="D9D4C5" w:sz="4"/>
@@ -7094,8 +7305,8 @@
               <w:rPr>
                 <w:rFonts w:ascii="Arial" w:cs="Arial" w:eastAsia="Arial" w:hAnsi="Arial"/>
                 <w:color w:val="1B2118"/>
-                <w:sz w:val="19"/>
-                <w:szCs w:val="19"/>
+                <w:sz w:val="18"/>
+                <w:szCs w:val="18"/>
               </w:rPr>
               <w:t xml:space="preserve">Gestore</w:t>
             </w:r>
@@ -7108,7 +7319,7 @@
         </w:trPr>
         <w:tc>
           <w:tcPr>
-            <w:tcW w:type="dxa" w:w="2131"/>
+            <w:tcW w:type="dxa" w:w="3135"/>
             <w:tcBorders>
               <w:top w:val="single" w:color="D9D4C5" w:sz="4"/>
               <w:left w:val="single" w:color="D9D4C5" w:sz="4"/>
@@ -7132,8 +7343,8 @@
               <w:rPr>
                 <w:rFonts w:ascii="Arial" w:cs="Arial" w:eastAsia="Arial" w:hAnsi="Arial"/>
                 <w:color w:val="1B2118"/>
-                <w:sz w:val="19"/>
-                <w:szCs w:val="19"/>
+                <w:sz w:val="18"/>
+                <w:szCs w:val="18"/>
               </w:rPr>
               <w:t xml:space="preserve">6_Letture</w:t>
             </w:r>
@@ -7141,7 +7352,7 @@
         </w:tc>
         <w:tc>
           <w:tcPr>
-            <w:tcW w:type="dxa" w:w="5097"/>
+            <w:tcW w:type="dxa" w:w="4294"/>
             <w:tcBorders>
               <w:top w:val="single" w:color="D9D4C5" w:sz="4"/>
               <w:left w:val="single" w:color="D9D4C5" w:sz="4"/>
@@ -7165,8 +7376,8 @@
               <w:rPr>
                 <w:rFonts w:ascii="Arial" w:cs="Arial" w:eastAsia="Arial" w:hAnsi="Arial"/>
                 <w:color w:val="1B2118"/>
-                <w:sz w:val="19"/>
-                <w:szCs w:val="19"/>
+                <w:sz w:val="18"/>
+                <w:szCs w:val="18"/>
               </w:rPr>
               <w:t xml:space="preserve">In alternativa al 5: le singole letture</w:t>
             </w:r>
@@ -7174,7 +7385,7 @@
         </w:tc>
         <w:tc>
           <w:tcPr>
-            <w:tcW w:type="dxa" w:w="2410"/>
+            <w:tcW w:type="dxa" w:w="2209"/>
             <w:tcBorders>
               <w:top w:val="single" w:color="D9D4C5" w:sz="4"/>
               <w:left w:val="single" w:color="D9D4C5" w:sz="4"/>
@@ -7198,8 +7409,8 @@
               <w:rPr>
                 <w:rFonts w:ascii="Arial" w:cs="Arial" w:eastAsia="Arial" w:hAnsi="Arial"/>
                 <w:color w:val="1B2118"/>
-                <w:sz w:val="19"/>
-                <w:szCs w:val="19"/>
+                <w:sz w:val="18"/>
+                <w:szCs w:val="18"/>
               </w:rPr>
               <w:t xml:space="preserve">Gestore</w:t>
             </w:r>
@@ -7212,7 +7423,7 @@
         </w:trPr>
         <w:tc>
           <w:tcPr>
-            <w:tcW w:type="dxa" w:w="2131"/>
+            <w:tcW w:type="dxa" w:w="3135"/>
             <w:tcBorders>
               <w:top w:val="single" w:color="D9D4C5" w:sz="4"/>
               <w:left w:val="single" w:color="D9D4C5" w:sz="4"/>
@@ -7235,8 +7446,8 @@
               <w:rPr>
                 <w:rFonts w:ascii="Arial" w:cs="Arial" w:eastAsia="Arial" w:hAnsi="Arial"/>
                 <w:color w:val="1B2118"/>
-                <w:sz w:val="19"/>
-                <w:szCs w:val="19"/>
+                <w:sz w:val="18"/>
+                <w:szCs w:val="18"/>
               </w:rPr>
               <w:t xml:space="preserve">7_Riuso</w:t>
             </w:r>
@@ -7244,7 +7455,7 @@
         </w:tc>
         <w:tc>
           <w:tcPr>
-            <w:tcW w:type="dxa" w:w="5097"/>
+            <w:tcW w:type="dxa" w:w="4294"/>
             <w:tcBorders>
               <w:top w:val="single" w:color="D9D4C5" w:sz="4"/>
               <w:left w:val="single" w:color="D9D4C5" w:sz="4"/>
@@ -7267,8 +7478,8 @@
               <w:rPr>
                 <w:rFonts w:ascii="Arial" w:cs="Arial" w:eastAsia="Arial" w:hAnsi="Arial"/>
                 <w:color w:val="1B2118"/>
-                <w:sz w:val="19"/>
-                <w:szCs w:val="19"/>
+                <w:sz w:val="18"/>
+                <w:szCs w:val="18"/>
               </w:rPr>
               <w:t xml:space="preserve">Beni portati al centro del riuso</w:t>
             </w:r>
@@ -7276,7 +7487,7 @@
         </w:tc>
         <w:tc>
           <w:tcPr>
-            <w:tcW w:type="dxa" w:w="2410"/>
+            <w:tcW w:type="dxa" w:w="2209"/>
             <w:tcBorders>
               <w:top w:val="single" w:color="D9D4C5" w:sz="4"/>
               <w:left w:val="single" w:color="D9D4C5" w:sz="4"/>
@@ -7299,8 +7510,8 @@
               <w:rPr>
                 <w:rFonts w:ascii="Arial" w:cs="Arial" w:eastAsia="Arial" w:hAnsi="Arial"/>
                 <w:color w:val="1B2118"/>
-                <w:sz w:val="19"/>
-                <w:szCs w:val="19"/>
+                <w:sz w:val="18"/>
+                <w:szCs w:val="18"/>
               </w:rPr>
               <w:t xml:space="preserve">Gestore o centro del riuso</w:t>
             </w:r>
@@ -7814,7 +8025,7 @@
         <w:szCs w:val="16"/>
       </w:rPr>
       <w:tab/>
-      <w:t xml:space="preserve">Manuale Utente · Rev. 1.0 · 18/10/2026</w:t>
+      <w:t xml:space="preserve">Manuale Utente · Rev. 1.1 · 18/10/2026</w:t>
     </w:r>
   </w:p>
 </w:hdr>
@@ -7879,7 +8090,7 @@
         <w:szCs w:val="16"/>
       </w:rPr>
       <w:tab/>
-      <w:t xml:space="preserve">Manuale Utente · Rev. 1.0 · 18/10/2026</w:t>
+      <w:t xml:space="preserve">Manuale Utente · Rev. 1.1 · 18/10/2026</w:t>
     </w:r>
   </w:p>
 </w:hdr>
@@ -8261,5 +8472,22 @@
       <w:szCs w:val="34"/>
     </w:rPr>
   </w:style>
+  <w:style w:type="paragraph" w:styleId="Heading2">
+    <w:name w:val="Heading 2"/>
+    <w:basedOn w:val="Normal"/>
+    <w:next w:val="Normal"/>
+    <w:qFormat/>
+    <w:pPr>
+      <w:outlineLvl w:val="1"/>
+    </w:pPr>
+    <w:rPr>
+      <w:rFonts w:ascii="Arial" w:cs="Arial" w:eastAsia="Arial" w:hAnsi="Arial"/>
+      <w:b/>
+      <w:bCs/>
+      <w:color w:val="2F5D3A"/>
+      <w:sz w:val="25"/>
+      <w:szCs w:val="25"/>
+    </w:rPr>
+  </w:style>
 </w:styles>
 </file>
</xml_diff>

<commit_message>
Manuale Utente anche nella pagina I tuoi documenti (Rev 1.5)
Co-Authored-By: Claude Opus 5.5 <noreply@anthropic.com>
Claude-Session: https://claude.ai/code/session_01E8XCbEeVHWVP3hntUZ6kZ1
</commit_message>
<xml_diff>
--- a/public/manuali/Manuale_Utente_Portale_CWP.docx
+++ b/public/manuali/Manuale_Utente_Portale_CWP.docx
@@ -302,7 +302,7 @@
                 <w:sz w:val="20"/>
                 <w:szCs w:val="20"/>
               </w:rPr>
-              <w:t xml:space="preserve">Rev. 1.4</w:t>
+              <w:t xml:space="preserve">Rev. 1.5</w:t>
             </w:r>
           </w:p>
         </w:tc>
@@ -719,7 +719,7 @@
                 <w:sz w:val="18"/>
                 <w:szCs w:val="18"/>
               </w:rPr>
-              <w:t xml:space="preserve">1.4</w:t>
+              <w:t xml:space="preserve">1.5</w:t>
             </w:r>
           </w:p>
         </w:tc>
@@ -783,7 +783,7 @@
                 <w:sz w:val="18"/>
                 <w:szCs w:val="18"/>
               </w:rPr>
-              <w:t xml:space="preserve">Recupero della password: nuova email in italiano dal portale (oggetto e pulsante), limite di una richiesta ogni 2 minuti.</w:t>
+              <w:t xml:space="preserve">Manuale scaricabile anche dalla pagina «I tuoi documenti».</w:t>
             </w:r>
           </w:p>
         </w:tc>
@@ -853,7 +853,7 @@
                 <w:sz w:val="18"/>
                 <w:szCs w:val="18"/>
               </w:rPr>
-              <w:t xml:space="preserve">1.3</w:t>
+              <w:t xml:space="preserve">1.4</w:t>
             </w:r>
           </w:p>
         </w:tc>
@@ -919,7 +919,7 @@
                 <w:sz w:val="18"/>
                 <w:szCs w:val="18"/>
               </w:rPr>
-              <w:t xml:space="preserve">Pagina «Il mio profilo» (account, cambio password, manuale da scaricare).</w:t>
+              <w:t xml:space="preserve">Recupero della password: nuova email in italiano dal portale (oggetto e pulsante), limite di una richiesta ogni 2 minuti.</w:t>
             </w:r>
           </w:p>
         </w:tc>
@@ -989,7 +989,7 @@
                 <w:sz w:val="18"/>
                 <w:szCs w:val="18"/>
               </w:rPr>
-              <w:t xml:space="preserve">1.2</w:t>
+              <w:t xml:space="preserve">1.3</w:t>
             </w:r>
           </w:p>
         </w:tc>
@@ -1053,7 +1053,7 @@
                 <w:sz w:val="18"/>
                 <w:szCs w:val="18"/>
               </w:rPr>
-              <w:t xml:space="preserve">Scelta della password al primo accesso, cambio password, recupero della password dimenticata; ritorno alla pratica dopo l'accesso da un link email.</w:t>
+              <w:t xml:space="preserve">Pagina «Il mio profilo» (account, cambio password, manuale da scaricare).</w:t>
             </w:r>
           </w:p>
         </w:tc>
@@ -1123,7 +1123,7 @@
                 <w:sz w:val="18"/>
                 <w:szCs w:val="18"/>
               </w:rPr>
-              <w:t xml:space="preserve">1.1</w:t>
+              <w:t xml:space="preserve">1.2</w:t>
             </w:r>
           </w:p>
         </w:tc>
@@ -1189,7 +1189,7 @@
                 <w:sz w:val="18"/>
                 <w:szCs w:val="18"/>
               </w:rPr>
-              <w:t xml:space="preserve">Voce di menu «Manuale» e pagina di download del manuale (capitolo 2).</w:t>
+              <w:t xml:space="preserve">Scelta della password al primo accesso, cambio password, recupero della password dimenticata; ritorno alla pratica dopo l'accesso da un link email.</w:t>
             </w:r>
           </w:p>
         </w:tc>
@@ -1259,6 +1259,140 @@
                 <w:sz w:val="18"/>
                 <w:szCs w:val="18"/>
               </w:rPr>
+              <w:t xml:space="preserve">1.1</w:t>
+            </w:r>
+          </w:p>
+        </w:tc>
+        <w:tc>
+          <w:tcPr>
+            <w:tcW w:type="dxa" w:w="1300"/>
+            <w:tcBorders>
+              <w:top w:val="single" w:color="D9D4C5" w:sz="4"/>
+              <w:left w:val="single" w:color="D9D4C5" w:sz="4"/>
+              <w:bottom w:val="single" w:color="D9D4C5" w:sz="4"/>
+              <w:right w:val="single" w:color="D9D4C5" w:sz="4"/>
+            </w:tcBorders>
+            <w:tcMar>
+              <w:top w:type="dxa" w:w="70"/>
+              <w:left w:type="dxa" w:w="110"/>
+              <w:bottom w:type="dxa" w:w="70"/>
+              <w:right w:type="dxa" w:w="110"/>
+            </w:tcMar>
+            <w:vAlign w:val="center"/>
+          </w:tcPr>
+          <w:p>
+            <w:pPr>
+              <w:spacing w:after="0" w:before="0"/>
+            </w:pPr>
+            <w:r>
+              <w:rPr>
+                <w:rFonts w:ascii="Arial" w:cs="Arial" w:eastAsia="Arial" w:hAnsi="Arial"/>
+                <w:color w:val="1B2118"/>
+                <w:sz w:val="18"/>
+                <w:szCs w:val="18"/>
+              </w:rPr>
+              <w:t xml:space="preserve">18/10/2026</w:t>
+            </w:r>
+          </w:p>
+        </w:tc>
+        <w:tc>
+          <w:tcPr>
+            <w:tcW w:type="dxa" w:w="5538"/>
+            <w:tcBorders>
+              <w:top w:val="single" w:color="D9D4C5" w:sz="4"/>
+              <w:left w:val="single" w:color="D9D4C5" w:sz="4"/>
+              <w:bottom w:val="single" w:color="D9D4C5" w:sz="4"/>
+              <w:right w:val="single" w:color="D9D4C5" w:sz="4"/>
+            </w:tcBorders>
+            <w:tcMar>
+              <w:top w:type="dxa" w:w="70"/>
+              <w:left w:type="dxa" w:w="110"/>
+              <w:bottom w:type="dxa" w:w="70"/>
+              <w:right w:type="dxa" w:w="110"/>
+            </w:tcMar>
+            <w:vAlign w:val="center"/>
+          </w:tcPr>
+          <w:p>
+            <w:pPr>
+              <w:spacing w:after="0" w:before="0"/>
+            </w:pPr>
+            <w:r>
+              <w:rPr>
+                <w:rFonts w:ascii="Arial" w:cs="Arial" w:eastAsia="Arial" w:hAnsi="Arial"/>
+                <w:color w:val="1B2118"/>
+                <w:sz w:val="18"/>
+                <w:szCs w:val="18"/>
+              </w:rPr>
+              <w:t xml:space="preserve">Voce di menu «Manuale» e pagina di download del manuale (capitolo 2).</w:t>
+            </w:r>
+          </w:p>
+        </w:tc>
+        <w:tc>
+          <w:tcPr>
+            <w:tcW w:type="dxa" w:w="2000"/>
+            <w:tcBorders>
+              <w:top w:val="single" w:color="D9D4C5" w:sz="4"/>
+              <w:left w:val="single" w:color="D9D4C5" w:sz="4"/>
+              <w:bottom w:val="single" w:color="D9D4C5" w:sz="4"/>
+              <w:right w:val="single" w:color="D9D4C5" w:sz="4"/>
+            </w:tcBorders>
+            <w:tcMar>
+              <w:top w:type="dxa" w:w="70"/>
+              <w:left w:type="dxa" w:w="110"/>
+              <w:bottom w:type="dxa" w:w="70"/>
+              <w:right w:type="dxa" w:w="110"/>
+            </w:tcMar>
+            <w:vAlign w:val="center"/>
+          </w:tcPr>
+          <w:p>
+            <w:pPr>
+              <w:spacing w:after="0" w:before="0"/>
+            </w:pPr>
+            <w:r>
+              <w:rPr>
+                <w:rFonts w:ascii="Arial" w:cs="Arial" w:eastAsia="Arial" w:hAnsi="Arial"/>
+                <w:color w:val="1B2118"/>
+                <w:sz w:val="18"/>
+                <w:szCs w:val="18"/>
+              </w:rPr>
+              <w:t xml:space="preserve">Fondazione Operate</w:t>
+            </w:r>
+          </w:p>
+        </w:tc>
+      </w:tr>
+      <w:tr>
+        <w:trPr>
+          <w:cantSplit/>
+        </w:trPr>
+        <w:tc>
+          <w:tcPr>
+            <w:tcW w:type="dxa" w:w="800"/>
+            <w:tcBorders>
+              <w:top w:val="single" w:color="D9D4C5" w:sz="4"/>
+              <w:left w:val="single" w:color="D9D4C5" w:sz="4"/>
+              <w:bottom w:val="single" w:color="D9D4C5" w:sz="4"/>
+              <w:right w:val="single" w:color="D9D4C5" w:sz="4"/>
+            </w:tcBorders>
+            <w:shd w:fill="F6F4EE" w:color="auto" w:val="clear"/>
+            <w:tcMar>
+              <w:top w:type="dxa" w:w="70"/>
+              <w:left w:type="dxa" w:w="110"/>
+              <w:bottom w:type="dxa" w:w="70"/>
+              <w:right w:type="dxa" w:w="110"/>
+            </w:tcMar>
+            <w:vAlign w:val="center"/>
+          </w:tcPr>
+          <w:p>
+            <w:pPr>
+              <w:spacing w:after="0" w:before="0"/>
+            </w:pPr>
+            <w:r>
+              <w:rPr>
+                <w:rFonts w:ascii="Arial" w:cs="Arial" w:eastAsia="Arial" w:hAnsi="Arial"/>
+                <w:color w:val="1B2118"/>
+                <w:sz w:val="18"/>
+                <w:szCs w:val="18"/>
+              </w:rPr>
               <w:t xml:space="preserve">1.0</w:t>
             </w:r>
           </w:p>
@@ -1272,6 +1406,7 @@
               <w:bottom w:val="single" w:color="D9D4C5" w:sz="4"/>
               <w:right w:val="single" w:color="D9D4C5" w:sz="4"/>
             </w:tcBorders>
+            <w:shd w:fill="F6F4EE" w:color="auto" w:val="clear"/>
             <w:tcMar>
               <w:top w:type="dxa" w:w="70"/>
               <w:left w:type="dxa" w:w="110"/>
@@ -1304,6 +1439,7 @@
               <w:bottom w:val="single" w:color="D9D4C5" w:sz="4"/>
               <w:right w:val="single" w:color="D9D4C5" w:sz="4"/>
             </w:tcBorders>
+            <w:shd w:fill="F6F4EE" w:color="auto" w:val="clear"/>
             <w:tcMar>
               <w:top w:type="dxa" w:w="70"/>
               <w:left w:type="dxa" w:w="110"/>
@@ -1336,6 +1472,7 @@
               <w:bottom w:val="single" w:color="D9D4C5" w:sz="4"/>
               <w:right w:val="single" w:color="D9D4C5" w:sz="4"/>
             </w:tcBorders>
+            <w:shd w:fill="F6F4EE" w:color="auto" w:val="clear"/>
             <w:tcMar>
               <w:top w:type="dxa" w:w="70"/>
               <w:left w:type="dxa" w:w="110"/>
@@ -1377,7 +1514,7 @@
           <w:sz w:val="20"/>
           <w:szCs w:val="20"/>
         </w:rPr>
-        <w:t xml:space="preserve">Questo documento descrive il portale alla revisione 1.4 del 18/10/2026. A ogni modifica del portale il manuale viene aggiornato e la revisione incrementata; la versione corrente si scarica dal portale.</w:t>
+        <w:t xml:space="preserve">Questo documento descrive il portale alla revisione 1.5 del 18/10/2026. A ogni modifica del portale il manuale viene aggiornato e la revisione incrementata; la versione corrente si scarica dal portale.</w:t>
       </w:r>
     </w:p>
     <w:p>
@@ -1953,7 +2090,7 @@
         </w:rPr>
         <w:t xml:space="preserve"> un computer o tablet con un browser aggiornato (Chrome, Edge, Firefox, Safari) e le credenziali fornite dalla Fondazione. Indirizzo del portale: </w:t>
       </w:r>
-      <w:hyperlink w:history="1" r:id="rId--ucekyqlq8hl928of6ch">
+      <w:hyperlink w:history="1" r:id="rIdd0_4yhkb5zvehvqr3mdy3">
         <w:r>
           <w:rPr>
             <w:rFonts w:ascii="Arial" w:cs="Arial" w:eastAsia="Arial" w:hAnsi="Arial"/>
@@ -2075,7 +2212,7 @@
         </w:rPr>
         <w:t xml:space="preserve">Aprite </w:t>
       </w:r>
-      <w:hyperlink w:history="1" r:id="rIdglridwkegdxfmholoiwpc">
+      <w:hyperlink w:history="1" r:id="rIdy--gkhkuf5y31ravbwutq">
         <w:r>
           <w:rPr>
             <w:rFonts w:ascii="Arial" w:cs="Arial" w:eastAsia="Arial" w:hAnsi="Arial"/>
@@ -2858,7 +2995,27 @@
           <w:sz w:val="21"/>
           <w:szCs w:val="21"/>
         </w:rPr>
-        <w:t xml:space="preserve"> del menu, e anche la pagina </w:t>
+        <w:t xml:space="preserve"> del menu, la pagina </w:t>
+      </w:r>
+      <w:r>
+        <w:rPr>
+          <w:rFonts w:ascii="Arial" w:cs="Arial" w:eastAsia="Arial" w:hAnsi="Arial"/>
+          <w:b/>
+          <w:bCs/>
+          <w:color w:val="1B2118"/>
+          <w:sz w:val="21"/>
+          <w:szCs w:val="21"/>
+        </w:rPr>
+        <w:t xml:space="preserve">I tuoi documenti</w:t>
+      </w:r>
+      <w:r>
+        <w:rPr>
+          <w:rFonts w:ascii="Arial" w:cs="Arial" w:eastAsia="Arial" w:hAnsi="Arial"/>
+          <w:color w:val="1B2118"/>
+          <w:sz w:val="21"/>
+          <w:szCs w:val="21"/>
+        </w:rPr>
+        <w:t xml:space="preserve"> e la pagina </w:t>
       </w:r>
       <w:r>
         <w:rPr>
@@ -2878,7 +3035,7 @@
           <w:sz w:val="21"/>
           <w:szCs w:val="21"/>
         </w:rPr>
-        <w:t xml:space="preserve">, permettono di scaricare questo manuale in PDF o in Word, sempre nella revisione più recente.</w:t>
+        <w:t xml:space="preserve"> permettono di scaricare questo manuale in PDF o in Word, sempre nella revisione più recente.</w:t>
       </w:r>
     </w:p>
     <w:p>
@@ -6321,6 +6478,40 @@
           <w:sz w:val="21"/>
           <w:szCs w:val="21"/>
         </w:rPr>
+        <w:t xml:space="preserve">In fondo alla pagina, nel riquadro </w:t>
+      </w:r>
+      <w:r>
+        <w:rPr>
+          <w:rFonts w:ascii="Arial" w:cs="Arial" w:eastAsia="Arial" w:hAnsi="Arial"/>
+          <w:b/>
+          <w:bCs/>
+          <w:color w:val="1B2118"/>
+          <w:sz w:val="21"/>
+          <w:szCs w:val="21"/>
+        </w:rPr>
+        <w:t xml:space="preserve">Manuale del portale</w:t>
+      </w:r>
+      <w:r>
+        <w:rPr>
+          <w:rFonts w:ascii="Arial" w:cs="Arial" w:eastAsia="Arial" w:hAnsi="Arial"/>
+          <w:color w:val="1B2118"/>
+          <w:sz w:val="21"/>
+          <w:szCs w:val="21"/>
+        </w:rPr>
+        <w:t xml:space="preserve">, scaricate questo manuale in PDF o in Word.</w:t>
+      </w:r>
+    </w:p>
+    <w:p>
+      <w:pPr>
+        <w:spacing w:after="140" w:line="300"/>
+      </w:pPr>
+      <w:r>
+        <w:rPr>
+          <w:rFonts w:ascii="Arial" w:cs="Arial" w:eastAsia="Arial" w:hAnsi="Arial"/>
+          <w:color w:val="1B2118"/>
+          <w:sz w:val="21"/>
+          <w:szCs w:val="21"/>
+        </w:rPr>
         <w:t xml:space="preserve">Da questa pagina non si caricano documenti: per caricare usate la pratica (capitolo 5).</w:t>
       </w:r>
     </w:p>
@@ -7236,7 +7427,7 @@
         </w:rPr>
         <w:t xml:space="preserve">, uguale per tutti gli enti. Il modello si scarica dalla pagina pubblica </w:t>
       </w:r>
-      <w:hyperlink w:history="1" r:id="rIdq1vn-dhja5mp-b0qc92ka">
+      <w:hyperlink w:history="1" r:id="rIdvobadyukrh38vvhxyv3mf">
         <w:r>
           <w:rPr>
             <w:rFonts w:ascii="Arial" w:cs="Arial" w:eastAsia="Arial" w:hAnsi="Arial"/>
@@ -8908,7 +9099,7 @@
         <w:szCs w:val="16"/>
       </w:rPr>
       <w:tab/>
-      <w:t xml:space="preserve">Manuale Utente · Rev. 1.4 · 18/10/2026</w:t>
+      <w:t xml:space="preserve">Manuale Utente · Rev. 1.5 · 18/10/2026</w:t>
     </w:r>
   </w:p>
 </w:hdr>
@@ -8973,7 +9164,7 @@
         <w:szCs w:val="16"/>
       </w:rPr>
       <w:tab/>
-      <w:t xml:space="preserve">Manuale Utente · Rev. 1.4 · 18/10/2026</w:t>
+      <w:t xml:space="preserve">Manuale Utente · Rev. 1.5 · 18/10/2026</w:t>
     </w:r>
   </w:p>
 </w:hdr>

</xml_diff>

<commit_message>
Manuale utente Rev. 4.5: schermate del portale (vista Comune e pagine pubbliche)
- 18 schermate in public/manuali/immagini, inserite nei capitoli principali
- genera_documenti.cjs e impagina_pdf.py: supporto alle figure con didascalia
- genera_base_conoscenza.cjs: le righe-figura non entrano nella base dell'assistente

Co-Authored-By: Claude Opus 5.5 <noreply@anthropic.com>
Claude-Session: https://claude.ai/code/session_018oNizm52jujYZq1d3R331o
</commit_message>
<xml_diff>
--- a/public/manuali/Manuale_Utente_Portale_CWP.docx
+++ b/public/manuali/Manuale_Utente_Portale_CWP.docx
@@ -12,7 +12,7 @@
           <wp:inline distT="0" distB="0" distL="0" distR="0">
             <wp:extent cx="2857500" cy="1771650"/>
             <wp:effectExtent t="0" r="0" b="0" l="0"/>
-            <wp:docPr id="1" name="" descr="" title=""/>
+            <wp:docPr id="23" name="" descr="" title=""/>
             <wp:cNvGraphicFramePr>
               <a:graphicFrameLocks xmlns:a="http://schemas.openxmlformats.org/drawingml/2006/main" noChangeAspect="1"/>
             </wp:cNvGraphicFramePr>
@@ -302,7 +302,7 @@
                 <w:sz w:val="20"/>
                 <w:szCs w:val="20"/>
               </w:rPr>
-              <w:t xml:space="preserve">Rev. 4.4</w:t>
+              <w:t xml:space="preserve">Rev. 4.5</w:t>
             </w:r>
           </w:p>
         </w:tc>
@@ -365,7 +365,7 @@
                 <w:sz w:val="20"/>
                 <w:szCs w:val="20"/>
               </w:rPr>
-              <w:t xml:space="preserve">23/10/2026</w:t>
+              <w:t xml:space="preserve">25/10/2026</w:t>
             </w:r>
           </w:p>
         </w:tc>
@@ -458,7 +458,7 @@
           <wp:inline distT="0" distB="0" distL="0" distR="0">
             <wp:extent cx="1905000" cy="685800"/>
             <wp:effectExtent t="0" r="0" b="0" l="0"/>
-            <wp:docPr id="1" name="" descr="" title=""/>
+            <wp:docPr id="24" name="" descr="" title=""/>
             <wp:cNvGraphicFramePr>
               <a:graphicFrameLocks xmlns:a="http://schemas.openxmlformats.org/drawingml/2006/main" noChangeAspect="1"/>
             </wp:cNvGraphicFramePr>
@@ -719,7 +719,7 @@
                 <w:sz w:val="18"/>
                 <w:szCs w:val="18"/>
               </w:rPr>
-              <w:t xml:space="preserve">4.4</w:t>
+              <w:t xml:space="preserve">4.5</w:t>
             </w:r>
           </w:p>
         </w:tc>
@@ -751,7 +751,7 @@
                 <w:sz w:val="18"/>
                 <w:szCs w:val="18"/>
               </w:rPr>
-              <w:t xml:space="preserve">23/10/2026</w:t>
+              <w:t xml:space="preserve">25/10/2026</w:t>
             </w:r>
           </w:p>
         </w:tc>
@@ -783,7 +783,7 @@
                 <w:sz w:val="18"/>
                 <w:szCs w:val="18"/>
               </w:rPr>
-              <w:t xml:space="preserve">Colori dello stato delle fasi (verde, arancio, rosso).</w:t>
+              <w:t xml:space="preserve">Aggiunte le schermate del portale (vista Comune e pagine pubbliche) nei capitoli principali.</w:t>
             </w:r>
           </w:p>
         </w:tc>
@@ -853,7 +853,7 @@
                 <w:sz w:val="18"/>
                 <w:szCs w:val="18"/>
               </w:rPr>
-              <w:t xml:space="preserve">4.3</w:t>
+              <w:t xml:space="preserve">4.4</w:t>
             </w:r>
           </w:p>
         </w:tc>
@@ -919,7 +919,7 @@
                 <w:sz w:val="18"/>
                 <w:szCs w:val="18"/>
               </w:rPr>
-              <w:t xml:space="preserve">«Le mie pratiche»: valore del progetto (listino Caso 1 o Caso 2).</w:t>
+              <w:t xml:space="preserve">Colori dello stato delle fasi (verde, arancio, rosso).</w:t>
             </w:r>
           </w:p>
         </w:tc>
@@ -989,7 +989,7 @@
                 <w:sz w:val="18"/>
                 <w:szCs w:val="18"/>
               </w:rPr>
-              <w:t xml:space="preserve">4.2</w:t>
+              <w:t xml:space="preserve">4.3</w:t>
             </w:r>
           </w:p>
         </w:tc>
@@ -1053,7 +1053,7 @@
                 <w:sz w:val="18"/>
                 <w:szCs w:val="18"/>
               </w:rPr>
-              <w:t xml:space="preserve">Revisione generale al 23/10: Banca Dati Utenze per utenza non più «in arrivo».</w:t>
+              <w:t xml:space="preserve">«Le mie pratiche»: valore del progetto (listino Caso 1 o Caso 2).</w:t>
             </w:r>
           </w:p>
         </w:tc>
@@ -1123,7 +1123,7 @@
                 <w:sz w:val="18"/>
                 <w:szCs w:val="18"/>
               </w:rPr>
-              <w:t xml:space="preserve">4.1</w:t>
+              <w:t xml:space="preserve">4.2</w:t>
             </w:r>
           </w:p>
         </w:tc>
@@ -1189,7 +1189,7 @@
                 <w:sz w:val="18"/>
                 <w:szCs w:val="18"/>
               </w:rPr>
-              <w:t xml:space="preserve">«Le mie pratiche»: riquadri del valore dei crediti della propria organizzazione (simulazione e fase esecutiva, crediti ed euro).</w:t>
+              <w:t xml:space="preserve">Revisione generale al 23/10: Banca Dati Utenze per utenza non più «in arrivo».</w:t>
             </w:r>
           </w:p>
         </w:tc>
@@ -1259,7 +1259,7 @@
                 <w:sz w:val="18"/>
                 <w:szCs w:val="18"/>
               </w:rPr>
-              <w:t xml:space="preserve">4.0</w:t>
+              <w:t xml:space="preserve">4.1</w:t>
             </w:r>
           </w:p>
         </w:tc>
@@ -1323,7 +1323,7 @@
                 <w:sz w:val="18"/>
                 <w:szCs w:val="18"/>
               </w:rPr>
-              <w:t xml:space="preserve">Banca Dati Utenze per utenza: come la Fondazione usa categoria tariffaria e kg di ogni frazione (vuoto diverso da 0).</w:t>
+              <w:t xml:space="preserve">«Le mie pratiche»: riquadri del valore dei crediti della propria organizzazione (simulazione e fase esecutiva, crediti ed euro).</w:t>
             </w:r>
           </w:p>
         </w:tc>
@@ -1393,7 +1393,7 @@
                 <w:sz w:val="18"/>
                 <w:szCs w:val="18"/>
               </w:rPr>
-              <w:t xml:space="preserve">3.9</w:t>
+              <w:t xml:space="preserve">4.0</w:t>
             </w:r>
           </w:p>
         </w:tc>
@@ -1426,7 +1426,7 @@
                 <w:sz w:val="18"/>
                 <w:szCs w:val="18"/>
               </w:rPr>
-              <w:t xml:space="preserve">22/10/2026</w:t>
+              <w:t xml:space="preserve">23/10/2026</w:t>
             </w:r>
           </w:p>
         </w:tc>
@@ -1459,7 +1459,7 @@
                 <w:sz w:val="18"/>
                 <w:szCs w:val="18"/>
               </w:rPr>
-              <w:t xml:space="preserve">Banca Dati Utenze: categoria tariffaria e di simulazione.</w:t>
+              <w:t xml:space="preserve">Banca Dati Utenze per utenza: come la Fondazione usa categoria tariffaria e kg di ogni frazione (vuoto diverso da 0).</w:t>
             </w:r>
           </w:p>
         </w:tc>
@@ -1529,7 +1529,7 @@
                 <w:sz w:val="18"/>
                 <w:szCs w:val="18"/>
               </w:rPr>
-              <w:t xml:space="preserve">3.8</w:t>
+              <w:t xml:space="preserve">3.9</w:t>
             </w:r>
           </w:p>
         </w:tc>
@@ -1593,7 +1593,7 @@
                 <w:sz w:val="18"/>
                 <w:szCs w:val="18"/>
               </w:rPr>
-              <w:t xml:space="preserve">Banca Dati Utenze per utenza: spiegazione dei campi (nuovo formato in arrivo).</w:t>
+              <w:t xml:space="preserve">Banca Dati Utenze: categoria tariffaria e di simulazione.</w:t>
             </w:r>
           </w:p>
         </w:tc>
@@ -1663,7 +1663,7 @@
                 <w:sz w:val="18"/>
                 <w:szCs w:val="18"/>
               </w:rPr>
-              <w:t xml:space="preserve">3.7</w:t>
+              <w:t xml:space="preserve">3.8</w:t>
             </w:r>
           </w:p>
         </w:tc>
@@ -1729,7 +1729,7 @@
                 <w:sz w:val="18"/>
                 <w:szCs w:val="18"/>
               </w:rPr>
-              <w:t xml:space="preserve">Uso dal telefono: menu, elenco e dettaglio delle pratiche.</w:t>
+              <w:t xml:space="preserve">Banca Dati Utenze per utenza: spiegazione dei campi (nuovo formato in arrivo).</w:t>
             </w:r>
           </w:p>
         </w:tc>
@@ -1799,7 +1799,7 @@
                 <w:sz w:val="18"/>
                 <w:szCs w:val="18"/>
               </w:rPr>
-              <w:t xml:space="preserve">3.6</w:t>
+              <w:t xml:space="preserve">3.7</w:t>
             </w:r>
           </w:p>
         </w:tc>
@@ -1863,7 +1863,7 @@
                 <w:sz w:val="18"/>
                 <w:szCs w:val="18"/>
               </w:rPr>
-              <w:t xml:space="preserve">Feedback pubblico chiuso solo dopo il termine; ente prima della fase 5 (rilievi N02, N03).</w:t>
+              <w:t xml:space="preserve">Uso dal telefono: menu, elenco e dettaglio delle pratiche.</w:t>
             </w:r>
           </w:p>
         </w:tc>
@@ -1933,7 +1933,7 @@
                 <w:sz w:val="18"/>
                 <w:szCs w:val="18"/>
               </w:rPr>
-              <w:t xml:space="preserve">3.5</w:t>
+              <w:t xml:space="preserve">3.6</w:t>
             </w:r>
           </w:p>
         </w:tc>
@@ -1966,7 +1966,7 @@
                 <w:sz w:val="18"/>
                 <w:szCs w:val="18"/>
               </w:rPr>
-              <w:t xml:space="preserve">21/10/2026</w:t>
+              <w:t xml:space="preserve">22/10/2026</w:t>
             </w:r>
           </w:p>
         </w:tc>
@@ -1999,7 +1999,7 @@
                 <w:sz w:val="18"/>
                 <w:szCs w:val="18"/>
               </w:rPr>
-              <w:t xml:space="preserve">Barra a LED delle fasi nell'elenco e nella pratica aperta.</w:t>
+              <w:t xml:space="preserve">Feedback pubblico chiuso solo dopo il termine; ente prima della fase 5 (rilievi N02, N03).</w:t>
             </w:r>
           </w:p>
         </w:tc>
@@ -2069,7 +2069,7 @@
                 <w:sz w:val="18"/>
                 <w:szCs w:val="18"/>
               </w:rPr>
-              <w:t xml:space="preserve">3.4</w:t>
+              <w:t xml:space="preserve">3.5</w:t>
             </w:r>
           </w:p>
         </w:tc>
@@ -2133,7 +2133,7 @@
                 <w:sz w:val="18"/>
                 <w:szCs w:val="18"/>
               </w:rPr>
-              <w:t xml:space="preserve">Assistente: domande sulla pratica aperta.</w:t>
+              <w:t xml:space="preserve">Barra a LED delle fasi nell'elenco e nella pratica aperta.</w:t>
             </w:r>
           </w:p>
         </w:tc>
@@ -2203,7 +2203,7 @@
                 <w:sz w:val="18"/>
                 <w:szCs w:val="18"/>
               </w:rPr>
-              <w:t xml:space="preserve">3.3</w:t>
+              <w:t xml:space="preserve">3.4</w:t>
             </w:r>
           </w:p>
         </w:tc>
@@ -2269,7 +2269,7 @@
                 <w:sz w:val="18"/>
                 <w:szCs w:val="18"/>
               </w:rPr>
-              <w:t xml:space="preserve">Domande frequenti: messaggio «Account disattivato».</w:t>
+              <w:t xml:space="preserve">Assistente: domande sulla pratica aperta.</w:t>
             </w:r>
           </w:p>
         </w:tc>
@@ -2339,7 +2339,7 @@
                 <w:sz w:val="18"/>
                 <w:szCs w:val="18"/>
               </w:rPr>
-              <w:t xml:space="preserve">3.2</w:t>
+              <w:t xml:space="preserve">3.3</w:t>
             </w:r>
           </w:p>
         </w:tc>
@@ -2371,7 +2371,7 @@
                 <w:sz w:val="18"/>
                 <w:szCs w:val="18"/>
               </w:rPr>
-              <w:t xml:space="preserve">20/10/2026</w:t>
+              <w:t xml:space="preserve">21/10/2026</w:t>
             </w:r>
           </w:p>
         </w:tc>
@@ -2403,7 +2403,7 @@
                 <w:sz w:val="18"/>
                 <w:szCs w:val="18"/>
               </w:rPr>
-              <w:t xml:space="preserve">Uscita automatica per inattività.</w:t>
+              <w:t xml:space="preserve">Domande frequenti: messaggio «Account disattivato».</w:t>
             </w:r>
           </w:p>
         </w:tc>
@@ -2473,7 +2473,7 @@
                 <w:sz w:val="18"/>
                 <w:szCs w:val="18"/>
               </w:rPr>
-              <w:t xml:space="preserve">3.1</w:t>
+              <w:t xml:space="preserve">3.2</w:t>
             </w:r>
           </w:p>
         </w:tc>
@@ -2539,7 +2539,7 @@
                 <w:sz w:val="18"/>
                 <w:szCs w:val="18"/>
               </w:rPr>
-              <w:t xml:space="preserve">Nuovo menu degli enti: Il Programma CWP, Manuali.</w:t>
+              <w:t xml:space="preserve">Uscita automatica per inattività.</w:t>
             </w:r>
           </w:p>
         </w:tc>
@@ -2609,7 +2609,7 @@
                 <w:sz w:val="18"/>
                 <w:szCs w:val="18"/>
               </w:rPr>
-              <w:t xml:space="preserve">3.0</w:t>
+              <w:t xml:space="preserve">3.1</w:t>
             </w:r>
           </w:p>
         </w:tc>
@@ -2673,7 +2673,7 @@
                 <w:sz w:val="18"/>
                 <w:szCs w:val="18"/>
               </w:rPr>
-              <w:t xml:space="preserve">Voce di menu «Marketplaces» (in arrivo).</w:t>
+              <w:t xml:space="preserve">Nuovo menu degli enti: Il Programma CWP, Manuali.</w:t>
             </w:r>
           </w:p>
         </w:tc>
@@ -2743,7 +2743,7 @@
                 <w:sz w:val="18"/>
                 <w:szCs w:val="18"/>
               </w:rPr>
-              <w:t xml:space="preserve">2.9</w:t>
+              <w:t xml:space="preserve">3.0</w:t>
             </w:r>
           </w:p>
         </w:tc>
@@ -2809,7 +2809,7 @@
                 <w:sz w:val="18"/>
                 <w:szCs w:val="18"/>
               </w:rPr>
-              <w:t xml:space="preserve">Collegamento al portale: registro degli accessi e delle operazioni.</w:t>
+              <w:t xml:space="preserve">Voce di menu «Marketplaces» (in arrivo).</w:t>
             </w:r>
           </w:p>
         </w:tc>
@@ -2879,7 +2879,7 @@
                 <w:sz w:val="18"/>
                 <w:szCs w:val="18"/>
               </w:rPr>
-              <w:t xml:space="preserve">2.8</w:t>
+              <w:t xml:space="preserve">2.9</w:t>
             </w:r>
           </w:p>
         </w:tc>
@@ -2943,7 +2943,7 @@
                 <w:sz w:val="18"/>
                 <w:szCs w:val="18"/>
               </w:rPr>
-              <w:t xml:space="preserve">Nuovo capitolo «Collegamento al portale» (presenza visibile all'Amministratore principale).</w:t>
+              <w:t xml:space="preserve">Collegamento al portale: registro degli accessi e delle operazioni.</w:t>
             </w:r>
           </w:p>
         </w:tc>
@@ -3013,7 +3013,7 @@
                 <w:sz w:val="18"/>
                 <w:szCs w:val="18"/>
               </w:rPr>
-              <w:t xml:space="preserve">2.7</w:t>
+              <w:t xml:space="preserve">2.8</w:t>
             </w:r>
           </w:p>
         </w:tc>
@@ -3046,7 +3046,7 @@
                 <w:sz w:val="18"/>
                 <w:szCs w:val="18"/>
               </w:rPr>
-              <w:t xml:space="preserve">19/10/2026</w:t>
+              <w:t xml:space="preserve">20/10/2026</w:t>
             </w:r>
           </w:p>
         </w:tc>
@@ -3079,7 +3079,7 @@
                 <w:sz w:val="18"/>
                 <w:szCs w:val="18"/>
               </w:rPr>
-              <w:t xml:space="preserve">Assistente virtuale: messaggio «Un attimo…» durante l'attesa.</w:t>
+              <w:t xml:space="preserve">Nuovo capitolo «Collegamento al portale» (presenza visibile all'Amministratore principale).</w:t>
             </w:r>
           </w:p>
         </w:tc>
@@ -3149,7 +3149,7 @@
                 <w:sz w:val="18"/>
                 <w:szCs w:val="18"/>
               </w:rPr>
-              <w:t xml:space="preserve">2.6</w:t>
+              <w:t xml:space="preserve">2.7</w:t>
             </w:r>
           </w:p>
         </w:tc>
@@ -3213,7 +3213,7 @@
                 <w:sz w:val="18"/>
                 <w:szCs w:val="18"/>
               </w:rPr>
-              <w:t xml:space="preserve">Nuovo capitolo «L'assistente virtuale».</w:t>
+              <w:t xml:space="preserve">Assistente virtuale: messaggio «Un attimo…» durante l'attesa.</w:t>
             </w:r>
           </w:p>
         </w:tc>
@@ -3283,7 +3283,7 @@
                 <w:sz w:val="18"/>
                 <w:szCs w:val="18"/>
               </w:rPr>
-              <w:t xml:space="preserve">2.5</w:t>
+              <w:t xml:space="preserve">2.6</w:t>
             </w:r>
           </w:p>
         </w:tc>
@@ -3349,7 +3349,7 @@
                 <w:sz w:val="18"/>
                 <w:szCs w:val="18"/>
               </w:rPr>
-              <w:t xml:space="preserve">Ordinamento degli elenchi e delle tabelle.</w:t>
+              <w:t xml:space="preserve">Nuovo capitolo «L'assistente virtuale».</w:t>
             </w:r>
           </w:p>
         </w:tc>
@@ -3419,7 +3419,7 @@
                 <w:sz w:val="18"/>
                 <w:szCs w:val="18"/>
               </w:rPr>
-              <w:t xml:space="preserve">2.4</w:t>
+              <w:t xml:space="preserve">2.5</w:t>
             </w:r>
           </w:p>
         </w:tc>
@@ -3483,7 +3483,7 @@
                 <w:sz w:val="18"/>
                 <w:szCs w:val="18"/>
               </w:rPr>
-              <w:t xml:space="preserve">Primo accesso: le credenziali arrivano per email.</w:t>
+              <w:t xml:space="preserve">Ordinamento degli elenchi e delle tabelle.</w:t>
             </w:r>
           </w:p>
         </w:tc>
@@ -3553,7 +3553,7 @@
                 <w:sz w:val="18"/>
                 <w:szCs w:val="18"/>
               </w:rPr>
-              <w:t xml:space="preserve">2.3</w:t>
+              <w:t xml:space="preserve">2.4</w:t>
             </w:r>
           </w:p>
         </w:tc>
@@ -3619,7 +3619,7 @@
                 <w:sz w:val="18"/>
                 <w:szCs w:val="18"/>
               </w:rPr>
-              <w:t xml:space="preserve">Simulazione dei crediti: anche stima economica con costi Caso 1 e Caso 2.</w:t>
+              <w:t xml:space="preserve">Primo accesso: le credenziali arrivano per email.</w:t>
             </w:r>
           </w:p>
         </w:tc>
@@ -3689,7 +3689,7 @@
                 <w:sz w:val="18"/>
                 <w:szCs w:val="18"/>
               </w:rPr>
-              <w:t xml:space="preserve">2.2</w:t>
+              <w:t xml:space="preserve">2.3</w:t>
             </w:r>
           </w:p>
         </w:tc>
@@ -3753,7 +3753,7 @@
                 <w:sz w:val="18"/>
                 <w:szCs w:val="18"/>
               </w:rPr>
-              <w:t xml:space="preserve">Simulazione dei crediti disponibile su richiesta alla Fondazione.</w:t>
+              <w:t xml:space="preserve">Simulazione dei crediti: anche stima economica con costi Caso 1 e Caso 2.</w:t>
             </w:r>
           </w:p>
         </w:tc>
@@ -3823,7 +3823,7 @@
                 <w:sz w:val="18"/>
                 <w:szCs w:val="18"/>
               </w:rPr>
-              <w:t xml:space="preserve">2.1</w:t>
+              <w:t xml:space="preserve">2.2</w:t>
             </w:r>
           </w:p>
         </w:tc>
@@ -3889,7 +3889,7 @@
                 <w:sz w:val="18"/>
                 <w:szCs w:val="18"/>
               </w:rPr>
-              <w:t xml:space="preserve">Simulazione dei crediti in arrivo (capitolo Dati per il calcolo dei crediti).</w:t>
+              <w:t xml:space="preserve">Simulazione dei crediti disponibile su richiesta alla Fondazione.</w:t>
             </w:r>
           </w:p>
         </w:tc>
@@ -3959,7 +3959,7 @@
                 <w:sz w:val="18"/>
                 <w:szCs w:val="18"/>
               </w:rPr>
-              <w:t xml:space="preserve">2.0</w:t>
+              <w:t xml:space="preserve">2.1</w:t>
             </w:r>
           </w:p>
         </w:tc>
@@ -3991,7 +3991,7 @@
                 <w:sz w:val="18"/>
                 <w:szCs w:val="18"/>
               </w:rPr>
-              <w:t xml:space="preserve">18/10/2026</w:t>
+              <w:t xml:space="preserve">19/10/2026</w:t>
             </w:r>
           </w:p>
         </w:tc>
@@ -4023,7 +4023,7 @@
                 <w:sz w:val="18"/>
                 <w:szCs w:val="18"/>
               </w:rPr>
-              <w:t xml:space="preserve">Allineamento ai documenti ufficiali del Programma: Rapporto a 7 fasi, feedback pubblico (30 e 20 giorni), stato nel Programma e ID, dati del progetto, un solo account per Organizzazione, ritiro e rientro, conservazione 12 anni, tipologie ufficiali, Schema tariffario, verifica sull'accuratezza; nuovi capitoli Crediti emessi, Reclami, pagina pubblica del Programma.</w:t>
+              <w:t xml:space="preserve">Simulazione dei crediti in arrivo (capitolo Dati per il calcolo dei crediti).</w:t>
             </w:r>
           </w:p>
         </w:tc>
@@ -4093,7 +4093,7 @@
                 <w:sz w:val="18"/>
                 <w:szCs w:val="18"/>
               </w:rPr>
-              <w:t xml:space="preserve">1.9</w:t>
+              <w:t xml:space="preserve">2.0</w:t>
             </w:r>
           </w:p>
         </w:tc>
@@ -4159,7 +4159,7 @@
                 <w:sz w:val="18"/>
                 <w:szCs w:val="18"/>
               </w:rPr>
-              <w:t xml:space="preserve">Rapporti di Monitoraggio con 4 fasi; documenti richiesti per fase; caricamenti solo nelle fasi aperte; osservazioni numerate e notifica di quelle da rispondere; data di conservazione; fascicolo con riepilogo PDF.</w:t>
+              <w:t xml:space="preserve">Allineamento ai documenti ufficiali del Programma: Rapporto a 7 fasi, feedback pubblico (30 e 20 giorni), stato nel Programma e ID, dati del progetto, un solo account per Organizzazione, ritiro e rientro, conservazione 12 anni, tipologie ufficiali, Schema tariffario, verifica sull'accuratezza; nuovi capitoli Crediti emessi, Reclami, pagina pubblica del Programma.</w:t>
             </w:r>
           </w:p>
         </w:tc>
@@ -4229,7 +4229,7 @@
                 <w:sz w:val="18"/>
                 <w:szCs w:val="18"/>
               </w:rPr>
-              <w:t xml:space="preserve">1.8</w:t>
+              <w:t xml:space="preserve">1.9</w:t>
             </w:r>
           </w:p>
         </w:tc>
@@ -4293,7 +4293,7 @@
                 <w:sz w:val="18"/>
                 <w:szCs w:val="18"/>
               </w:rPr>
-              <w:t xml:space="preserve">Nuova tipologia di documento «Rapporto di calcolo dei crediti».</w:t>
+              <w:t xml:space="preserve">Rapporti di Monitoraggio con 4 fasi; documenti richiesti per fase; caricamenti solo nelle fasi aperte; osservazioni numerate e notifica di quelle da rispondere; data di conservazione; fascicolo con riepilogo PDF.</w:t>
             </w:r>
           </w:p>
         </w:tc>
@@ -4363,7 +4363,7 @@
                 <w:sz w:val="18"/>
                 <w:szCs w:val="18"/>
               </w:rPr>
-              <w:t xml:space="preserve">1.7</w:t>
+              <w:t xml:space="preserve">1.8</w:t>
             </w:r>
           </w:p>
         </w:tc>
@@ -4429,7 +4429,7 @@
                 <w:sz w:val="18"/>
                 <w:szCs w:val="18"/>
               </w:rPr>
-              <w:t xml:space="preserve">Dati per il calcolo dei crediti: il file caricato nella pratica è letto direttamente dalla Fondazione; controllo dei dati personali.</w:t>
+              <w:t xml:space="preserve">Nuova tipologia di documento «Rapporto di calcolo dei crediti».</w:t>
             </w:r>
           </w:p>
         </w:tc>
@@ -4499,7 +4499,7 @@
                 <w:sz w:val="18"/>
                 <w:szCs w:val="18"/>
               </w:rPr>
-              <w:t xml:space="preserve">1.6</w:t>
+              <w:t xml:space="preserve">1.7</w:t>
             </w:r>
           </w:p>
         </w:tc>
@@ -4563,7 +4563,7 @@
                 <w:sz w:val="18"/>
                 <w:szCs w:val="18"/>
               </w:rPr>
-              <w:t xml:space="preserve">Messaggi con la Fondazione (nuovo capitolo), note della Fondazione e modelli nelle fasi, Ente di Validazione, avviso sulle pratiche non attive, pagamenti visibili, consultazione sulla pagina pubblica con conferma dell'email ed errata corrige, nuove notifiche.</w:t>
+              <w:t xml:space="preserve">Dati per il calcolo dei crediti: il file caricato nella pratica è letto direttamente dalla Fondazione; controllo dei dati personali.</w:t>
             </w:r>
           </w:p>
         </w:tc>
@@ -4633,7 +4633,7 @@
                 <w:sz w:val="18"/>
                 <w:szCs w:val="18"/>
               </w:rPr>
-              <w:t xml:space="preserve">1.5</w:t>
+              <w:t xml:space="preserve">1.6</w:t>
             </w:r>
           </w:p>
         </w:tc>
@@ -4699,7 +4699,7 @@
                 <w:sz w:val="18"/>
                 <w:szCs w:val="18"/>
               </w:rPr>
-              <w:t xml:space="preserve">Manuale scaricabile anche dalla pagina «I tuoi documenti»; per gli utenti il manuale è disponibile solo in PDF.</w:t>
+              <w:t xml:space="preserve">Messaggi con la Fondazione (nuovo capitolo), note della Fondazione e modelli nelle fasi, Ente di Validazione, avviso sulle pratiche non attive, pagamenti visibili, consultazione sulla pagina pubblica con conferma dell'email ed errata corrige, nuove notifiche.</w:t>
             </w:r>
           </w:p>
         </w:tc>
@@ -4769,7 +4769,7 @@
                 <w:sz w:val="18"/>
                 <w:szCs w:val="18"/>
               </w:rPr>
-              <w:t xml:space="preserve">1.4</w:t>
+              <w:t xml:space="preserve">1.5</w:t>
             </w:r>
           </w:p>
         </w:tc>
@@ -4833,7 +4833,7 @@
                 <w:sz w:val="18"/>
                 <w:szCs w:val="18"/>
               </w:rPr>
-              <w:t xml:space="preserve">Recupero della password: nuova email in italiano dal portale (oggetto e pulsante), limite di una richiesta ogni 2 minuti.</w:t>
+              <w:t xml:space="preserve">Manuale scaricabile anche dalla pagina «I tuoi documenti»; per gli utenti il manuale è disponibile solo in PDF.</w:t>
             </w:r>
           </w:p>
         </w:tc>
@@ -4903,7 +4903,7 @@
                 <w:sz w:val="18"/>
                 <w:szCs w:val="18"/>
               </w:rPr>
-              <w:t xml:space="preserve">1.3</w:t>
+              <w:t xml:space="preserve">1.4</w:t>
             </w:r>
           </w:p>
         </w:tc>
@@ -4969,7 +4969,7 @@
                 <w:sz w:val="18"/>
                 <w:szCs w:val="18"/>
               </w:rPr>
-              <w:t xml:space="preserve">Pagina «Il mio profilo» (account, cambio password, manuale da scaricare).</w:t>
+              <w:t xml:space="preserve">Recupero della password: nuova email in italiano dal portale (oggetto e pulsante), limite di una richiesta ogni 2 minuti.</w:t>
             </w:r>
           </w:p>
         </w:tc>
@@ -5039,7 +5039,7 @@
                 <w:sz w:val="18"/>
                 <w:szCs w:val="18"/>
               </w:rPr>
-              <w:t xml:space="preserve">1.2</w:t>
+              <w:t xml:space="preserve">1.3</w:t>
             </w:r>
           </w:p>
         </w:tc>
@@ -5103,7 +5103,7 @@
                 <w:sz w:val="18"/>
                 <w:szCs w:val="18"/>
               </w:rPr>
-              <w:t xml:space="preserve">Scelta della password al primo accesso, cambio password, recupero della password dimenticata; ritorno alla pratica dopo l'accesso da un link email.</w:t>
+              <w:t xml:space="preserve">Pagina «Il mio profilo» (account, cambio password, manuale da scaricare).</w:t>
             </w:r>
           </w:p>
         </w:tc>
@@ -5173,7 +5173,7 @@
                 <w:sz w:val="18"/>
                 <w:szCs w:val="18"/>
               </w:rPr>
-              <w:t xml:space="preserve">1.1</w:t>
+              <w:t xml:space="preserve">1.2</w:t>
             </w:r>
           </w:p>
         </w:tc>
@@ -5239,7 +5239,7 @@
                 <w:sz w:val="18"/>
                 <w:szCs w:val="18"/>
               </w:rPr>
-              <w:t xml:space="preserve">Voce di menu «Manuale» e pagina di download del manuale (capitolo 2).</w:t>
+              <w:t xml:space="preserve">Scelta della password al primo accesso, cambio password, recupero della password dimenticata; ritorno alla pratica dopo l'accesso da un link email.</w:t>
             </w:r>
           </w:p>
         </w:tc>
@@ -5309,6 +5309,140 @@
                 <w:sz w:val="18"/>
                 <w:szCs w:val="18"/>
               </w:rPr>
+              <w:t xml:space="preserve">1.1</w:t>
+            </w:r>
+          </w:p>
+        </w:tc>
+        <w:tc>
+          <w:tcPr>
+            <w:tcW w:type="dxa" w:w="1300"/>
+            <w:tcBorders>
+              <w:top w:val="single" w:color="D9D4C5" w:sz="4"/>
+              <w:left w:val="single" w:color="D9D4C5" w:sz="4"/>
+              <w:bottom w:val="single" w:color="D9D4C5" w:sz="4"/>
+              <w:right w:val="single" w:color="D9D4C5" w:sz="4"/>
+            </w:tcBorders>
+            <w:tcMar>
+              <w:top w:type="dxa" w:w="70"/>
+              <w:left w:type="dxa" w:w="110"/>
+              <w:bottom w:type="dxa" w:w="70"/>
+              <w:right w:type="dxa" w:w="110"/>
+            </w:tcMar>
+            <w:vAlign w:val="center"/>
+          </w:tcPr>
+          <w:p>
+            <w:pPr>
+              <w:spacing w:after="0" w:before="0"/>
+            </w:pPr>
+            <w:r>
+              <w:rPr>
+                <w:rFonts w:ascii="Arial" w:cs="Arial" w:eastAsia="Arial" w:hAnsi="Arial"/>
+                <w:color w:val="1B2118"/>
+                <w:sz w:val="18"/>
+                <w:szCs w:val="18"/>
+              </w:rPr>
+              <w:t xml:space="preserve">18/10/2026</w:t>
+            </w:r>
+          </w:p>
+        </w:tc>
+        <w:tc>
+          <w:tcPr>
+            <w:tcW w:type="dxa" w:w="5538"/>
+            <w:tcBorders>
+              <w:top w:val="single" w:color="D9D4C5" w:sz="4"/>
+              <w:left w:val="single" w:color="D9D4C5" w:sz="4"/>
+              <w:bottom w:val="single" w:color="D9D4C5" w:sz="4"/>
+              <w:right w:val="single" w:color="D9D4C5" w:sz="4"/>
+            </w:tcBorders>
+            <w:tcMar>
+              <w:top w:type="dxa" w:w="70"/>
+              <w:left w:type="dxa" w:w="110"/>
+              <w:bottom w:type="dxa" w:w="70"/>
+              <w:right w:type="dxa" w:w="110"/>
+            </w:tcMar>
+            <w:vAlign w:val="center"/>
+          </w:tcPr>
+          <w:p>
+            <w:pPr>
+              <w:spacing w:after="0" w:before="0"/>
+            </w:pPr>
+            <w:r>
+              <w:rPr>
+                <w:rFonts w:ascii="Arial" w:cs="Arial" w:eastAsia="Arial" w:hAnsi="Arial"/>
+                <w:color w:val="1B2118"/>
+                <w:sz w:val="18"/>
+                <w:szCs w:val="18"/>
+              </w:rPr>
+              <w:t xml:space="preserve">Voce di menu «Manuale» e pagina di download del manuale (capitolo 2).</w:t>
+            </w:r>
+          </w:p>
+        </w:tc>
+        <w:tc>
+          <w:tcPr>
+            <w:tcW w:type="dxa" w:w="2000"/>
+            <w:tcBorders>
+              <w:top w:val="single" w:color="D9D4C5" w:sz="4"/>
+              <w:left w:val="single" w:color="D9D4C5" w:sz="4"/>
+              <w:bottom w:val="single" w:color="D9D4C5" w:sz="4"/>
+              <w:right w:val="single" w:color="D9D4C5" w:sz="4"/>
+            </w:tcBorders>
+            <w:tcMar>
+              <w:top w:type="dxa" w:w="70"/>
+              <w:left w:type="dxa" w:w="110"/>
+              <w:bottom w:type="dxa" w:w="70"/>
+              <w:right w:type="dxa" w:w="110"/>
+            </w:tcMar>
+            <w:vAlign w:val="center"/>
+          </w:tcPr>
+          <w:p>
+            <w:pPr>
+              <w:spacing w:after="0" w:before="0"/>
+            </w:pPr>
+            <w:r>
+              <w:rPr>
+                <w:rFonts w:ascii="Arial" w:cs="Arial" w:eastAsia="Arial" w:hAnsi="Arial"/>
+                <w:color w:val="1B2118"/>
+                <w:sz w:val="18"/>
+                <w:szCs w:val="18"/>
+              </w:rPr>
+              <w:t xml:space="preserve">Fondazione Operate</w:t>
+            </w:r>
+          </w:p>
+        </w:tc>
+      </w:tr>
+      <w:tr>
+        <w:trPr>
+          <w:cantSplit/>
+        </w:trPr>
+        <w:tc>
+          <w:tcPr>
+            <w:tcW w:type="dxa" w:w="800"/>
+            <w:tcBorders>
+              <w:top w:val="single" w:color="D9D4C5" w:sz="4"/>
+              <w:left w:val="single" w:color="D9D4C5" w:sz="4"/>
+              <w:bottom w:val="single" w:color="D9D4C5" w:sz="4"/>
+              <w:right w:val="single" w:color="D9D4C5" w:sz="4"/>
+            </w:tcBorders>
+            <w:shd w:fill="F6F4EE" w:color="auto" w:val="clear"/>
+            <w:tcMar>
+              <w:top w:type="dxa" w:w="70"/>
+              <w:left w:type="dxa" w:w="110"/>
+              <w:bottom w:type="dxa" w:w="70"/>
+              <w:right w:type="dxa" w:w="110"/>
+            </w:tcMar>
+            <w:vAlign w:val="center"/>
+          </w:tcPr>
+          <w:p>
+            <w:pPr>
+              <w:spacing w:after="0" w:before="0"/>
+            </w:pPr>
+            <w:r>
+              <w:rPr>
+                <w:rFonts w:ascii="Arial" w:cs="Arial" w:eastAsia="Arial" w:hAnsi="Arial"/>
+                <w:color w:val="1B2118"/>
+                <w:sz w:val="18"/>
+                <w:szCs w:val="18"/>
+              </w:rPr>
               <w:t xml:space="preserve">1.0</w:t>
             </w:r>
           </w:p>
@@ -5322,6 +5456,7 @@
               <w:bottom w:val="single" w:color="D9D4C5" w:sz="4"/>
               <w:right w:val="single" w:color="D9D4C5" w:sz="4"/>
             </w:tcBorders>
+            <w:shd w:fill="F6F4EE" w:color="auto" w:val="clear"/>
             <w:tcMar>
               <w:top w:type="dxa" w:w="70"/>
               <w:left w:type="dxa" w:w="110"/>
@@ -5354,6 +5489,7 @@
               <w:bottom w:val="single" w:color="D9D4C5" w:sz="4"/>
               <w:right w:val="single" w:color="D9D4C5" w:sz="4"/>
             </w:tcBorders>
+            <w:shd w:fill="F6F4EE" w:color="auto" w:val="clear"/>
             <w:tcMar>
               <w:top w:type="dxa" w:w="70"/>
               <w:left w:type="dxa" w:w="110"/>
@@ -5386,6 +5522,7 @@
               <w:bottom w:val="single" w:color="D9D4C5" w:sz="4"/>
               <w:right w:val="single" w:color="D9D4C5" w:sz="4"/>
             </w:tcBorders>
+            <w:shd w:fill="F6F4EE" w:color="auto" w:val="clear"/>
             <w:tcMar>
               <w:top w:type="dxa" w:w="70"/>
               <w:left w:type="dxa" w:w="110"/>
@@ -5427,7 +5564,7 @@
           <w:sz w:val="20"/>
           <w:szCs w:val="20"/>
         </w:rPr>
-        <w:t xml:space="preserve">Questo documento descrive il portale alla revisione 4.4 del 23/10/2026. A ogni modifica del portale il manuale viene aggiornato e la revisione incrementata; la versione corrente si scarica dal portale.</w:t>
+        <w:t xml:space="preserve">Questo documento descrive il portale alla revisione 4.5 del 25/10/2026. A ogni modifica del portale il manuale viene aggiornato e la revisione incrementata; la versione corrente si scarica dal portale.</w:t>
       </w:r>
     </w:p>
     <w:p>
@@ -5566,7 +5703,7 @@
             <w:szCs w:val="22"/>
           </w:rPr>
           <w:tab/>
-          <w:t xml:space="preserve">10</w:t>
+          <w:t xml:space="preserve">11</w:t>
         </w:r>
       </w:hyperlink>
     </w:p>
@@ -5595,7 +5732,7 @@
             <w:szCs w:val="22"/>
           </w:rPr>
           <w:tab/>
-          <w:t xml:space="preserve">12</w:t>
+          <w:t xml:space="preserve">13</w:t>
         </w:r>
       </w:hyperlink>
     </w:p>
@@ -5624,7 +5761,7 @@
             <w:szCs w:val="22"/>
           </w:rPr>
           <w:tab/>
-          <w:t xml:space="preserve">13</w:t>
+          <w:t xml:space="preserve">15</w:t>
         </w:r>
       </w:hyperlink>
     </w:p>
@@ -5653,7 +5790,7 @@
             <w:szCs w:val="22"/>
           </w:rPr>
           <w:tab/>
-          <w:t xml:space="preserve">14</w:t>
+          <w:t xml:space="preserve">16</w:t>
         </w:r>
       </w:hyperlink>
     </w:p>
@@ -5682,7 +5819,7 @@
             <w:szCs w:val="22"/>
           </w:rPr>
           <w:tab/>
-          <w:t xml:space="preserve">15</w:t>
+          <w:t xml:space="preserve">18</w:t>
         </w:r>
       </w:hyperlink>
     </w:p>
@@ -5711,7 +5848,7 @@
             <w:szCs w:val="22"/>
           </w:rPr>
           <w:tab/>
-          <w:t xml:space="preserve">16</w:t>
+          <w:t xml:space="preserve">19</w:t>
         </w:r>
       </w:hyperlink>
     </w:p>
@@ -5740,7 +5877,7 @@
             <w:szCs w:val="22"/>
           </w:rPr>
           <w:tab/>
-          <w:t xml:space="preserve">17</w:t>
+          <w:t xml:space="preserve">21</w:t>
         </w:r>
       </w:hyperlink>
     </w:p>
@@ -5769,7 +5906,7 @@
             <w:szCs w:val="22"/>
           </w:rPr>
           <w:tab/>
-          <w:t xml:space="preserve">18</w:t>
+          <w:t xml:space="preserve">22</w:t>
         </w:r>
       </w:hyperlink>
     </w:p>
@@ -5798,7 +5935,7 @@
             <w:szCs w:val="22"/>
           </w:rPr>
           <w:tab/>
-          <w:t xml:space="preserve">19</w:t>
+          <w:t xml:space="preserve">23</w:t>
         </w:r>
       </w:hyperlink>
     </w:p>
@@ -5827,7 +5964,7 @@
             <w:szCs w:val="22"/>
           </w:rPr>
           <w:tab/>
-          <w:t xml:space="preserve">20</w:t>
+          <w:t xml:space="preserve">25</w:t>
         </w:r>
       </w:hyperlink>
     </w:p>
@@ -5856,7 +5993,7 @@
             <w:szCs w:val="22"/>
           </w:rPr>
           <w:tab/>
-          <w:t xml:space="preserve">23</w:t>
+          <w:t xml:space="preserve">28</w:t>
         </w:r>
       </w:hyperlink>
     </w:p>
@@ -5885,7 +6022,7 @@
             <w:szCs w:val="22"/>
           </w:rPr>
           <w:tab/>
-          <w:t xml:space="preserve">24</w:t>
+          <w:t xml:space="preserve">30</w:t>
         </w:r>
       </w:hyperlink>
     </w:p>
@@ -5914,7 +6051,7 @@
             <w:szCs w:val="22"/>
           </w:rPr>
           <w:tab/>
-          <w:t xml:space="preserve">25</w:t>
+          <w:t xml:space="preserve">32</w:t>
         </w:r>
       </w:hyperlink>
     </w:p>
@@ -5943,7 +6080,7 @@
             <w:szCs w:val="22"/>
           </w:rPr>
           <w:tab/>
-          <w:t xml:space="preserve">26</w:t>
+          <w:t xml:space="preserve">34</w:t>
         </w:r>
       </w:hyperlink>
     </w:p>
@@ -5972,15 +6109,15 @@
             <w:szCs w:val="22"/>
           </w:rPr>
           <w:tab/>
-          <w:t xml:space="preserve">27</w:t>
+          <w:t xml:space="preserve">35</w:t>
         </w:r>
       </w:hyperlink>
     </w:p>
     <w:p>
       <w:pPr>
         <w:sectPr>
-          <w:headerReference w:type="default" r:id="rId7"/>
-          <w:footerReference w:type="default" r:id="rId8"/>
+          <w:headerReference w:type="default" r:id="rId6"/>
+          <w:footerReference w:type="default" r:id="rId7"/>
           <w:pgSz w:w="11906" w:h="16838" w:orient="portrait"/>
           <w:pgMar w:top="1134" w:right="1134" w:bottom="1134" w:left="1134" w:header="567" w:footer="567" w:gutter="0"/>
           <w:pgNumType/>
@@ -5997,7 +6134,7 @@
         </w:pBdr>
         <w:spacing w:after="240" w:before="0"/>
       </w:pPr>
-      <w:bookmarkStart w:name="cap1" w:id="1"/>
+      <w:bookmarkStart w:name="cap1" w:id="19"/>
       <w:r>
         <w:rPr>
           <w:rFonts w:ascii="Arial" w:cs="Arial" w:eastAsia="Arial" w:hAnsi="Arial"/>
@@ -6009,7 +6146,7 @@
         </w:rPr>
         <w:t xml:space="preserve">1. Introduzione</w:t>
       </w:r>
-      <w:bookmarkEnd w:id="1"/>
+      <w:bookmarkEnd w:id="19"/>
     </w:p>
     <w:p>
       <w:pPr>
@@ -6253,7 +6390,7 @@
         </w:rPr>
         <w:t xml:space="preserve"> un computer o tablet con un browser aggiornato (Chrome, Edge, Firefox, Safari) e le credenziali fornite dalla Fondazione. Indirizzo del portale: </w:t>
       </w:r>
-      <w:hyperlink w:history="1" r:id="rId9_qqunzwqbh7emupn0qrx">
+      <w:hyperlink w:history="1" r:id="rIdphpxpr_f45llucxhnd4my">
         <w:r>
           <w:rPr>
             <w:rFonts w:ascii="Arial" w:cs="Arial" w:eastAsia="Arial" w:hAnsi="Arial"/>
@@ -6394,7 +6531,7 @@
         </w:pBdr>
         <w:spacing w:after="240" w:before="0"/>
       </w:pPr>
-      <w:bookmarkStart w:name="cap2" w:id="1"/>
+      <w:bookmarkStart w:name="cap2" w:id="20"/>
       <w:r>
         <w:rPr>
           <w:rFonts w:ascii="Arial" w:cs="Arial" w:eastAsia="Arial" w:hAnsi="Arial"/>
@@ -6406,7 +6543,7 @@
         </w:rPr>
         <w:t xml:space="preserve">2. Primo accesso</w:t>
       </w:r>
-      <w:bookmarkEnd w:id="1"/>
+      <w:bookmarkEnd w:id="20"/>
     </w:p>
     <w:p>
       <w:pPr>
@@ -6480,7 +6617,7 @@
         </w:rPr>
         <w:t xml:space="preserve">Aprite </w:t>
       </w:r>
-      <w:hyperlink w:history="1" r:id="rIdepzsdshgl-znapmhynwtt">
+      <w:hyperlink w:history="1" r:id="rIdyzriej-qvf0jcclg6eg4e">
         <w:r>
           <w:rPr>
             <w:rFonts w:ascii="Arial" w:cs="Arial" w:eastAsia="Arial" w:hAnsi="Arial"/>
@@ -6940,6 +7077,70 @@
           <w:szCs w:val="21"/>
         </w:rPr>
         <w:t xml:space="preserve"> per uscire.</w:t>
+      </w:r>
+    </w:p>
+    <w:p>
+      <w:pPr>
+        <w:keepNext/>
+        <w:spacing w:after="60" w:before="120"/>
+        <w:jc w:val="center"/>
+      </w:pPr>
+      <w:r>
+        <w:drawing>
+          <wp:inline distT="0" distB="0" distL="0" distR="0">
+            <wp:extent cx="5762625" cy="1657350"/>
+            <wp:effectExtent t="0" r="0" b="0" l="0"/>
+            <wp:docPr id="25" name="" descr="" title=""/>
+            <wp:cNvGraphicFramePr>
+              <a:graphicFrameLocks xmlns:a="http://schemas.openxmlformats.org/drawingml/2006/main" noChangeAspect="1"/>
+            </wp:cNvGraphicFramePr>
+            <a:graphic xmlns:a="http://schemas.openxmlformats.org/drawingml/2006/main">
+              <a:graphicData uri="http://schemas.openxmlformats.org/drawingml/2006/picture">
+                <pic:pic xmlns:pic="http://schemas.openxmlformats.org/drawingml/2006/picture">
+                  <pic:nvPicPr>
+                    <pic:cNvPr id="0" name="" descr=""/>
+                    <pic:cNvPicPr>
+                      <a:picLocks noChangeAspect="1" noChangeArrowheads="1"/>
+                    </pic:cNvPicPr>
+                  </pic:nvPicPr>
+                  <pic:blipFill>
+                    <a:blip r:embed="rId13" cstate="none"/>
+                    <a:srcRect/>
+                    <a:stretch>
+                      <a:fillRect/>
+                    </a:stretch>
+                  </pic:blipFill>
+                  <pic:spPr bwMode="auto">
+                    <a:xfrm>
+                      <a:off x="0" y="0"/>
+                      <a:ext cx="5762625" cy="1657350"/>
+                    </a:xfrm>
+                    <a:prstGeom prst="rect">
+                      <a:avLst/>
+                    </a:prstGeom>
+                  </pic:spPr>
+                </pic:pic>
+              </a:graphicData>
+            </a:graphic>
+          </wp:inline>
+        </w:drawing>
+      </w:r>
+    </w:p>
+    <w:p>
+      <w:pPr>
+        <w:spacing w:after="200"/>
+        <w:jc w:val="center"/>
+      </w:pPr>
+      <w:r>
+        <w:rPr>
+          <w:rFonts w:ascii="Arial" w:cs="Arial" w:eastAsia="Arial" w:hAnsi="Arial"/>
+          <w:i/>
+          <w:iCs/>
+          <w:color w:val="5A5E54"/>
+          <w:sz w:val="18"/>
+          <w:szCs w:val="18"/>
+        </w:rPr>
+        <w:t xml:space="preserve">Il menu del portale per i Comuni, con la campanella delle notifiche e il collegamento a Il mio profilo</w:t>
       </w:r>
     </w:p>
     <w:tbl>
@@ -7971,6 +8172,70 @@
     </w:p>
     <w:p>
       <w:pPr>
+        <w:keepNext/>
+        <w:spacing w:after="60" w:before="120"/>
+        <w:jc w:val="center"/>
+      </w:pPr>
+      <w:r>
+        <w:drawing>
+          <wp:inline distT="0" distB="0" distL="0" distR="0">
+            <wp:extent cx="5762625" cy="3171825"/>
+            <wp:effectExtent t="0" r="0" b="0" l="0"/>
+            <wp:docPr id="26" name="" descr="" title=""/>
+            <wp:cNvGraphicFramePr>
+              <a:graphicFrameLocks xmlns:a="http://schemas.openxmlformats.org/drawingml/2006/main" noChangeAspect="1"/>
+            </wp:cNvGraphicFramePr>
+            <a:graphic xmlns:a="http://schemas.openxmlformats.org/drawingml/2006/main">
+              <a:graphicData uri="http://schemas.openxmlformats.org/drawingml/2006/picture">
+                <pic:pic xmlns:pic="http://schemas.openxmlformats.org/drawingml/2006/picture">
+                  <pic:nvPicPr>
+                    <pic:cNvPr id="0" name="" descr=""/>
+                    <pic:cNvPicPr>
+                      <a:picLocks noChangeAspect="1" noChangeArrowheads="1"/>
+                    </pic:cNvPicPr>
+                  </pic:nvPicPr>
+                  <pic:blipFill>
+                    <a:blip r:embed="rId14" cstate="none"/>
+                    <a:srcRect/>
+                    <a:stretch>
+                      <a:fillRect/>
+                    </a:stretch>
+                  </pic:blipFill>
+                  <pic:spPr bwMode="auto">
+                    <a:xfrm>
+                      <a:off x="0" y="0"/>
+                      <a:ext cx="5762625" cy="3171825"/>
+                    </a:xfrm>
+                    <a:prstGeom prst="rect">
+                      <a:avLst/>
+                    </a:prstGeom>
+                  </pic:spPr>
+                </pic:pic>
+              </a:graphicData>
+            </a:graphic>
+          </wp:inline>
+        </w:drawing>
+      </w:r>
+    </w:p>
+    <w:p>
+      <w:pPr>
+        <w:spacing w:after="200"/>
+        <w:jc w:val="center"/>
+      </w:pPr>
+      <w:r>
+        <w:rPr>
+          <w:rFonts w:ascii="Arial" w:cs="Arial" w:eastAsia="Arial" w:hAnsi="Arial"/>
+          <w:i/>
+          <w:iCs/>
+          <w:color w:val="5A5E54"/>
+          <w:sz w:val="18"/>
+          <w:szCs w:val="18"/>
+        </w:rPr>
+        <w:t xml:space="preserve">La pagina Il mio profilo: dati dell'account, cambio password e manuale</w:t>
+      </w:r>
+    </w:p>
+    <w:p>
+      <w:pPr>
         <w:spacing w:after="140" w:line="300"/>
       </w:pPr>
       <w:r>
@@ -8274,7 +8539,7 @@
         </w:pBdr>
         <w:spacing w:after="240" w:before="0"/>
       </w:pPr>
-      <w:bookmarkStart w:name="cap3" w:id="1"/>
+      <w:bookmarkStart w:name="cap3" w:id="21"/>
       <w:r>
         <w:rPr>
           <w:rFonts w:ascii="Arial" w:cs="Arial" w:eastAsia="Arial" w:hAnsi="Arial"/>
@@ -8286,7 +8551,7 @@
         </w:rPr>
         <w:t xml:space="preserve">3. La pagina Le mie pratiche</w:t>
       </w:r>
-      <w:bookmarkEnd w:id="1"/>
+      <w:bookmarkEnd w:id="21"/>
     </w:p>
     <w:p>
       <w:pPr>
@@ -8499,6 +8764,70 @@
     </w:p>
     <w:p>
       <w:pPr>
+        <w:keepNext/>
+        <w:spacing w:after="60" w:before="120"/>
+        <w:jc w:val="center"/>
+      </w:pPr>
+      <w:r>
+        <w:drawing>
+          <wp:inline distT="0" distB="0" distL="0" distR="0">
+            <wp:extent cx="5762625" cy="2028825"/>
+            <wp:effectExtent t="0" r="0" b="0" l="0"/>
+            <wp:docPr id="27" name="" descr="" title=""/>
+            <wp:cNvGraphicFramePr>
+              <a:graphicFrameLocks xmlns:a="http://schemas.openxmlformats.org/drawingml/2006/main" noChangeAspect="1"/>
+            </wp:cNvGraphicFramePr>
+            <a:graphic xmlns:a="http://schemas.openxmlformats.org/drawingml/2006/main">
+              <a:graphicData uri="http://schemas.openxmlformats.org/drawingml/2006/picture">
+                <pic:pic xmlns:pic="http://schemas.openxmlformats.org/drawingml/2006/picture">
+                  <pic:nvPicPr>
+                    <pic:cNvPr id="0" name="" descr=""/>
+                    <pic:cNvPicPr>
+                      <a:picLocks noChangeAspect="1" noChangeArrowheads="1"/>
+                    </pic:cNvPicPr>
+                  </pic:nvPicPr>
+                  <pic:blipFill>
+                    <a:blip r:embed="rId15" cstate="none"/>
+                    <a:srcRect/>
+                    <a:stretch>
+                      <a:fillRect/>
+                    </a:stretch>
+                  </pic:blipFill>
+                  <pic:spPr bwMode="auto">
+                    <a:xfrm>
+                      <a:off x="0" y="0"/>
+                      <a:ext cx="5762625" cy="2028825"/>
+                    </a:xfrm>
+                    <a:prstGeom prst="rect">
+                      <a:avLst/>
+                    </a:prstGeom>
+                  </pic:spPr>
+                </pic:pic>
+              </a:graphicData>
+            </a:graphic>
+          </wp:inline>
+        </w:drawing>
+      </w:r>
+    </w:p>
+    <w:p>
+      <w:pPr>
+        <w:spacing w:after="200"/>
+        <w:jc w:val="center"/>
+      </w:pPr>
+      <w:r>
+        <w:rPr>
+          <w:rFonts w:ascii="Arial" w:cs="Arial" w:eastAsia="Arial" w:hAnsi="Arial"/>
+          <w:i/>
+          <w:iCs/>
+          <w:color w:val="5A5E54"/>
+          <w:sz w:val="18"/>
+          <w:szCs w:val="18"/>
+        </w:rPr>
+        <w:t xml:space="preserve">I riquadri Crediti in simulazione e Crediti in fase esecutiva</w:t>
+      </w:r>
+    </w:p>
+    <w:p>
+      <w:pPr>
         <w:spacing w:after="140" w:line="300"/>
       </w:pPr>
       <w:r>
@@ -8679,6 +9008,70 @@
           <w:szCs w:val="21"/>
         </w:rPr>
         <w:t xml:space="preserve">: 7 luci, una per fase; le fasi completate sono accese (ambra, la settima verde), quella in corso ha il contorno ambra, accanto il conteggio (es. «4/7»). Passando il mouse su una luce compaiono nome e stato della fase. La stessa barra compare in alto a destra nella pratica aperta.</w:t>
+      </w:r>
+    </w:p>
+    <w:p>
+      <w:pPr>
+        <w:keepNext/>
+        <w:spacing w:after="60" w:before="120"/>
+        <w:jc w:val="center"/>
+      </w:pPr>
+      <w:r>
+        <w:drawing>
+          <wp:inline distT="0" distB="0" distL="0" distR="0">
+            <wp:extent cx="5762625" cy="1362075"/>
+            <wp:effectExtent t="0" r="0" b="0" l="0"/>
+            <wp:docPr id="28" name="" descr="" title=""/>
+            <wp:cNvGraphicFramePr>
+              <a:graphicFrameLocks xmlns:a="http://schemas.openxmlformats.org/drawingml/2006/main" noChangeAspect="1"/>
+            </wp:cNvGraphicFramePr>
+            <a:graphic xmlns:a="http://schemas.openxmlformats.org/drawingml/2006/main">
+              <a:graphicData uri="http://schemas.openxmlformats.org/drawingml/2006/picture">
+                <pic:pic xmlns:pic="http://schemas.openxmlformats.org/drawingml/2006/picture">
+                  <pic:nvPicPr>
+                    <pic:cNvPr id="0" name="" descr=""/>
+                    <pic:cNvPicPr>
+                      <a:picLocks noChangeAspect="1" noChangeArrowheads="1"/>
+                    </pic:cNvPicPr>
+                  </pic:nvPicPr>
+                  <pic:blipFill>
+                    <a:blip r:embed="rId16" cstate="none"/>
+                    <a:srcRect/>
+                    <a:stretch>
+                      <a:fillRect/>
+                    </a:stretch>
+                  </pic:blipFill>
+                  <pic:spPr bwMode="auto">
+                    <a:xfrm>
+                      <a:off x="0" y="0"/>
+                      <a:ext cx="5762625" cy="1362075"/>
+                    </a:xfrm>
+                    <a:prstGeom prst="rect">
+                      <a:avLst/>
+                    </a:prstGeom>
+                  </pic:spPr>
+                </pic:pic>
+              </a:graphicData>
+            </a:graphic>
+          </wp:inline>
+        </w:drawing>
+      </w:r>
+    </w:p>
+    <w:p>
+      <w:pPr>
+        <w:spacing w:after="200"/>
+        <w:jc w:val="center"/>
+      </w:pPr>
+      <w:r>
+        <w:rPr>
+          <w:rFonts w:ascii="Arial" w:cs="Arial" w:eastAsia="Arial" w:hAnsi="Arial"/>
+          <w:i/>
+          <w:iCs/>
+          <w:color w:val="5A5E54"/>
+          <w:sz w:val="18"/>
+          <w:szCs w:val="18"/>
+        </w:rPr>
+        <w:t xml:space="preserve">L'elenco delle pratiche con la barra di avanzamento a LED</w:t>
       </w:r>
     </w:p>
     <w:tbl>
@@ -9373,6 +9766,70 @@
     </w:p>
     <w:p>
       <w:pPr>
+        <w:keepNext/>
+        <w:spacing w:after="60" w:before="120"/>
+        <w:jc w:val="center"/>
+      </w:pPr>
+      <w:r>
+        <w:drawing>
+          <wp:inline distT="0" distB="0" distL="0" distR="0">
+            <wp:extent cx="5762625" cy="1457325"/>
+            <wp:effectExtent t="0" r="0" b="0" l="0"/>
+            <wp:docPr id="29" name="" descr="" title=""/>
+            <wp:cNvGraphicFramePr>
+              <a:graphicFrameLocks xmlns:a="http://schemas.openxmlformats.org/drawingml/2006/main" noChangeAspect="1"/>
+            </wp:cNvGraphicFramePr>
+            <a:graphic xmlns:a="http://schemas.openxmlformats.org/drawingml/2006/main">
+              <a:graphicData uri="http://schemas.openxmlformats.org/drawingml/2006/picture">
+                <pic:pic xmlns:pic="http://schemas.openxmlformats.org/drawingml/2006/picture">
+                  <pic:nvPicPr>
+                    <pic:cNvPr id="0" name="" descr=""/>
+                    <pic:cNvPicPr>
+                      <a:picLocks noChangeAspect="1" noChangeArrowheads="1"/>
+                    </pic:cNvPicPr>
+                  </pic:nvPicPr>
+                  <pic:blipFill>
+                    <a:blip r:embed="rId17" cstate="none"/>
+                    <a:srcRect/>
+                    <a:stretch>
+                      <a:fillRect/>
+                    </a:stretch>
+                  </pic:blipFill>
+                  <pic:spPr bwMode="auto">
+                    <a:xfrm>
+                      <a:off x="0" y="0"/>
+                      <a:ext cx="5762625" cy="1457325"/>
+                    </a:xfrm>
+                    <a:prstGeom prst="rect">
+                      <a:avLst/>
+                    </a:prstGeom>
+                  </pic:spPr>
+                </pic:pic>
+              </a:graphicData>
+            </a:graphic>
+          </wp:inline>
+        </w:drawing>
+      </w:r>
+    </w:p>
+    <w:p>
+      <w:pPr>
+        <w:spacing w:after="200"/>
+        <w:jc w:val="center"/>
+      </w:pPr>
+      <w:r>
+        <w:rPr>
+          <w:rFonts w:ascii="Arial" w:cs="Arial" w:eastAsia="Arial" w:hAnsi="Arial"/>
+          <w:i/>
+          <w:iCs/>
+          <w:color w:val="5A5E54"/>
+          <w:sz w:val="18"/>
+          <w:szCs w:val="18"/>
+        </w:rPr>
+        <w:t xml:space="preserve">L'intestazione di una pratica: ID progetto, stato, stato nel Programma e dati principali</w:t>
+      </w:r>
+    </w:p>
+    <w:p>
+      <w:pPr>
         <w:spacing w:after="140" w:line="300"/>
       </w:pPr>
       <w:r>
@@ -10500,7 +10957,7 @@
         </w:pBdr>
         <w:spacing w:after="240" w:before="0"/>
       </w:pPr>
-      <w:bookmarkStart w:name="cap4" w:id="1"/>
+      <w:bookmarkStart w:name="cap4" w:id="22"/>
       <w:r>
         <w:rPr>
           <w:rFonts w:ascii="Arial" w:cs="Arial" w:eastAsia="Arial" w:hAnsi="Arial"/>
@@ -10512,7 +10969,7 @@
         </w:rPr>
         <w:t xml:space="preserve">4. Seguire una pratica: fasi e scadenze</w:t>
       </w:r>
-      <w:bookmarkEnd w:id="1"/>
+      <w:bookmarkEnd w:id="22"/>
     </w:p>
     <w:p>
       <w:pPr>
@@ -13848,7 +14305,7 @@
         </w:pBdr>
         <w:spacing w:after="240" w:before="0"/>
       </w:pPr>
-      <w:bookmarkStart w:name="cap5" w:id="1"/>
+      <w:bookmarkStart w:name="cap5" w:id="23"/>
       <w:r>
         <w:rPr>
           <w:rFonts w:ascii="Arial" w:cs="Arial" w:eastAsia="Arial" w:hAnsi="Arial"/>
@@ -13860,7 +14317,7 @@
         </w:rPr>
         <w:t xml:space="preserve">5. Caricare documenti</w:t>
       </w:r>
-      <w:bookmarkEnd w:id="1"/>
+      <w:bookmarkEnd w:id="23"/>
     </w:p>
     <w:p>
       <w:pPr>
@@ -13914,6 +14371,134 @@
           <w:szCs w:val="21"/>
         </w:rPr>
         <w:t xml:space="preserve">, in fondo alla pratica, per quelli non legati a una fase.</w:t>
+      </w:r>
+    </w:p>
+    <w:p>
+      <w:pPr>
+        <w:keepNext/>
+        <w:spacing w:after="60" w:before="120"/>
+        <w:jc w:val="center"/>
+      </w:pPr>
+      <w:r>
+        <w:drawing>
+          <wp:inline distT="0" distB="0" distL="0" distR="0">
+            <wp:extent cx="5762625" cy="1790700"/>
+            <wp:effectExtent t="0" r="0" b="0" l="0"/>
+            <wp:docPr id="30" name="" descr="" title=""/>
+            <wp:cNvGraphicFramePr>
+              <a:graphicFrameLocks xmlns:a="http://schemas.openxmlformats.org/drawingml/2006/main" noChangeAspect="1"/>
+            </wp:cNvGraphicFramePr>
+            <a:graphic xmlns:a="http://schemas.openxmlformats.org/drawingml/2006/main">
+              <a:graphicData uri="http://schemas.openxmlformats.org/drawingml/2006/picture">
+                <pic:pic xmlns:pic="http://schemas.openxmlformats.org/drawingml/2006/picture">
+                  <pic:nvPicPr>
+                    <pic:cNvPr id="0" name="" descr=""/>
+                    <pic:cNvPicPr>
+                      <a:picLocks noChangeAspect="1" noChangeArrowheads="1"/>
+                    </pic:cNvPicPr>
+                  </pic:nvPicPr>
+                  <pic:blipFill>
+                    <a:blip r:embed="rId18" cstate="none"/>
+                    <a:srcRect/>
+                    <a:stretch>
+                      <a:fillRect/>
+                    </a:stretch>
+                  </pic:blipFill>
+                  <pic:spPr bwMode="auto">
+                    <a:xfrm>
+                      <a:off x="0" y="0"/>
+                      <a:ext cx="5762625" cy="1790700"/>
+                    </a:xfrm>
+                    <a:prstGeom prst="rect">
+                      <a:avLst/>
+                    </a:prstGeom>
+                  </pic:spPr>
+                </pic:pic>
+              </a:graphicData>
+            </a:graphic>
+          </wp:inline>
+        </w:drawing>
+      </w:r>
+    </w:p>
+    <w:p>
+      <w:pPr>
+        <w:spacing w:after="200"/>
+        <w:jc w:val="center"/>
+      </w:pPr>
+      <w:r>
+        <w:rPr>
+          <w:rFonts w:ascii="Arial" w:cs="Arial" w:eastAsia="Arial" w:hAnsi="Arial"/>
+          <w:i/>
+          <w:iCs/>
+          <w:color w:val="5A5E54"/>
+          <w:sz w:val="18"/>
+          <w:szCs w:val="18"/>
+        </w:rPr>
+        <w:t xml:space="preserve">Una fase in corso: documenti richiesti, pulsante + Carica e scelta del tipo di documento</w:t>
+      </w:r>
+    </w:p>
+    <w:p>
+      <w:pPr>
+        <w:keepNext/>
+        <w:spacing w:after="60" w:before="120"/>
+        <w:jc w:val="center"/>
+      </w:pPr>
+      <w:r>
+        <w:drawing>
+          <wp:inline distT="0" distB="0" distL="0" distR="0">
+            <wp:extent cx="5762625" cy="1571625"/>
+            <wp:effectExtent t="0" r="0" b="0" l="0"/>
+            <wp:docPr id="31" name="" descr="" title=""/>
+            <wp:cNvGraphicFramePr>
+              <a:graphicFrameLocks xmlns:a="http://schemas.openxmlformats.org/drawingml/2006/main" noChangeAspect="1"/>
+            </wp:cNvGraphicFramePr>
+            <a:graphic xmlns:a="http://schemas.openxmlformats.org/drawingml/2006/main">
+              <a:graphicData uri="http://schemas.openxmlformats.org/drawingml/2006/picture">
+                <pic:pic xmlns:pic="http://schemas.openxmlformats.org/drawingml/2006/picture">
+                  <pic:nvPicPr>
+                    <pic:cNvPr id="0" name="" descr=""/>
+                    <pic:cNvPicPr>
+                      <a:picLocks noChangeAspect="1" noChangeArrowheads="1"/>
+                    </pic:cNvPicPr>
+                  </pic:nvPicPr>
+                  <pic:blipFill>
+                    <a:blip r:embed="rId19" cstate="none"/>
+                    <a:srcRect/>
+                    <a:stretch>
+                      <a:fillRect/>
+                    </a:stretch>
+                  </pic:blipFill>
+                  <pic:spPr bwMode="auto">
+                    <a:xfrm>
+                      <a:off x="0" y="0"/>
+                      <a:ext cx="5762625" cy="1571625"/>
+                    </a:xfrm>
+                    <a:prstGeom prst="rect">
+                      <a:avLst/>
+                    </a:prstGeom>
+                  </pic:spPr>
+                </pic:pic>
+              </a:graphicData>
+            </a:graphic>
+          </wp:inline>
+        </w:drawing>
+      </w:r>
+    </w:p>
+    <w:p>
+      <w:pPr>
+        <w:spacing w:after="200"/>
+        <w:jc w:val="center"/>
+      </w:pPr>
+      <w:r>
+        <w:rPr>
+          <w:rFonts w:ascii="Arial" w:cs="Arial" w:eastAsia="Arial" w:hAnsi="Arial"/>
+          <w:i/>
+          <w:iCs/>
+          <w:color w:val="5A5E54"/>
+          <w:sz w:val="18"/>
+          <w:szCs w:val="18"/>
+        </w:rPr>
+        <w:t xml:space="preserve">Ogni caricamento crea una nuova versione; le precedenti restano consultabili</w:t>
       </w:r>
     </w:p>
     <w:p>
@@ -14818,7 +15403,7 @@
         </w:pBdr>
         <w:spacing w:after="240" w:before="0"/>
       </w:pPr>
-      <w:bookmarkStart w:name="cap6" w:id="1"/>
+      <w:bookmarkStart w:name="cap6" w:id="24"/>
       <w:r>
         <w:rPr>
           <w:rFonts w:ascii="Arial" w:cs="Arial" w:eastAsia="Arial" w:hAnsi="Arial"/>
@@ -14830,7 +15415,7 @@
         </w:rPr>
         <w:t xml:space="preserve">6. Rispondere a una richiesta di integrazione</w:t>
       </w:r>
-      <w:bookmarkEnd w:id="1"/>
+      <w:bookmarkEnd w:id="24"/>
     </w:p>
     <w:p>
       <w:pPr>
@@ -15163,7 +15748,7 @@
         </w:pBdr>
         <w:spacing w:after="240" w:before="0"/>
       </w:pPr>
-      <w:bookmarkStart w:name="cap7" w:id="1"/>
+      <w:bookmarkStart w:name="cap7" w:id="25"/>
       <w:r>
         <w:rPr>
           <w:rFonts w:ascii="Arial" w:cs="Arial" w:eastAsia="Arial" w:hAnsi="Arial"/>
@@ -15175,7 +15760,7 @@
         </w:rPr>
         <w:t xml:space="preserve">7. Feedback pubblico</w:t>
       </w:r>
-      <w:bookmarkEnd w:id="1"/>
+      <w:bookmarkEnd w:id="25"/>
     </w:p>
     <w:p>
       <w:pPr>
@@ -15233,6 +15818,134 @@
     </w:p>
     <w:p>
       <w:pPr>
+        <w:keepNext/>
+        <w:spacing w:after="60" w:before="120"/>
+        <w:jc w:val="center"/>
+      </w:pPr>
+      <w:r>
+        <w:drawing>
+          <wp:inline distT="0" distB="0" distL="0" distR="0">
+            <wp:extent cx="5762625" cy="1695450"/>
+            <wp:effectExtent t="0" r="0" b="0" l="0"/>
+            <wp:docPr id="32" name="" descr="" title=""/>
+            <wp:cNvGraphicFramePr>
+              <a:graphicFrameLocks xmlns:a="http://schemas.openxmlformats.org/drawingml/2006/main" noChangeAspect="1"/>
+            </wp:cNvGraphicFramePr>
+            <a:graphic xmlns:a="http://schemas.openxmlformats.org/drawingml/2006/main">
+              <a:graphicData uri="http://schemas.openxmlformats.org/drawingml/2006/picture">
+                <pic:pic xmlns:pic="http://schemas.openxmlformats.org/drawingml/2006/picture">
+                  <pic:nvPicPr>
+                    <pic:cNvPr id="0" name="" descr=""/>
+                    <pic:cNvPicPr>
+                      <a:picLocks noChangeAspect="1" noChangeArrowheads="1"/>
+                    </pic:cNvPicPr>
+                  </pic:nvPicPr>
+                  <pic:blipFill>
+                    <a:blip r:embed="rId20" cstate="none"/>
+                    <a:srcRect/>
+                    <a:stretch>
+                      <a:fillRect/>
+                    </a:stretch>
+                  </pic:blipFill>
+                  <pic:spPr bwMode="auto">
+                    <a:xfrm>
+                      <a:off x="0" y="0"/>
+                      <a:ext cx="5762625" cy="1695450"/>
+                    </a:xfrm>
+                    <a:prstGeom prst="rect">
+                      <a:avLst/>
+                    </a:prstGeom>
+                  </pic:spPr>
+                </pic:pic>
+              </a:graphicData>
+            </a:graphic>
+          </wp:inline>
+        </w:drawing>
+      </w:r>
+    </w:p>
+    <w:p>
+      <w:pPr>
+        <w:spacing w:after="200"/>
+        <w:jc w:val="center"/>
+      </w:pPr>
+      <w:r>
+        <w:rPr>
+          <w:rFonts w:ascii="Arial" w:cs="Arial" w:eastAsia="Arial" w:hAnsi="Arial"/>
+          <w:i/>
+          <w:iCs/>
+          <w:color w:val="5A5E54"/>
+          <w:sz w:val="18"/>
+          <w:szCs w:val="18"/>
+        </w:rPr>
+        <w:t xml:space="preserve">Il riquadro Feedback pubblico nella pratica, con le osservazioni ricevute</w:t>
+      </w:r>
+    </w:p>
+    <w:p>
+      <w:pPr>
+        <w:keepNext/>
+        <w:spacing w:after="60" w:before="120"/>
+        <w:jc w:val="center"/>
+      </w:pPr>
+      <w:r>
+        <w:drawing>
+          <wp:inline distT="0" distB="0" distL="0" distR="0">
+            <wp:extent cx="5762625" cy="2190750"/>
+            <wp:effectExtent t="0" r="0" b="0" l="0"/>
+            <wp:docPr id="33" name="" descr="" title=""/>
+            <wp:cNvGraphicFramePr>
+              <a:graphicFrameLocks xmlns:a="http://schemas.openxmlformats.org/drawingml/2006/main" noChangeAspect="1"/>
+            </wp:cNvGraphicFramePr>
+            <a:graphic xmlns:a="http://schemas.openxmlformats.org/drawingml/2006/main">
+              <a:graphicData uri="http://schemas.openxmlformats.org/drawingml/2006/picture">
+                <pic:pic xmlns:pic="http://schemas.openxmlformats.org/drawingml/2006/picture">
+                  <pic:nvPicPr>
+                    <pic:cNvPr id="0" name="" descr=""/>
+                    <pic:cNvPicPr>
+                      <a:picLocks noChangeAspect="1" noChangeArrowheads="1"/>
+                    </pic:cNvPicPr>
+                  </pic:nvPicPr>
+                  <pic:blipFill>
+                    <a:blip r:embed="rId21" cstate="none"/>
+                    <a:srcRect/>
+                    <a:stretch>
+                      <a:fillRect/>
+                    </a:stretch>
+                  </pic:blipFill>
+                  <pic:spPr bwMode="auto">
+                    <a:xfrm>
+                      <a:off x="0" y="0"/>
+                      <a:ext cx="5762625" cy="2190750"/>
+                    </a:xfrm>
+                    <a:prstGeom prst="rect">
+                      <a:avLst/>
+                    </a:prstGeom>
+                  </pic:spPr>
+                </pic:pic>
+              </a:graphicData>
+            </a:graphic>
+          </wp:inline>
+        </w:drawing>
+      </w:r>
+    </w:p>
+    <w:p>
+      <w:pPr>
+        <w:spacing w:after="200"/>
+        <w:jc w:val="center"/>
+      </w:pPr>
+      <w:r>
+        <w:rPr>
+          <w:rFonts w:ascii="Arial" w:cs="Arial" w:eastAsia="Arial" w:hAnsi="Arial"/>
+          <w:i/>
+          <w:iCs/>
+          <w:color w:val="5A5E54"/>
+          <w:sz w:val="18"/>
+          <w:szCs w:val="18"/>
+        </w:rPr>
+        <w:t xml:space="preserve">La pagina pubblica del feedback, aperta a tutti</w:t>
+      </w:r>
+    </w:p>
+    <w:p>
+      <w:pPr>
         <w:spacing w:after="140" w:line="300"/>
       </w:pPr>
       <w:r>
@@ -15275,7 +15988,7 @@
         </w:rPr>
         <w:t xml:space="preserve"> (</w:t>
       </w:r>
-      <w:hyperlink w:history="1" r:id="rIddzu4m6ev_rtxosobnictc">
+      <w:hyperlink w:history="1" r:id="rIdlkczy7s8l3cvr5959lrtt">
         <w:r>
           <w:rPr>
             <w:rFonts w:ascii="Arial" w:cs="Arial" w:eastAsia="Arial" w:hAnsi="Arial"/>
@@ -15702,7 +16415,7 @@
         </w:pBdr>
         <w:spacing w:after="240" w:before="0"/>
       </w:pPr>
-      <w:bookmarkStart w:name="cap8" w:id="1"/>
+      <w:bookmarkStart w:name="cap8" w:id="26"/>
       <w:r>
         <w:rPr>
           <w:rFonts w:ascii="Arial" w:cs="Arial" w:eastAsia="Arial" w:hAnsi="Arial"/>
@@ -15714,7 +16427,7 @@
         </w:rPr>
         <w:t xml:space="preserve">8. Messaggi con la Fondazione</w:t>
       </w:r>
-      <w:bookmarkEnd w:id="1"/>
+      <w:bookmarkEnd w:id="26"/>
     </w:p>
     <w:p>
       <w:pPr>
@@ -15748,6 +16461,70 @@
           <w:szCs w:val="21"/>
         </w:rPr>
         <w:t xml:space="preserve"> è una conversazione tra il vostro ente e Fondazione Operate su quella pratica.</w:t>
+      </w:r>
+    </w:p>
+    <w:p>
+      <w:pPr>
+        <w:keepNext/>
+        <w:spacing w:after="60" w:before="120"/>
+        <w:jc w:val="center"/>
+      </w:pPr>
+      <w:r>
+        <w:drawing>
+          <wp:inline distT="0" distB="0" distL="0" distR="0">
+            <wp:extent cx="5762625" cy="1171575"/>
+            <wp:effectExtent t="0" r="0" b="0" l="0"/>
+            <wp:docPr id="34" name="" descr="" title=""/>
+            <wp:cNvGraphicFramePr>
+              <a:graphicFrameLocks xmlns:a="http://schemas.openxmlformats.org/drawingml/2006/main" noChangeAspect="1"/>
+            </wp:cNvGraphicFramePr>
+            <a:graphic xmlns:a="http://schemas.openxmlformats.org/drawingml/2006/main">
+              <a:graphicData uri="http://schemas.openxmlformats.org/drawingml/2006/picture">
+                <pic:pic xmlns:pic="http://schemas.openxmlformats.org/drawingml/2006/picture">
+                  <pic:nvPicPr>
+                    <pic:cNvPr id="0" name="" descr=""/>
+                    <pic:cNvPicPr>
+                      <a:picLocks noChangeAspect="1" noChangeArrowheads="1"/>
+                    </pic:cNvPicPr>
+                  </pic:nvPicPr>
+                  <pic:blipFill>
+                    <a:blip r:embed="rId22" cstate="none"/>
+                    <a:srcRect/>
+                    <a:stretch>
+                      <a:fillRect/>
+                    </a:stretch>
+                  </pic:blipFill>
+                  <pic:spPr bwMode="auto">
+                    <a:xfrm>
+                      <a:off x="0" y="0"/>
+                      <a:ext cx="5762625" cy="1171575"/>
+                    </a:xfrm>
+                    <a:prstGeom prst="rect">
+                      <a:avLst/>
+                    </a:prstGeom>
+                  </pic:spPr>
+                </pic:pic>
+              </a:graphicData>
+            </a:graphic>
+          </wp:inline>
+        </w:drawing>
+      </w:r>
+    </w:p>
+    <w:p>
+      <w:pPr>
+        <w:spacing w:after="200"/>
+        <w:jc w:val="center"/>
+      </w:pPr>
+      <w:r>
+        <w:rPr>
+          <w:rFonts w:ascii="Arial" w:cs="Arial" w:eastAsia="Arial" w:hAnsi="Arial"/>
+          <w:i/>
+          <w:iCs/>
+          <w:color w:val="5A5E54"/>
+          <w:sz w:val="18"/>
+          <w:szCs w:val="18"/>
+        </w:rPr>
+        <w:t xml:space="preserve">La sezione Messaggi della pratica</w:t>
       </w:r>
     </w:p>
     <w:p>
@@ -15836,7 +16613,7 @@
         </w:pBdr>
         <w:spacing w:after="240" w:before="0"/>
       </w:pPr>
-      <w:bookmarkStart w:name="cap9" w:id="1"/>
+      <w:bookmarkStart w:name="cap9" w:id="27"/>
       <w:r>
         <w:rPr>
           <w:rFonts w:ascii="Arial" w:cs="Arial" w:eastAsia="Arial" w:hAnsi="Arial"/>
@@ -15848,7 +16625,7 @@
         </w:rPr>
         <w:t xml:space="preserve">9. Rapporti di monitoraggio e pagamenti</w:t>
       </w:r>
-      <w:bookmarkEnd w:id="1"/>
+      <w:bookmarkEnd w:id="27"/>
     </w:p>
     <w:p>
       <w:pPr>
@@ -15882,6 +16659,134 @@
           <w:szCs w:val="21"/>
         </w:rPr>
         <w:t xml:space="preserve">. Il numero massimo dipende dal periodo di riferimento del Progetto:</w:t>
+      </w:r>
+    </w:p>
+    <w:p>
+      <w:pPr>
+        <w:keepNext/>
+        <w:spacing w:after="60" w:before="120"/>
+        <w:jc w:val="center"/>
+      </w:pPr>
+      <w:r>
+        <w:drawing>
+          <wp:inline distT="0" distB="0" distL="0" distR="0">
+            <wp:extent cx="5762625" cy="733425"/>
+            <wp:effectExtent t="0" r="0" b="0" l="0"/>
+            <wp:docPr id="35" name="" descr="" title=""/>
+            <wp:cNvGraphicFramePr>
+              <a:graphicFrameLocks xmlns:a="http://schemas.openxmlformats.org/drawingml/2006/main" noChangeAspect="1"/>
+            </wp:cNvGraphicFramePr>
+            <a:graphic xmlns:a="http://schemas.openxmlformats.org/drawingml/2006/main">
+              <a:graphicData uri="http://schemas.openxmlformats.org/drawingml/2006/picture">
+                <pic:pic xmlns:pic="http://schemas.openxmlformats.org/drawingml/2006/picture">
+                  <pic:nvPicPr>
+                    <pic:cNvPr id="0" name="" descr=""/>
+                    <pic:cNvPicPr>
+                      <a:picLocks noChangeAspect="1" noChangeArrowheads="1"/>
+                    </pic:cNvPicPr>
+                  </pic:nvPicPr>
+                  <pic:blipFill>
+                    <a:blip r:embed="rId23" cstate="none"/>
+                    <a:srcRect/>
+                    <a:stretch>
+                      <a:fillRect/>
+                    </a:stretch>
+                  </pic:blipFill>
+                  <pic:spPr bwMode="auto">
+                    <a:xfrm>
+                      <a:off x="0" y="0"/>
+                      <a:ext cx="5762625" cy="733425"/>
+                    </a:xfrm>
+                    <a:prstGeom prst="rect">
+                      <a:avLst/>
+                    </a:prstGeom>
+                  </pic:spPr>
+                </pic:pic>
+              </a:graphicData>
+            </a:graphic>
+          </wp:inline>
+        </w:drawing>
+      </w:r>
+    </w:p>
+    <w:p>
+      <w:pPr>
+        <w:spacing w:after="200"/>
+        <w:jc w:val="center"/>
+      </w:pPr>
+      <w:r>
+        <w:rPr>
+          <w:rFonts w:ascii="Arial" w:cs="Arial" w:eastAsia="Arial" w:hAnsi="Arial"/>
+          <w:i/>
+          <w:iCs/>
+          <w:color w:val="5A5E54"/>
+          <w:sz w:val="18"/>
+          <w:szCs w:val="18"/>
+        </w:rPr>
+        <w:t xml:space="preserve">L'elenco dei Rapporti di Monitoraggio dentro il Progetto</w:t>
+      </w:r>
+    </w:p>
+    <w:p>
+      <w:pPr>
+        <w:keepNext/>
+        <w:spacing w:after="60" w:before="120"/>
+        <w:jc w:val="center"/>
+      </w:pPr>
+      <w:r>
+        <w:drawing>
+          <wp:inline distT="0" distB="0" distL="0" distR="0">
+            <wp:extent cx="5762625" cy="3152775"/>
+            <wp:effectExtent t="0" r="0" b="0" l="0"/>
+            <wp:docPr id="36" name="" descr="" title=""/>
+            <wp:cNvGraphicFramePr>
+              <a:graphicFrameLocks xmlns:a="http://schemas.openxmlformats.org/drawingml/2006/main" noChangeAspect="1"/>
+            </wp:cNvGraphicFramePr>
+            <a:graphic xmlns:a="http://schemas.openxmlformats.org/drawingml/2006/main">
+              <a:graphicData uri="http://schemas.openxmlformats.org/drawingml/2006/picture">
+                <pic:pic xmlns:pic="http://schemas.openxmlformats.org/drawingml/2006/picture">
+                  <pic:nvPicPr>
+                    <pic:cNvPr id="0" name="" descr=""/>
+                    <pic:cNvPicPr>
+                      <a:picLocks noChangeAspect="1" noChangeArrowheads="1"/>
+                    </pic:cNvPicPr>
+                  </pic:nvPicPr>
+                  <pic:blipFill>
+                    <a:blip r:embed="rId24" cstate="none"/>
+                    <a:srcRect/>
+                    <a:stretch>
+                      <a:fillRect/>
+                    </a:stretch>
+                  </pic:blipFill>
+                  <pic:spPr bwMode="auto">
+                    <a:xfrm>
+                      <a:off x="0" y="0"/>
+                      <a:ext cx="5762625" cy="3152775"/>
+                    </a:xfrm>
+                    <a:prstGeom prst="rect">
+                      <a:avLst/>
+                    </a:prstGeom>
+                  </pic:spPr>
+                </pic:pic>
+              </a:graphicData>
+            </a:graphic>
+          </wp:inline>
+        </w:drawing>
+      </w:r>
+    </w:p>
+    <w:p>
+      <w:pPr>
+        <w:spacing w:after="200"/>
+        <w:jc w:val="center"/>
+      </w:pPr>
+      <w:r>
+        <w:rPr>
+          <w:rFonts w:ascii="Arial" w:cs="Arial" w:eastAsia="Arial" w:hAnsi="Arial"/>
+          <w:i/>
+          <w:iCs/>
+          <w:color w:val="5A5E54"/>
+          <w:sz w:val="18"/>
+          <w:szCs w:val="18"/>
+        </w:rPr>
+        <w:t xml:space="preserve">Un Rapporto di Monitoraggio aperto, con il collegamento Torna al Progetto</w:t>
       </w:r>
     </w:p>
     <w:tbl>
@@ -16648,7 +17553,7 @@
         </w:pBdr>
         <w:spacing w:after="240" w:before="0"/>
       </w:pPr>
-      <w:bookmarkStart w:name="cap10" w:id="1"/>
+      <w:bookmarkStart w:name="cap10" w:id="28"/>
       <w:r>
         <w:rPr>
           <w:rFonts w:ascii="Arial" w:cs="Arial" w:eastAsia="Arial" w:hAnsi="Arial"/>
@@ -16660,7 +17565,7 @@
         </w:rPr>
         <w:t xml:space="preserve">10. Crediti emessi</w:t>
       </w:r>
-      <w:bookmarkEnd w:id="1"/>
+      <w:bookmarkEnd w:id="28"/>
     </w:p>
     <w:p>
       <w:pPr>
@@ -17072,7 +17977,7 @@
         </w:pBdr>
         <w:spacing w:after="240" w:before="0"/>
       </w:pPr>
-      <w:bookmarkStart w:name="cap11" w:id="1"/>
+      <w:bookmarkStart w:name="cap11" w:id="29"/>
       <w:r>
         <w:rPr>
           <w:rFonts w:ascii="Arial" w:cs="Arial" w:eastAsia="Arial" w:hAnsi="Arial"/>
@@ -17084,7 +17989,7 @@
         </w:rPr>
         <w:t xml:space="preserve">11. I tuoi documenti</w:t>
       </w:r>
-      <w:bookmarkEnd w:id="1"/>
+      <w:bookmarkEnd w:id="29"/>
     </w:p>
     <w:p>
       <w:pPr>
@@ -17118,6 +18023,70 @@
           <w:szCs w:val="21"/>
         </w:rPr>
         <w:t xml:space="preserve"> (menu in alto) raccoglie in un solo posto i documenti generali di tutte le vostre pratiche, Progetti e Rapporti: contratto, allegati, documentazione amministrativa e così via. I documenti delle singole fasi restano dentro le fasi.</w:t>
+      </w:r>
+    </w:p>
+    <w:p>
+      <w:pPr>
+        <w:keepNext/>
+        <w:spacing w:after="60" w:before="120"/>
+        <w:jc w:val="center"/>
+      </w:pPr>
+      <w:r>
+        <w:drawing>
+          <wp:inline distT="0" distB="0" distL="0" distR="0">
+            <wp:extent cx="5762625" cy="3514725"/>
+            <wp:effectExtent t="0" r="0" b="0" l="0"/>
+            <wp:docPr id="37" name="" descr="" title=""/>
+            <wp:cNvGraphicFramePr>
+              <a:graphicFrameLocks xmlns:a="http://schemas.openxmlformats.org/drawingml/2006/main" noChangeAspect="1"/>
+            </wp:cNvGraphicFramePr>
+            <a:graphic xmlns:a="http://schemas.openxmlformats.org/drawingml/2006/main">
+              <a:graphicData uri="http://schemas.openxmlformats.org/drawingml/2006/picture">
+                <pic:pic xmlns:pic="http://schemas.openxmlformats.org/drawingml/2006/picture">
+                  <pic:nvPicPr>
+                    <pic:cNvPr id="0" name="" descr=""/>
+                    <pic:cNvPicPr>
+                      <a:picLocks noChangeAspect="1" noChangeArrowheads="1"/>
+                    </pic:cNvPicPr>
+                  </pic:nvPicPr>
+                  <pic:blipFill>
+                    <a:blip r:embed="rId25" cstate="none"/>
+                    <a:srcRect/>
+                    <a:stretch>
+                      <a:fillRect/>
+                    </a:stretch>
+                  </pic:blipFill>
+                  <pic:spPr bwMode="auto">
+                    <a:xfrm>
+                      <a:off x="0" y="0"/>
+                      <a:ext cx="5762625" cy="3514725"/>
+                    </a:xfrm>
+                    <a:prstGeom prst="rect">
+                      <a:avLst/>
+                    </a:prstGeom>
+                  </pic:spPr>
+                </pic:pic>
+              </a:graphicData>
+            </a:graphic>
+          </wp:inline>
+        </w:drawing>
+      </w:r>
+    </w:p>
+    <w:p>
+      <w:pPr>
+        <w:spacing w:after="200"/>
+        <w:jc w:val="center"/>
+      </w:pPr>
+      <w:r>
+        <w:rPr>
+          <w:rFonts w:ascii="Arial" w:cs="Arial" w:eastAsia="Arial" w:hAnsi="Arial"/>
+          <w:i/>
+          <w:iCs/>
+          <w:color w:val="5A5E54"/>
+          <w:sz w:val="18"/>
+          <w:szCs w:val="18"/>
+        </w:rPr>
+        <w:t xml:space="preserve">La pagina I tuoi documenti, con i modelli del Programma da scaricare</w:t>
       </w:r>
     </w:p>
     <w:p>
@@ -17364,7 +18333,7 @@
         </w:pBdr>
         <w:spacing w:after="240" w:before="0"/>
       </w:pPr>
-      <w:bookmarkStart w:name="cap12" w:id="1"/>
+      <w:bookmarkStart w:name="cap12" w:id="30"/>
       <w:r>
         <w:rPr>
           <w:rFonts w:ascii="Arial" w:cs="Arial" w:eastAsia="Arial" w:hAnsi="Arial"/>
@@ -17376,7 +18345,7 @@
         </w:rPr>
         <w:t xml:space="preserve">12. Notifiche ed email</w:t>
       </w:r>
-      <w:bookmarkEnd w:id="1"/>
+      <w:bookmarkEnd w:id="30"/>
     </w:p>
     <w:p>
       <w:pPr>
@@ -17430,6 +18399,70 @@
           <w:szCs w:val="21"/>
         </w:rPr>
         <w:t xml:space="preserve"> all'indirizzo con cui accedete.</w:t>
+      </w:r>
+    </w:p>
+    <w:p>
+      <w:pPr>
+        <w:keepNext/>
+        <w:spacing w:after="60" w:before="120"/>
+        <w:jc w:val="center"/>
+      </w:pPr>
+      <w:r>
+        <w:drawing>
+          <wp:inline distT="0" distB="0" distL="0" distR="0">
+            <wp:extent cx="4467225" cy="2286000"/>
+            <wp:effectExtent t="0" r="0" b="0" l="0"/>
+            <wp:docPr id="38" name="" descr="" title=""/>
+            <wp:cNvGraphicFramePr>
+              <a:graphicFrameLocks xmlns:a="http://schemas.openxmlformats.org/drawingml/2006/main" noChangeAspect="1"/>
+            </wp:cNvGraphicFramePr>
+            <a:graphic xmlns:a="http://schemas.openxmlformats.org/drawingml/2006/main">
+              <a:graphicData uri="http://schemas.openxmlformats.org/drawingml/2006/picture">
+                <pic:pic xmlns:pic="http://schemas.openxmlformats.org/drawingml/2006/picture">
+                  <pic:nvPicPr>
+                    <pic:cNvPr id="0" name="" descr=""/>
+                    <pic:cNvPicPr>
+                      <a:picLocks noChangeAspect="1" noChangeArrowheads="1"/>
+                    </pic:cNvPicPr>
+                  </pic:nvPicPr>
+                  <pic:blipFill>
+                    <a:blip r:embed="rId26" cstate="none"/>
+                    <a:srcRect/>
+                    <a:stretch>
+                      <a:fillRect/>
+                    </a:stretch>
+                  </pic:blipFill>
+                  <pic:spPr bwMode="auto">
+                    <a:xfrm>
+                      <a:off x="0" y="0"/>
+                      <a:ext cx="4467225" cy="2286000"/>
+                    </a:xfrm>
+                    <a:prstGeom prst="rect">
+                      <a:avLst/>
+                    </a:prstGeom>
+                  </pic:spPr>
+                </pic:pic>
+              </a:graphicData>
+            </a:graphic>
+          </wp:inline>
+        </w:drawing>
+      </w:r>
+    </w:p>
+    <w:p>
+      <w:pPr>
+        <w:spacing w:after="200"/>
+        <w:jc w:val="center"/>
+      </w:pPr>
+      <w:r>
+        <w:rPr>
+          <w:rFonts w:ascii="Arial" w:cs="Arial" w:eastAsia="Arial" w:hAnsi="Arial"/>
+          <w:i/>
+          <w:iCs/>
+          <w:color w:val="5A5E54"/>
+          <w:sz w:val="18"/>
+          <w:szCs w:val="18"/>
+        </w:rPr>
+        <w:t xml:space="preserve">Il pannello delle notifiche: le non lette sono evidenziate</w:t>
       </w:r>
     </w:p>
     <w:p>
@@ -18940,7 +19973,7 @@
         </w:pBdr>
         <w:spacing w:after="240" w:before="0"/>
       </w:pPr>
-      <w:bookmarkStart w:name="cap13" w:id="1"/>
+      <w:bookmarkStart w:name="cap13" w:id="31"/>
       <w:r>
         <w:rPr>
           <w:rFonts w:ascii="Arial" w:cs="Arial" w:eastAsia="Arial" w:hAnsi="Arial"/>
@@ -18952,7 +19985,7 @@
         </w:rPr>
         <w:t xml:space="preserve">13. Dati per il calcolo dei crediti</w:t>
       </w:r>
-      <w:bookmarkEnd w:id="1"/>
+      <w:bookmarkEnd w:id="31"/>
     </w:p>
     <w:p>
       <w:pPr>
@@ -18987,7 +20020,7 @@
         </w:rPr>
         <w:t xml:space="preserve">, uguale per tutti gli enti. Il modello si scarica dalla pagina pubblica </w:t>
       </w:r>
-      <w:hyperlink w:history="1" r:id="rIdalh9jmqczulpxzkorv8nf">
+      <w:hyperlink w:history="1" r:id="rIdozjessxxfhrnzghvcn_al">
         <w:r>
           <w:rPr>
             <w:rFonts w:ascii="Arial" w:cs="Arial" w:eastAsia="Arial" w:hAnsi="Arial"/>
@@ -19027,6 +20060,70 @@
           <w:szCs w:val="21"/>
         </w:rPr>
         <w:t xml:space="preserve"> del menu.</w:t>
+      </w:r>
+    </w:p>
+    <w:p>
+      <w:pPr>
+        <w:keepNext/>
+        <w:spacing w:after="60" w:before="120"/>
+        <w:jc w:val="center"/>
+      </w:pPr>
+      <w:r>
+        <w:drawing>
+          <wp:inline distT="0" distB="0" distL="0" distR="0">
+            <wp:extent cx="5762625" cy="5543550"/>
+            <wp:effectExtent t="0" r="0" b="0" l="0"/>
+            <wp:docPr id="39" name="" descr="" title=""/>
+            <wp:cNvGraphicFramePr>
+              <a:graphicFrameLocks xmlns:a="http://schemas.openxmlformats.org/drawingml/2006/main" noChangeAspect="1"/>
+            </wp:cNvGraphicFramePr>
+            <a:graphic xmlns:a="http://schemas.openxmlformats.org/drawingml/2006/main">
+              <a:graphicData uri="http://schemas.openxmlformats.org/drawingml/2006/picture">
+                <pic:pic xmlns:pic="http://schemas.openxmlformats.org/drawingml/2006/picture">
+                  <pic:nvPicPr>
+                    <pic:cNvPr id="0" name="" descr=""/>
+                    <pic:cNvPicPr>
+                      <a:picLocks noChangeAspect="1" noChangeArrowheads="1"/>
+                    </pic:cNvPicPr>
+                  </pic:nvPicPr>
+                  <pic:blipFill>
+                    <a:blip r:embed="rId27" cstate="none"/>
+                    <a:srcRect/>
+                    <a:stretch>
+                      <a:fillRect/>
+                    </a:stretch>
+                  </pic:blipFill>
+                  <pic:spPr bwMode="auto">
+                    <a:xfrm>
+                      <a:off x="0" y="0"/>
+                      <a:ext cx="5762625" cy="5543550"/>
+                    </a:xfrm>
+                    <a:prstGeom prst="rect">
+                      <a:avLst/>
+                    </a:prstGeom>
+                  </pic:spPr>
+                </pic:pic>
+              </a:graphicData>
+            </a:graphic>
+          </wp:inline>
+        </w:drawing>
+      </w:r>
+    </w:p>
+    <w:p>
+      <w:pPr>
+        <w:spacing w:after="200"/>
+        <w:jc w:val="center"/>
+      </w:pPr>
+      <w:r>
+        <w:rPr>
+          <w:rFonts w:ascii="Arial" w:cs="Arial" w:eastAsia="Arial" w:hAnsi="Arial"/>
+          <w:i/>
+          <w:iCs/>
+          <w:color w:val="5A5E54"/>
+          <w:sz w:val="18"/>
+          <w:szCs w:val="18"/>
+        </w:rPr>
+        <w:t xml:space="preserve">La pagina pubblica Formato dei dati, da cui si scarica il Tracciato dati CWP</w:t>
       </w:r>
     </w:p>
     <w:p>
@@ -22394,7 +23491,7 @@
         </w:pBdr>
         <w:spacing w:after="240" w:before="0"/>
       </w:pPr>
-      <w:bookmarkStart w:name="cap14" w:id="1"/>
+      <w:bookmarkStart w:name="cap14" w:id="32"/>
       <w:r>
         <w:rPr>
           <w:rFonts w:ascii="Arial" w:cs="Arial" w:eastAsia="Arial" w:hAnsi="Arial"/>
@@ -22406,7 +23503,7 @@
         </w:rPr>
         <w:t xml:space="preserve">14. Reclami e richieste di chiarimento</w:t>
       </w:r>
-      <w:bookmarkEnd w:id="1"/>
+      <w:bookmarkEnd w:id="32"/>
     </w:p>
     <w:p>
       <w:pPr>
@@ -22460,6 +23557,70 @@
           <w:szCs w:val="21"/>
         </w:rPr>
         <w:t xml:space="preserve">, secondo la Politica di reclamo del Programma. Potete scrivere in qualsiasi momento: ricevete una conferma e poi una risposta scritta. Qui si trattano soprattutto l'interpretazione delle regole e dei criteri del Programma. Per una questione con un ente di validazione e verifica o con un registro, rivolgetevi prima a loro.</w:t>
+      </w:r>
+    </w:p>
+    <w:p>
+      <w:pPr>
+        <w:keepNext/>
+        <w:spacing w:after="60" w:before="120"/>
+        <w:jc w:val="center"/>
+      </w:pPr>
+      <w:r>
+        <w:drawing>
+          <wp:inline distT="0" distB="0" distL="0" distR="0">
+            <wp:extent cx="5762625" cy="3648075"/>
+            <wp:effectExtent t="0" r="0" b="0" l="0"/>
+            <wp:docPr id="40" name="" descr="" title=""/>
+            <wp:cNvGraphicFramePr>
+              <a:graphicFrameLocks xmlns:a="http://schemas.openxmlformats.org/drawingml/2006/main" noChangeAspect="1"/>
+            </wp:cNvGraphicFramePr>
+            <a:graphic xmlns:a="http://schemas.openxmlformats.org/drawingml/2006/main">
+              <a:graphicData uri="http://schemas.openxmlformats.org/drawingml/2006/picture">
+                <pic:pic xmlns:pic="http://schemas.openxmlformats.org/drawingml/2006/picture">
+                  <pic:nvPicPr>
+                    <pic:cNvPr id="0" name="" descr=""/>
+                    <pic:cNvPicPr>
+                      <a:picLocks noChangeAspect="1" noChangeArrowheads="1"/>
+                    </pic:cNvPicPr>
+                  </pic:nvPicPr>
+                  <pic:blipFill>
+                    <a:blip r:embed="rId28" cstate="none"/>
+                    <a:srcRect/>
+                    <a:stretch>
+                      <a:fillRect/>
+                    </a:stretch>
+                  </pic:blipFill>
+                  <pic:spPr bwMode="auto">
+                    <a:xfrm>
+                      <a:off x="0" y="0"/>
+                      <a:ext cx="5762625" cy="3648075"/>
+                    </a:xfrm>
+                    <a:prstGeom prst="rect">
+                      <a:avLst/>
+                    </a:prstGeom>
+                  </pic:spPr>
+                </pic:pic>
+              </a:graphicData>
+            </a:graphic>
+          </wp:inline>
+        </w:drawing>
+      </w:r>
+    </w:p>
+    <w:p>
+      <w:pPr>
+        <w:spacing w:after="200"/>
+        <w:jc w:val="center"/>
+      </w:pPr>
+      <w:r>
+        <w:rPr>
+          <w:rFonts w:ascii="Arial" w:cs="Arial" w:eastAsia="Arial" w:hAnsi="Arial"/>
+          <w:i/>
+          <w:iCs/>
+          <w:color w:val="5A5E54"/>
+          <w:sz w:val="18"/>
+          <w:szCs w:val="18"/>
+        </w:rPr>
+        <w:t xml:space="preserve">Il modulo per inviare un reclamo o una richiesta di chiarimento</w:t>
       </w:r>
     </w:p>
     <w:p>
@@ -23169,7 +24330,7 @@
         </w:pBdr>
         <w:spacing w:after="240" w:before="0"/>
       </w:pPr>
-      <w:bookmarkStart w:name="cap15" w:id="1"/>
+      <w:bookmarkStart w:name="cap15" w:id="33"/>
       <w:r>
         <w:rPr>
           <w:rFonts w:ascii="Arial" w:cs="Arial" w:eastAsia="Arial" w:hAnsi="Arial"/>
@@ -23181,7 +24342,7 @@
         </w:rPr>
         <w:t xml:space="preserve">15. La pagina pubblica del Programma</w:t>
       </w:r>
-      <w:bookmarkEnd w:id="1"/>
+      <w:bookmarkEnd w:id="33"/>
     </w:p>
     <w:p>
       <w:pPr>
@@ -23216,7 +24377,7 @@
         </w:rPr>
         <w:t xml:space="preserve"> (</w:t>
       </w:r>
-      <w:hyperlink w:history="1" r:id="rIdomcwjbs7rmbnrjr5ztyis">
+      <w:hyperlink w:history="1" r:id="rIdrqq8wh1cvbfprdukynuh5">
         <w:r>
           <w:rPr>
             <w:rFonts w:ascii="Arial" w:cs="Arial" w:eastAsia="Arial" w:hAnsi="Arial"/>
@@ -23260,6 +24421,70 @@
     </w:p>
     <w:p>
       <w:pPr>
+        <w:keepNext/>
+        <w:spacing w:after="60" w:before="120"/>
+        <w:jc w:val="center"/>
+      </w:pPr>
+      <w:r>
+        <w:drawing>
+          <wp:inline distT="0" distB="0" distL="0" distR="0">
+            <wp:extent cx="5762625" cy="5543550"/>
+            <wp:effectExtent t="0" r="0" b="0" l="0"/>
+            <wp:docPr id="41" name="" descr="" title=""/>
+            <wp:cNvGraphicFramePr>
+              <a:graphicFrameLocks xmlns:a="http://schemas.openxmlformats.org/drawingml/2006/main" noChangeAspect="1"/>
+            </wp:cNvGraphicFramePr>
+            <a:graphic xmlns:a="http://schemas.openxmlformats.org/drawingml/2006/main">
+              <a:graphicData uri="http://schemas.openxmlformats.org/drawingml/2006/picture">
+                <pic:pic xmlns:pic="http://schemas.openxmlformats.org/drawingml/2006/picture">
+                  <pic:nvPicPr>
+                    <pic:cNvPr id="0" name="" descr=""/>
+                    <pic:cNvPicPr>
+                      <a:picLocks noChangeAspect="1" noChangeArrowheads="1"/>
+                    </pic:cNvPicPr>
+                  </pic:nvPicPr>
+                  <pic:blipFill>
+                    <a:blip r:embed="rId29" cstate="none"/>
+                    <a:srcRect/>
+                    <a:stretch>
+                      <a:fillRect/>
+                    </a:stretch>
+                  </pic:blipFill>
+                  <pic:spPr bwMode="auto">
+                    <a:xfrm>
+                      <a:off x="0" y="0"/>
+                      <a:ext cx="5762625" cy="5543550"/>
+                    </a:xfrm>
+                    <a:prstGeom prst="rect">
+                      <a:avLst/>
+                    </a:prstGeom>
+                  </pic:spPr>
+                </pic:pic>
+              </a:graphicData>
+            </a:graphic>
+          </wp:inline>
+        </w:drawing>
+      </w:r>
+    </w:p>
+    <w:p>
+      <w:pPr>
+        <w:spacing w:after="200"/>
+        <w:jc w:val="center"/>
+      </w:pPr>
+      <w:r>
+        <w:rPr>
+          <w:rFonts w:ascii="Arial" w:cs="Arial" w:eastAsia="Arial" w:hAnsi="Arial"/>
+          <w:i/>
+          <w:iCs/>
+          <w:color w:val="5A5E54"/>
+          <w:sz w:val="18"/>
+          <w:szCs w:val="18"/>
+        </w:rPr>
+        <w:t xml:space="preserve">La pagina pubblica Il Programma</w:t>
+      </w:r>
+    </w:p>
+    <w:p>
+      <w:pPr>
         <w:spacing w:after="140" w:line="300"/>
       </w:pPr>
       <w:r>
@@ -23541,7 +24766,7 @@
         </w:pBdr>
         <w:spacing w:after="240" w:before="0"/>
       </w:pPr>
-      <w:bookmarkStart w:name="cap16" w:id="1"/>
+      <w:bookmarkStart w:name="cap16" w:id="34"/>
       <w:r>
         <w:rPr>
           <w:rFonts w:ascii="Arial" w:cs="Arial" w:eastAsia="Arial" w:hAnsi="Arial"/>
@@ -23553,7 +24778,7 @@
         </w:rPr>
         <w:t xml:space="preserve">16. L'assistente virtuale</w:t>
       </w:r>
-      <w:bookmarkEnd w:id="1"/>
+      <w:bookmarkEnd w:id="34"/>
     </w:p>
     <w:p>
       <w:pPr>
@@ -23587,6 +24812,70 @@
           <w:szCs w:val="21"/>
         </w:rPr>
         <w:t xml:space="preserve">: apre una chat con un assistente basato su intelligenza artificiale (Claude) che risponde alle domande sul portale e sul Programma, per esempio come caricare un documento, cosa fare con una richiesta di integrazione o quanto costa una voce del Programma.</w:t>
+      </w:r>
+    </w:p>
+    <w:p>
+      <w:pPr>
+        <w:keepNext/>
+        <w:spacing w:after="60" w:before="120"/>
+        <w:jc w:val="center"/>
+      </w:pPr>
+      <w:r>
+        <w:drawing>
+          <wp:inline distT="0" distB="0" distL="0" distR="0">
+            <wp:extent cx="3848100" cy="5372100"/>
+            <wp:effectExtent t="0" r="0" b="0" l="0"/>
+            <wp:docPr id="42" name="" descr="" title=""/>
+            <wp:cNvGraphicFramePr>
+              <a:graphicFrameLocks xmlns:a="http://schemas.openxmlformats.org/drawingml/2006/main" noChangeAspect="1"/>
+            </wp:cNvGraphicFramePr>
+            <a:graphic xmlns:a="http://schemas.openxmlformats.org/drawingml/2006/main">
+              <a:graphicData uri="http://schemas.openxmlformats.org/drawingml/2006/picture">
+                <pic:pic xmlns:pic="http://schemas.openxmlformats.org/drawingml/2006/picture">
+                  <pic:nvPicPr>
+                    <pic:cNvPr id="0" name="" descr=""/>
+                    <pic:cNvPicPr>
+                      <a:picLocks noChangeAspect="1" noChangeArrowheads="1"/>
+                    </pic:cNvPicPr>
+                  </pic:nvPicPr>
+                  <pic:blipFill>
+                    <a:blip r:embed="rId30" cstate="none"/>
+                    <a:srcRect/>
+                    <a:stretch>
+                      <a:fillRect/>
+                    </a:stretch>
+                  </pic:blipFill>
+                  <pic:spPr bwMode="auto">
+                    <a:xfrm>
+                      <a:off x="0" y="0"/>
+                      <a:ext cx="3848100" cy="5372100"/>
+                    </a:xfrm>
+                    <a:prstGeom prst="rect">
+                      <a:avLst/>
+                    </a:prstGeom>
+                  </pic:spPr>
+                </pic:pic>
+              </a:graphicData>
+            </a:graphic>
+          </wp:inline>
+        </w:drawing>
+      </w:r>
+    </w:p>
+    <w:p>
+      <w:pPr>
+        <w:spacing w:after="200"/>
+        <w:jc w:val="center"/>
+      </w:pPr>
+      <w:r>
+        <w:rPr>
+          <w:rFonts w:ascii="Arial" w:cs="Arial" w:eastAsia="Arial" w:hAnsi="Arial"/>
+          <w:i/>
+          <w:iCs/>
+          <w:color w:val="5A5E54"/>
+          <w:sz w:val="18"/>
+          <w:szCs w:val="18"/>
+        </w:rPr>
+        <w:t xml:space="preserve">Il pannello dell'assistente virtuale</w:t>
       </w:r>
     </w:p>
     <w:p>
@@ -23774,7 +25063,7 @@
         </w:pBdr>
         <w:spacing w:after="240" w:before="0"/>
       </w:pPr>
-      <w:bookmarkStart w:name="cap17" w:id="1"/>
+      <w:bookmarkStart w:name="cap17" w:id="35"/>
       <w:r>
         <w:rPr>
           <w:rFonts w:ascii="Arial" w:cs="Arial" w:eastAsia="Arial" w:hAnsi="Arial"/>
@@ -23786,7 +25075,7 @@
         </w:rPr>
         <w:t xml:space="preserve">17. Collegamento al portale</w:t>
       </w:r>
-      <w:bookmarkEnd w:id="1"/>
+      <w:bookmarkEnd w:id="35"/>
     </w:p>
     <w:p>
       <w:pPr>
@@ -24016,7 +25305,7 @@
         </w:pBdr>
         <w:spacing w:after="240" w:before="0"/>
       </w:pPr>
-      <w:bookmarkStart w:name="cap18" w:id="1"/>
+      <w:bookmarkStart w:name="cap18" w:id="36"/>
       <w:r>
         <w:rPr>
           <w:rFonts w:ascii="Arial" w:cs="Arial" w:eastAsia="Arial" w:hAnsi="Arial"/>
@@ -24028,7 +25317,7 @@
         </w:rPr>
         <w:t xml:space="preserve">18. Domande frequenti</w:t>
       </w:r>
-      <w:bookmarkEnd w:id="1"/>
+      <w:bookmarkEnd w:id="36"/>
     </w:p>
     <w:p>
       <w:pPr>
@@ -24361,8 +25650,8 @@
       </w:r>
     </w:p>
     <w:sectPr>
-      <w:headerReference w:type="default" r:id="rId9"/>
-      <w:footerReference w:type="default" r:id="rId10"/>
+      <w:headerReference w:type="default" r:id="rId8"/>
+      <w:footerReference w:type="default" r:id="rId9"/>
       <w:pgSz w:w="11906" w:h="16838" w:orient="portrait"/>
       <w:pgMar w:top="1134" w:right="1134" w:bottom="1134" w:left="1134" w:header="567" w:footer="567" w:gutter="0"/>
       <w:pgNumType/>
@@ -24370,10 +25659,6 @@
     </w:sectPr>
   </w:body>
 </w:document>
-</file>
-
-<file path=word/comments.xml><?xml version="1.0" encoding="utf-8"?>
-<w:comments xmlns:cx="http://schemas.microsoft.com/office/drawing/2014/chartex" xmlns:cx1="http://schemas.microsoft.com/office/drawing/2015/9/8/chartex" xmlns:cx2="http://schemas.microsoft.com/office/drawing/2015/10/21/chartex" xmlns:cx3="http://schemas.microsoft.com/office/drawing/2016/5/9/chartex" xmlns:cx4="http://schemas.microsoft.com/office/drawing/2016/5/10/chartex" xmlns:cx5="http://schemas.microsoft.com/office/drawing/2016/5/11/chartex" xmlns:cx6="http://schemas.microsoft.com/office/drawing/2016/5/12/chartex" xmlns:cx7="http://schemas.microsoft.com/office/drawing/2016/5/13/chartex" xmlns:cx8="http://schemas.microsoft.com/office/drawing/2016/5/14/chartex" xmlns:mc="http://schemas.openxmlformats.org/markup-compatibility/2006" xmlns:aink="http://schemas.microsoft.com/office/drawing/2016/ink" xmlns:am3d="http://schemas.microsoft.com/office/drawing/2017/model3d" xmlns:o="urn:schemas-microsoft-com:office:office" xmlns:r="http://schemas.openxmlformats.org/officeDocument/2006/relationships" xmlns:m="http://schemas.openxmlformats.org/officeDocument/2006/math" xmlns:v="urn:schemas-microsoft-com:vml" xmlns:wp14="http://schemas.microsoft.com/office/word/2010/wordprocessingDrawing" xmlns:wp="http://schemas.openxmlformats.org/drawingml/2006/wordprocessingDrawing" xmlns:w10="urn:schemas-microsoft-com:office:word" xmlns:w="http://schemas.openxmlformats.org/wordprocessingml/2006/main" xmlns:w14="http://schemas.microsoft.com/office/word/2010/wordml" xmlns:w15="http://schemas.microsoft.com/office/word/2012/wordml" xmlns:w16cex="http://schemas.microsoft.com/office/word/2018/wordml/cex" xmlns:w16cid="http://schemas.microsoft.com/office/word/2016/wordml/cid" xmlns:w16="http://schemas.microsoft.com/office/word/2018/wordml" xmlns:w16sdtdh="http://schemas.microsoft.com/office/word/2020/wordml/sdtdatahash" xmlns:w16se="http://schemas.microsoft.com/office/word/2015/wordml/symex" xmlns:wpg="http://schemas.microsoft.com/office/word/2010/wordprocessingGroup" xmlns:wpi="http://schemas.microsoft.com/office/word/2010/wordprocessingInk" xmlns:wne="http://schemas.microsoft.com/office/word/2006/wordml" xmlns:wps="http://schemas.microsoft.com/office/word/2010/wordprocessingShape"/>
 </file>
 
 <file path=word/endnotes.xml><?xml version="1.0" encoding="utf-8"?>
@@ -24552,7 +25837,7 @@
         <wp:inline distT="0" distB="0" distL="0" distR="0">
           <wp:extent cx="552450" cy="342900"/>
           <wp:effectExtent t="0" r="0" b="0" l="0"/>
-          <wp:docPr id="1" name="" descr="" title=""/>
+          <wp:docPr id="22" name="" descr="" title=""/>
           <wp:cNvGraphicFramePr>
             <a:graphicFrameLocks xmlns:a="http://schemas.openxmlformats.org/drawingml/2006/main" noChangeAspect="1"/>
           </wp:cNvGraphicFramePr>
@@ -24595,7 +25880,7 @@
         <w:szCs w:val="16"/>
       </w:rPr>
       <w:tab/>
-      <w:t xml:space="preserve">Manuale Utente · Rev. 4.4 · 23/10/2026</w:t>
+      <w:t xml:space="preserve">Manuale Utente · Rev. 4.5 · 25/10/2026</w:t>
     </w:r>
   </w:p>
 </w:hdr>
@@ -24617,7 +25902,7 @@
         <wp:inline distT="0" distB="0" distL="0" distR="0">
           <wp:extent cx="552450" cy="342900"/>
           <wp:effectExtent t="0" r="0" b="0" l="0"/>
-          <wp:docPr id="1" name="" descr="" title=""/>
+          <wp:docPr id="22" name="" descr="" title=""/>
           <wp:cNvGraphicFramePr>
             <a:graphicFrameLocks xmlns:a="http://schemas.openxmlformats.org/drawingml/2006/main" noChangeAspect="1"/>
           </wp:cNvGraphicFramePr>
@@ -24660,7 +25945,7 @@
         <w:szCs w:val="16"/>
       </w:rPr>
       <w:tab/>
-      <w:t xml:space="preserve">Manuale Utente · Rev. 4.4 · 23/10/2026</w:t>
+      <w:t xml:space="preserve">Manuale Utente · Rev. 4.5 · 25/10/2026</w:t>
     </w:r>
   </w:p>
 </w:hdr>
@@ -24670,7 +25955,7 @@
 <w:numbering xmlns:wpc="http://schemas.microsoft.com/office/word/2010/wordprocessingCanvas" xmlns:mc="http://schemas.openxmlformats.org/markup-compatibility/2006" xmlns:o="urn:schemas-microsoft-com:office:office" xmlns:r="http://schemas.openxmlformats.org/officeDocument/2006/relationships" xmlns:m="http://schemas.openxmlformats.org/officeDocument/2006/math" xmlns:v="urn:schemas-microsoft-com:vml" xmlns:wp14="http://schemas.microsoft.com/office/word/2010/wordprocessingDrawing" xmlns:wp="http://schemas.openxmlformats.org/drawingml/2006/wordprocessingDrawing" xmlns:w10="urn:schemas-microsoft-com:office:word" xmlns:w="http://schemas.openxmlformats.org/wordprocessingml/2006/main" xmlns:w14="http://schemas.microsoft.com/office/word/2010/wordml" xmlns:w15="http://schemas.microsoft.com/office/word/2012/wordml" xmlns:wpg="http://schemas.microsoft.com/office/word/2010/wordprocessingGroup" xmlns:wpi="http://schemas.microsoft.com/office/word/2010/wordprocessingInk" xmlns:wne="http://schemas.microsoft.com/office/word/2006/wordml" xmlns:wps="http://schemas.microsoft.com/office/word/2010/wordprocessingShape" mc:Ignorable="w14 w15 wp14">
   <w:abstractNum w:abstractNumId="1" w15:restartNumberingAfterBreak="0">
     <w:multiLevelType w:val="hybridMultilevel"/>
-    <w:lvl w:ilvl="0" w15:tentative="1">
+    <w:lvl w:ilvl="0" w:tentative="1">
       <w:start w:val="1"/>
       <w:numFmt w:val="bullet"/>
       <w:lvlText w:val="●"/>
@@ -24679,7 +25964,7 @@
         <w:ind w:left="720" w:hanging="360"/>
       </w:pPr>
     </w:lvl>
-    <w:lvl w:ilvl="1" w15:tentative="1">
+    <w:lvl w:ilvl="1" w:tentative="1">
       <w:start w:val="1"/>
       <w:numFmt w:val="bullet"/>
       <w:lvlText w:val="○"/>
@@ -24688,7 +25973,7 @@
         <w:ind w:left="1440" w:hanging="360"/>
       </w:pPr>
     </w:lvl>
-    <w:lvl w:ilvl="2" w15:tentative="1">
+    <w:lvl w:ilvl="2" w:tentative="1">
       <w:start w:val="1"/>
       <w:numFmt w:val="bullet"/>
       <w:lvlText w:val="■"/>
@@ -24697,7 +25982,7 @@
         <w:ind w:left="2160" w:hanging="360"/>
       </w:pPr>
     </w:lvl>
-    <w:lvl w:ilvl="3" w15:tentative="1">
+    <w:lvl w:ilvl="3" w:tentative="1">
       <w:start w:val="1"/>
       <w:numFmt w:val="bullet"/>
       <w:lvlText w:val="●"/>
@@ -24706,7 +25991,7 @@
         <w:ind w:left="2880" w:hanging="360"/>
       </w:pPr>
     </w:lvl>
-    <w:lvl w:ilvl="4" w15:tentative="1">
+    <w:lvl w:ilvl="4" w:tentative="1">
       <w:start w:val="1"/>
       <w:numFmt w:val="bullet"/>
       <w:lvlText w:val="○"/>
@@ -24715,7 +26000,7 @@
         <w:ind w:left="3600" w:hanging="360"/>
       </w:pPr>
     </w:lvl>
-    <w:lvl w:ilvl="5" w15:tentative="1">
+    <w:lvl w:ilvl="5" w:tentative="1">
       <w:start w:val="1"/>
       <w:numFmt w:val="bullet"/>
       <w:lvlText w:val="■"/>
@@ -24724,7 +26009,7 @@
         <w:ind w:left="4320" w:hanging="360"/>
       </w:pPr>
     </w:lvl>
-    <w:lvl w:ilvl="6" w15:tentative="1">
+    <w:lvl w:ilvl="6" w:tentative="1">
       <w:start w:val="1"/>
       <w:numFmt w:val="bullet"/>
       <w:lvlText w:val="●"/>
@@ -24733,7 +26018,7 @@
         <w:ind w:left="5040" w:hanging="360"/>
       </w:pPr>
     </w:lvl>
-    <w:lvl w:ilvl="7" w15:tentative="1">
+    <w:lvl w:ilvl="7" w:tentative="1">
       <w:start w:val="1"/>
       <w:numFmt w:val="bullet"/>
       <w:lvlText w:val="●"/>
@@ -24742,7 +26027,7 @@
         <w:ind w:left="5760" w:hanging="360"/>
       </w:pPr>
     </w:lvl>
-    <w:lvl w:ilvl="8" w15:tentative="1">
+    <w:lvl w:ilvl="8" w:tentative="1">
       <w:start w:val="1"/>
       <w:numFmt w:val="bullet"/>
       <w:lvlText w:val="●"/>
@@ -24754,7 +26039,7 @@
   </w:abstractNum>
   <w:abstractNum w:abstractNumId="2" w15:restartNumberingAfterBreak="0">
     <w:multiLevelType w:val="hybridMultilevel"/>
-    <w:lvl w:ilvl="0" w15:tentative="1">
+    <w:lvl w:ilvl="0" w:tentative="1">
       <w:start w:val="1"/>
       <w:numFmt w:val="bullet"/>
       <w:lvlText w:val="•"/>
@@ -24766,7 +26051,7 @@
         <w:color w:val="2F5D3A"/>
       </w:rPr>
     </w:lvl>
-    <w:lvl w:ilvl="1" w15:tentative="1">
+    <w:lvl w:ilvl="1" w:tentative="1">
       <w:start w:val="1"/>
       <w:numFmt w:val="bullet"/>
       <w:lvlText w:val="–"/>
@@ -24781,7 +26066,7 @@
   </w:abstractNum>
   <w:abstractNum w:abstractNumId="3" w15:restartNumberingAfterBreak="0">
     <w:multiLevelType w:val="hybridMultilevel"/>
-    <w:lvl w:ilvl="0" w15:tentative="1">
+    <w:lvl w:ilvl="0" w:tentative="1">
       <w:start w:val="1"/>
       <w:numFmt w:val="decimal"/>
       <w:lvlText w:val="%1."/>
@@ -24884,6 +26169,10 @@
     </w:rPrDefault>
     <w:pPrDefault/>
   </w:docDefaults>
+  <w:style w:type="paragraph" w:styleId="Normal" w:default="1">
+    <w:name w:val="Normal"/>
+    <w:qFormat/>
+  </w:style>
   <w:style w:type="paragraph" w:styleId="Title">
     <w:name w:val="Title"/>
     <w:basedOn w:val="Normal"/>
@@ -24892,28 +26181,6 @@
     <w:rPr>
       <w:sz w:val="56"/>
       <w:szCs w:val="56"/>
-    </w:rPr>
-  </w:style>
-  <w:style w:type="paragraph" w:styleId="Heading1">
-    <w:name w:val="Heading 1"/>
-    <w:basedOn w:val="Normal"/>
-    <w:next w:val="Normal"/>
-    <w:qFormat/>
-    <w:rPr>
-      <w:color w:val="2E74B5"/>
-      <w:sz w:val="32"/>
-      <w:szCs w:val="32"/>
-    </w:rPr>
-  </w:style>
-  <w:style w:type="paragraph" w:styleId="Heading2">
-    <w:name w:val="Heading 2"/>
-    <w:basedOn w:val="Normal"/>
-    <w:next w:val="Normal"/>
-    <w:qFormat/>
-    <w:rPr>
-      <w:color w:val="2E74B5"/>
-      <w:sz w:val="26"/>
-      <w:szCs w:val="26"/>
     </w:rPr>
   </w:style>
   <w:style w:type="paragraph" w:styleId="Heading3">
@@ -25090,4 +26357,294 @@
     </w:rPr>
   </w:style>
 </w:styles>
+</file>
+
+<file path=word/theme/theme1.xml><?xml version="1.0" encoding="utf-8"?>
+<a:theme xmlns:a="http://schemas.openxmlformats.org/drawingml/2006/main" name="Office Theme">
+  <a:themeElements>
+    <a:clrScheme name="Office">
+      <a:dk1>
+        <a:sysClr val="windowText" lastClr="000000"/>
+      </a:dk1>
+      <a:lt1>
+        <a:sysClr val="window" lastClr="FFFFFF"/>
+      </a:lt1>
+      <a:dk2>
+        <a:srgbClr val="44546A"/>
+      </a:dk2>
+      <a:lt2>
+        <a:srgbClr val="E7E6E6"/>
+      </a:lt2>
+      <a:accent1>
+        <a:srgbClr val="4472C4"/>
+      </a:accent1>
+      <a:accent2>
+        <a:srgbClr val="ED7D31"/>
+      </a:accent2>
+      <a:accent3>
+        <a:srgbClr val="A5A5A5"/>
+      </a:accent3>
+      <a:accent4>
+        <a:srgbClr val="FFC000"/>
+      </a:accent4>
+      <a:accent5>
+        <a:srgbClr val="5B9BD5"/>
+      </a:accent5>
+      <a:accent6>
+        <a:srgbClr val="70AD47"/>
+      </a:accent6>
+      <a:hlink>
+        <a:srgbClr val="0563C1"/>
+      </a:hlink>
+      <a:folHlink>
+        <a:srgbClr val="954F72"/>
+      </a:folHlink>
+    </a:clrScheme>
+    <a:fontScheme name="Office">
+      <a:majorFont>
+        <a:latin typeface="Calibri Light" panose="020F0302020204030204"/>
+        <a:ea typeface=""/>
+        <a:cs typeface=""/>
+        <a:font script="Jpan" typeface="游ゴシック Light"/>
+        <a:font script="Hang" typeface="맑은 고딕"/>
+        <a:font script="Hans" typeface="等线 Light"/>
+        <a:font script="Hant" typeface="新細明體"/>
+        <a:font script="Arab" typeface="Times New Roman"/>
+        <a:font script="Hebr" typeface="Times New Roman"/>
+        <a:font script="Thai" typeface="Angsana New"/>
+        <a:font script="Ethi" typeface="Nyala"/>
+        <a:font script="Beng" typeface="Vrinda"/>
+        <a:font script="Gujr" typeface="Shruti"/>
+        <a:font script="Khmr" typeface="MoolBoran"/>
+        <a:font script="Knda" typeface="Tunga"/>
+        <a:font script="Guru" typeface="Raavi"/>
+        <a:font script="Cans" typeface="Euphemia"/>
+        <a:font script="Cher" typeface="Plantagenet Cherokee"/>
+        <a:font script="Yiii" typeface="Microsoft Yi Baiti"/>
+        <a:font script="Tibt" typeface="Microsoft Himalaya"/>
+        <a:font script="Thaa" typeface="MV Boli"/>
+        <a:font script="Deva" typeface="Mangal"/>
+        <a:font script="Telu" typeface="Gautami"/>
+        <a:font script="Taml" typeface="Latha"/>
+        <a:font script="Syrc" typeface="Estrangelo Edessa"/>
+        <a:font script="Orya" typeface="Kalinga"/>
+        <a:font script="Mlym" typeface="Kartika"/>
+        <a:font script="Laoo" typeface="DokChampa"/>
+        <a:font script="Sinh" typeface="Iskoola Pota"/>
+        <a:font script="Mong" typeface="Mongolian Baiti"/>
+        <a:font script="Viet" typeface="Times New Roman"/>
+        <a:font script="Uigh" typeface="Microsoft Uighur"/>
+        <a:font script="Geor" typeface="Sylfaen"/>
+        <a:font script="Armn" typeface="Arial"/>
+        <a:font script="Bugi" typeface="Leelawadee UI"/>
+        <a:font script="Bopo" typeface="Microsoft JhengHei"/>
+        <a:font script="Java" typeface="Javanese Text"/>
+        <a:font script="Lisu" typeface="Segoe UI"/>
+        <a:font script="Mymr" typeface="Myanmar Text"/>
+        <a:font script="Nkoo" typeface="Ebrima"/>
+        <a:font script="Olck" typeface="Nirmala UI"/>
+        <a:font script="Osma" typeface="Ebrima"/>
+        <a:font script="Phag" typeface="Phagspa"/>
+        <a:font script="Syrn" typeface="Estrangelo Edessa"/>
+        <a:font script="Syrj" typeface="Estrangelo Edessa"/>
+        <a:font script="Syre" typeface="Estrangelo Edessa"/>
+        <a:font script="Sora" typeface="Nirmala UI"/>
+        <a:font script="Tale" typeface="Microsoft Tai Le"/>
+        <a:font script="Talu" typeface="Microsoft New Tai Lue"/>
+        <a:font script="Tfng" typeface="Ebrima"/>
+      </a:majorFont>
+      <a:minorFont>
+        <a:latin typeface="Calibri" panose="020F0502020204030204"/>
+        <a:ea typeface=""/>
+        <a:cs typeface=""/>
+        <a:font script="Jpan" typeface="游明朝"/>
+        <a:font script="Hang" typeface="맑은 고딕"/>
+        <a:font script="Hans" typeface="等线"/>
+        <a:font script="Hant" typeface="新細明體"/>
+        <a:font script="Arab" typeface="Arial"/>
+        <a:font script="Hebr" typeface="Arial"/>
+        <a:font script="Thai" typeface="Cordia New"/>
+        <a:font script="Ethi" typeface="Nyala"/>
+        <a:font script="Beng" typeface="Vrinda"/>
+        <a:font script="Gujr" typeface="Shruti"/>
+        <a:font script="Khmr" typeface="DaunPenh"/>
+        <a:font script="Knda" typeface="Tunga"/>
+        <a:font script="Guru" typeface="Raavi"/>
+        <a:font script="Cans" typeface="Euphemia"/>
+        <a:font script="Cher" typeface="Plantagenet Cherokee"/>
+        <a:font script="Yiii" typeface="Microsoft Yi Baiti"/>
+        <a:font script="Tibt" typeface="Microsoft Himalaya"/>
+        <a:font script="Thaa" typeface="MV Boli"/>
+        <a:font script="Deva" typeface="Mangal"/>
+        <a:font script="Telu" typeface="Gautami"/>
+        <a:font script="Taml" typeface="Latha"/>
+        <a:font script="Syrc" typeface="Estrangelo Edessa"/>
+        <a:font script="Orya" typeface="Kalinga"/>
+        <a:font script="Mlym" typeface="Kartika"/>
+        <a:font script="Laoo" typeface="DokChampa"/>
+        <a:font script="Sinh" typeface="Iskoola Pota"/>
+        <a:font script="Mong" typeface="Mongolian Baiti"/>
+        <a:font script="Viet" typeface="Arial"/>
+        <a:font script="Uigh" typeface="Microsoft Uighur"/>
+        <a:font script="Geor" typeface="Sylfaen"/>
+        <a:font script="Armn" typeface="Arial"/>
+        <a:font script="Bugi" typeface="Leelawadee UI"/>
+        <a:font script="Bopo" typeface="Microsoft JhengHei"/>
+        <a:font script="Java" typeface="Javanese Text"/>
+        <a:font script="Lisu" typeface="Segoe UI"/>
+        <a:font script="Mymr" typeface="Myanmar Text"/>
+        <a:font script="Nkoo" typeface="Ebrima"/>
+        <a:font script="Olck" typeface="Nirmala UI"/>
+        <a:font script="Osma" typeface="Ebrima"/>
+        <a:font script="Phag" typeface="Phagspa"/>
+        <a:font script="Syrn" typeface="Estrangelo Edessa"/>
+        <a:font script="Syrj" typeface="Estrangelo Edessa"/>
+        <a:font script="Syre" typeface="Estrangelo Edessa"/>
+        <a:font script="Sora" typeface="Nirmala UI"/>
+        <a:font script="Tale" typeface="Microsoft Tai Le"/>
+        <a:font script="Talu" typeface="Microsoft New Tai Lue"/>
+        <a:font script="Tfng" typeface="Ebrima"/>
+      </a:minorFont>
+    </a:fontScheme>
+    <a:fmtScheme name="Office">
+      <a:fillStyleLst>
+        <a:solidFill>
+          <a:schemeClr val="phClr"/>
+        </a:solidFill>
+        <a:gradFill rotWithShape="true">
+          <a:gsLst>
+            <a:gs pos="0">
+              <a:schemeClr val="phClr">
+                <a:lumMod val="110000"/>
+                <a:satMod val="105000"/>
+                <a:tint val="67000"/>
+              </a:schemeClr>
+            </a:gs>
+            <a:gs pos="50000">
+              <a:schemeClr val="phClr">
+                <a:lumMod val="105000"/>
+                <a:satMod val="103000"/>
+                <a:tint val="73000"/>
+              </a:schemeClr>
+            </a:gs>
+            <a:gs pos="100000">
+              <a:schemeClr val="phClr">
+                <a:lumMod val="105000"/>
+                <a:satMod val="109000"/>
+                <a:tint val="81000"/>
+              </a:schemeClr>
+            </a:gs>
+          </a:gsLst>
+          <a:lin ang="5400000" scaled="false"/>
+        </a:gradFill>
+        <a:gradFill rotWithShape="true">
+          <a:gsLst>
+            <a:gs pos="0">
+              <a:schemeClr val="phClr">
+                <a:satMod val="103000"/>
+                <a:lumMod val="102000"/>
+                <a:tint val="94000"/>
+              </a:schemeClr>
+            </a:gs>
+            <a:gs pos="50000">
+              <a:schemeClr val="phClr">
+                <a:satMod val="110000"/>
+                <a:lumMod val="100000"/>
+                <a:shade val="100000"/>
+              </a:schemeClr>
+            </a:gs>
+            <a:gs pos="100000">
+              <a:schemeClr val="phClr">
+                <a:lumMod val="99000"/>
+                <a:satMod val="120000"/>
+                <a:shade val="78000"/>
+              </a:schemeClr>
+            </a:gs>
+          </a:gsLst>
+          <a:lin ang="5400000" scaled="false"/>
+        </a:gradFill>
+      </a:fillStyleLst>
+      <a:lnStyleLst>
+        <a:ln w="6350" cap="flat" cmpd="sng" algn="ctr">
+          <a:solidFill>
+            <a:schemeClr val="phClr"/>
+          </a:solidFill>
+          <a:prstDash val="solid"/>
+          <a:miter lim="800000"/>
+        </a:ln>
+        <a:ln w="12700" cap="flat" cmpd="sng" algn="ctr">
+          <a:solidFill>
+            <a:schemeClr val="phClr"/>
+          </a:solidFill>
+          <a:prstDash val="solid"/>
+          <a:miter lim="800000"/>
+        </a:ln>
+        <a:ln w="19050" cap="flat" cmpd="sng" algn="ctr">
+          <a:solidFill>
+            <a:schemeClr val="phClr"/>
+          </a:solidFill>
+          <a:prstDash val="solid"/>
+          <a:miter lim="800000"/>
+        </a:ln>
+      </a:lnStyleLst>
+      <a:effectStyleLst>
+        <a:effectStyle>
+          <a:effectLst/>
+        </a:effectStyle>
+        <a:effectStyle>
+          <a:effectLst/>
+        </a:effectStyle>
+        <a:effectStyle>
+          <a:effectLst>
+            <a:outerShdw blurRad="57150" dist="19050" dir="5400000" algn="ctr" rotWithShape="false">
+              <a:srgbClr val="000000">
+                <a:alpha val="63000"/>
+              </a:srgbClr>
+            </a:outerShdw>
+          </a:effectLst>
+        </a:effectStyle>
+      </a:effectStyleLst>
+      <a:bgFillStyleLst>
+        <a:solidFill>
+          <a:schemeClr val="phClr"/>
+        </a:solidFill>
+        <a:solidFill>
+          <a:schemeClr val="phClr">
+            <a:tint val="95000"/>
+            <a:satMod val="170000"/>
+          </a:schemeClr>
+        </a:solidFill>
+        <a:gradFill rotWithShape="true">
+          <a:gsLst>
+            <a:gs pos="0">
+              <a:schemeClr val="phClr">
+                <a:tint val="93000"/>
+                <a:satMod val="150000"/>
+                <a:shade val="98000"/>
+                <a:lumMod val="102000"/>
+              </a:schemeClr>
+            </a:gs>
+            <a:gs pos="50000">
+              <a:schemeClr val="phClr">
+                <a:tint val="98000"/>
+                <a:satMod val="130000"/>
+                <a:shade val="90000"/>
+                <a:lumMod val="103000"/>
+              </a:schemeClr>
+            </a:gs>
+            <a:gs pos="100000">
+              <a:schemeClr val="phClr">
+                <a:shade val="63000"/>
+                <a:satMod val="120000"/>
+              </a:schemeClr>
+            </a:gs>
+          </a:gsLst>
+          <a:lin ang="5400000" scaled="false"/>
+        </a:gradFill>
+      </a:bgFillStyleLst>
+    </a:fmtScheme>
+  </a:themeElements>
+  <a:objectDefaults/>
+  <a:extraClrSchemeLst/>
+</a:theme>
 </file>
</xml_diff>